<commit_message>
doc(rapport): mise a jour rapport de test
</commit_message>
<xml_diff>
--- a/Doc/Christopher_Ristic_Rapport.docx
+++ b/Doc/Christopher_Ristic_Rapport.docx
@@ -1,6 +1,6 @@
 
 <file path=word/document.xml><?xml version="1.0" encoding="utf-8"?>
-<w:document xmlns:wpc="http://schemas.microsoft.com/office/word/2010/wordprocessingCanvas" xmlns:cx="http://schemas.microsoft.com/office/drawing/2014/chartex" xmlns:cx1="http://schemas.microsoft.com/office/drawing/2015/9/8/chartex" xmlns:cx2="http://schemas.microsoft.com/office/drawing/2015/10/21/chartex" xmlns:cx3="http://schemas.microsoft.com/office/drawing/2016/5/9/chartex" xmlns:cx4="http://schemas.microsoft.com/office/drawing/2016/5/10/chartex" xmlns:cx5="http://schemas.microsoft.com/office/drawing/2016/5/11/chartex" xmlns:cx6="http://schemas.microsoft.com/office/drawing/2016/5/12/chartex" xmlns:cx7="http://schemas.microsoft.com/office/drawing/2016/5/13/chartex" xmlns:cx8="http://schemas.microsoft.com/office/drawing/2016/5/14/chartex" xmlns:mc="http://schemas.openxmlformats.org/markup-compatibility/2006" xmlns:aink="http://schemas.microsoft.com/office/drawing/2016/ink" xmlns:am3d="http://schemas.microsoft.com/office/drawing/2017/model3d" xmlns:o="urn:schemas-microsoft-com:office:office" xmlns:oel="http://schemas.microsoft.com/office/2019/extlst" xmlns:r="http://schemas.openxmlformats.org/officeDocument/2006/relationships" xmlns:m="http://schemas.openxmlformats.org/officeDocument/2006/math" xmlns:v="urn:schemas-microsoft-com:vml" xmlns:wp14="http://schemas.microsoft.com/office/word/2010/wordprocessingDrawing" xmlns:wp="http://schemas.openxmlformats.org/drawingml/2006/wordprocessingDrawing" xmlns:w10="urn:schemas-microsoft-com:office:word" xmlns:w="http://schemas.openxmlformats.org/wordprocessingml/2006/main" xmlns:w14="http://schemas.microsoft.com/office/word/2010/wordml" xmlns:w15="http://schemas.microsoft.com/office/word/2012/wordml" xmlns:w16cex="http://schemas.microsoft.com/office/word/2018/wordml/cex" xmlns:w16cid="http://schemas.microsoft.com/office/word/2016/wordml/cid" xmlns:w16="http://schemas.microsoft.com/office/word/2018/wordml" xmlns:w16sdtdh="http://schemas.microsoft.com/office/word/2020/wordml/sdtdatahash" xmlns:w16se="http://schemas.microsoft.com/office/word/2015/wordml/symex" xmlns:wpg="http://schemas.microsoft.com/office/word/2010/wordprocessingGroup" xmlns:wpi="http://schemas.microsoft.com/office/word/2010/wordprocessingInk" xmlns:wne="http://schemas.microsoft.com/office/word/2006/wordml" xmlns:wps="http://schemas.microsoft.com/office/word/2010/wordprocessingShape" mc:Ignorable="w14 w15 w16se w16cid w16 w16cex w16sdtdh wp14">
+<w:document xmlns:wpc="http://schemas.microsoft.com/office/word/2010/wordprocessingCanvas" xmlns:cx="http://schemas.microsoft.com/office/drawing/2014/chartex" xmlns:cx1="http://schemas.microsoft.com/office/drawing/2015/9/8/chartex" xmlns:cx2="http://schemas.microsoft.com/office/drawing/2015/10/21/chartex" xmlns:cx3="http://schemas.microsoft.com/office/drawing/2016/5/9/chartex" xmlns:cx4="http://schemas.microsoft.com/office/drawing/2016/5/10/chartex" xmlns:cx5="http://schemas.microsoft.com/office/drawing/2016/5/11/chartex" xmlns:cx6="http://schemas.microsoft.com/office/drawing/2016/5/12/chartex" xmlns:cx7="http://schemas.microsoft.com/office/drawing/2016/5/13/chartex" xmlns:cx8="http://schemas.microsoft.com/office/drawing/2016/5/14/chartex" xmlns:mc="http://schemas.openxmlformats.org/markup-compatibility/2006" xmlns:aink="http://schemas.microsoft.com/office/drawing/2016/ink" xmlns:am3d="http://schemas.microsoft.com/office/drawing/2017/model3d" xmlns:o="urn:schemas-microsoft-com:office:office" xmlns:oel="http://schemas.microsoft.com/office/2019/extlst" xmlns:r="http://schemas.openxmlformats.org/officeDocument/2006/relationships" xmlns:m="http://schemas.openxmlformats.org/officeDocument/2006/math" xmlns:v="urn:schemas-microsoft-com:vml" xmlns:wp14="http://schemas.microsoft.com/office/word/2010/wordprocessingDrawing" xmlns:wp="http://schemas.openxmlformats.org/drawingml/2006/wordprocessingDrawing" xmlns:w10="urn:schemas-microsoft-com:office:word" xmlns:w="http://schemas.openxmlformats.org/wordprocessingml/2006/main" xmlns:w14="http://schemas.microsoft.com/office/word/2010/wordml" xmlns:w15="http://schemas.microsoft.com/office/word/2012/wordml" xmlns:w16cex="http://schemas.microsoft.com/office/word/2018/wordml/cex" xmlns:w16cid="http://schemas.microsoft.com/office/word/2016/wordml/cid" xmlns:w16="http://schemas.microsoft.com/office/word/2018/wordml" xmlns:w16du="http://schemas.microsoft.com/office/word/2023/wordml/word16du" xmlns:w16sdtdh="http://schemas.microsoft.com/office/word/2020/wordml/sdtdatahash" xmlns:w16sdtfl="http://schemas.microsoft.com/office/word/2024/wordml/sdtformatlock" xmlns:w16se="http://schemas.microsoft.com/office/word/2015/wordml/symex" xmlns:wpg="http://schemas.microsoft.com/office/word/2010/wordprocessingGroup" xmlns:wpi="http://schemas.microsoft.com/office/word/2010/wordprocessingInk" xmlns:wne="http://schemas.microsoft.com/office/word/2006/wordml" xmlns:wps="http://schemas.microsoft.com/office/word/2010/wordprocessingShape" mc:Ignorable="w14 w15 w16se w16cid w16 w16cex w16sdtdh w16sdtfl w16du wp14">
   <w:body>
     <w:p>
       <w:pPr>
@@ -1794,6 +1794,9 @@
         </w:rPr>
       </w:pPr>
       <w:r>
+        <w:rPr>
+          <w:noProof/>
+        </w:rPr>
         <w:drawing>
           <wp:anchor distT="0" distB="0" distL="114300" distR="114300" simplePos="0" relativeHeight="251661312" behindDoc="0" locked="0" layoutInCell="1" allowOverlap="1" wp14:anchorId="5E2EB8D8" wp14:editId="0A47D887">
             <wp:simplePos x="0" y="0"/>
@@ -1886,8 +1889,11 @@
         </w:numPr>
       </w:pPr>
       <w:r>
+        <w:rPr>
+          <w:noProof/>
+        </w:rPr>
         <w:drawing>
-          <wp:anchor distT="0" distB="0" distL="114300" distR="114300" simplePos="0" relativeHeight="251662336" behindDoc="0" locked="0" layoutInCell="1" allowOverlap="1" wp14:anchorId="49CA4750" wp14:editId="08688608">
+          <wp:anchor distT="0" distB="0" distL="114300" distR="114300" simplePos="0" relativeHeight="251662336" behindDoc="0" locked="0" layoutInCell="1" allowOverlap="1" wp14:anchorId="49CA4750" wp14:editId="2EAA6808">
             <wp:simplePos x="0" y="0"/>
             <wp:positionH relativeFrom="column">
               <wp:posOffset>1310469</wp:posOffset>
@@ -1974,14 +1980,17 @@
         </w:numPr>
       </w:pPr>
       <w:r>
+        <w:rPr>
+          <w:noProof/>
+        </w:rPr>
         <w:drawing>
-          <wp:anchor distT="0" distB="0" distL="114300" distR="114300" simplePos="0" relativeHeight="251663360" behindDoc="0" locked="0" layoutInCell="1" allowOverlap="1" wp14:anchorId="52D13987" wp14:editId="4AD35757">
+          <wp:anchor distT="0" distB="0" distL="114300" distR="114300" simplePos="0" relativeHeight="251663360" behindDoc="0" locked="0" layoutInCell="1" allowOverlap="1" wp14:anchorId="52D13987" wp14:editId="0EDB9604">
             <wp:simplePos x="0" y="0"/>
-            <wp:positionH relativeFrom="column">
-              <wp:posOffset>1262219</wp:posOffset>
+            <wp:positionH relativeFrom="margin">
+              <wp:align>center</wp:align>
             </wp:positionH>
             <wp:positionV relativeFrom="paragraph">
-              <wp:posOffset>324485</wp:posOffset>
+              <wp:posOffset>275120</wp:posOffset>
             </wp:positionV>
             <wp:extent cx="3200400" cy="2656205"/>
             <wp:effectExtent l="0" t="0" r="0" b="0"/>
@@ -2039,26 +2048,183 @@
     </w:p>
     <w:p>
       <w:pPr>
-        <w:pStyle w:val="Corpsdetexte"/>
-      </w:pPr>
+        <w:rPr>
+          <w:rFonts w:asciiTheme="majorHAnsi" w:hAnsiTheme="majorHAnsi" w:cs="Arial"/>
+          <w:b/>
+          <w:bCs/>
+          <w:caps/>
+          <w:kern w:val="32"/>
+          <w:sz w:val="32"/>
+          <w:szCs w:val="32"/>
+        </w:rPr>
+      </w:pPr>
+      <w:bookmarkStart w:id="6" w:name="_Toc208233606"/>
+      <w:r>
+        <w:br w:type="page"/>
+      </w:r>
     </w:p>
     <w:p>
       <w:pPr>
-        <w:pStyle w:val="Corpsdetexte"/>
-      </w:pPr>
-    </w:p>
-    <w:p>
-      <w:pPr>
         <w:pStyle w:val="Titre1"/>
       </w:pPr>
-      <w:bookmarkStart w:id="6" w:name="_Toc208233606"/>
-      <w:r>
+      <w:r>
+        <w:lastRenderedPageBreak/>
         <w:t>Rapport de tests</w:t>
       </w:r>
       <w:bookmarkEnd w:id="6"/>
     </w:p>
     <w:p>
       <w:pPr>
+        <w:pStyle w:val="Corpsdetexte"/>
+        <w:tabs>
+          <w:tab w:val="clear" w:pos="4395"/>
+        </w:tabs>
+      </w:pPr>
+      <w:r>
+        <w:t>Pour des raisons de sécurité logicielle, les interactions avec certains boutons sont désactivées tant que les conditions nécessaires ne sont pas remplies.</w:t>
+      </w:r>
+    </w:p>
+    <w:p>
+      <w:pPr>
+        <w:pStyle w:val="Corpsdetexte"/>
+        <w:ind w:left="4395" w:hanging="3828"/>
+      </w:pPr>
+      <w:r>
+        <w:rPr>
+          <w:noProof/>
+        </w:rPr>
+        <w:drawing>
+          <wp:anchor distT="0" distB="0" distL="114300" distR="114300" simplePos="0" relativeHeight="251664384" behindDoc="1" locked="0" layoutInCell="1" allowOverlap="1" wp14:anchorId="0770167F" wp14:editId="058EB679">
+            <wp:simplePos x="0" y="0"/>
+            <wp:positionH relativeFrom="column">
+              <wp:posOffset>1485867</wp:posOffset>
+            </wp:positionH>
+            <wp:positionV relativeFrom="paragraph">
+              <wp:posOffset>283895</wp:posOffset>
+            </wp:positionV>
+            <wp:extent cx="2979420" cy="2393315"/>
+            <wp:effectExtent l="0" t="0" r="0" b="6985"/>
+            <wp:wrapTopAndBottom/>
+            <wp:docPr id="341203434" name="Image 2"/>
+            <wp:cNvGraphicFramePr>
+              <a:graphicFrameLocks xmlns:a="http://schemas.openxmlformats.org/drawingml/2006/main" noChangeAspect="1"/>
+            </wp:cNvGraphicFramePr>
+            <a:graphic xmlns:a="http://schemas.openxmlformats.org/drawingml/2006/main">
+              <a:graphicData uri="http://schemas.openxmlformats.org/drawingml/2006/picture">
+                <pic:pic xmlns:pic="http://schemas.openxmlformats.org/drawingml/2006/picture">
+                  <pic:nvPicPr>
+                    <pic:cNvPr id="0" name="Picture 3"/>
+                    <pic:cNvPicPr>
+                      <a:picLocks noChangeAspect="1" noChangeArrowheads="1"/>
+                    </pic:cNvPicPr>
+                  </pic:nvPicPr>
+                  <pic:blipFill>
+                    <a:blip r:embed="rId14" cstate="print">
+                      <a:extLst>
+                        <a:ext uri="{28A0092B-C50C-407E-A947-70E740481C1C}">
+                          <a14:useLocalDpi xmlns:a14="http://schemas.microsoft.com/office/drawing/2010/main" val="0"/>
+                        </a:ext>
+                      </a:extLst>
+                    </a:blip>
+                    <a:srcRect/>
+                    <a:stretch>
+                      <a:fillRect/>
+                    </a:stretch>
+                  </pic:blipFill>
+                  <pic:spPr bwMode="auto">
+                    <a:xfrm>
+                      <a:off x="0" y="0"/>
+                      <a:ext cx="2979420" cy="2393315"/>
+                    </a:xfrm>
+                    <a:prstGeom prst="rect">
+                      <a:avLst/>
+                    </a:prstGeom>
+                    <a:noFill/>
+                  </pic:spPr>
+                </pic:pic>
+              </a:graphicData>
+            </a:graphic>
+          </wp:anchor>
+        </w:drawing>
+      </w:r>
+      <w:r>
+        <w:t>Le premier test a été révélateur pour la pluviométrie, et en effet, les barres étaient illisibles.</w:t>
+      </w:r>
+    </w:p>
+    <w:p>
+      <w:pPr>
+        <w:pStyle w:val="Corpsdetexte"/>
+        <w:tabs>
+          <w:tab w:val="clear" w:pos="4395"/>
+        </w:tabs>
+        <w:spacing w:before="240"/>
+      </w:pPr>
+      <w:r>
+        <w:drawing>
+          <wp:anchor distT="0" distB="0" distL="114300" distR="114300" simplePos="0" relativeHeight="251665408" behindDoc="0" locked="0" layoutInCell="1" allowOverlap="1" wp14:anchorId="2F46E21F" wp14:editId="3E1D4FE4">
+            <wp:simplePos x="0" y="0"/>
+            <wp:positionH relativeFrom="margin">
+              <wp:posOffset>1274445</wp:posOffset>
+            </wp:positionH>
+            <wp:positionV relativeFrom="paragraph">
+              <wp:posOffset>3007360</wp:posOffset>
+            </wp:positionV>
+            <wp:extent cx="3327182" cy="2677886"/>
+            <wp:effectExtent l="0" t="0" r="6985" b="8255"/>
+            <wp:wrapTopAndBottom/>
+            <wp:docPr id="1560119526" name="Image 1" descr="Une image contenant texte, capture d’écran, Tracé, ligne"/>
+            <wp:cNvGraphicFramePr>
+              <a:graphicFrameLocks xmlns:a="http://schemas.openxmlformats.org/drawingml/2006/main" noChangeAspect="1"/>
+            </wp:cNvGraphicFramePr>
+            <a:graphic xmlns:a="http://schemas.openxmlformats.org/drawingml/2006/main">
+              <a:graphicData uri="http://schemas.openxmlformats.org/drawingml/2006/picture">
+                <pic:pic xmlns:pic="http://schemas.openxmlformats.org/drawingml/2006/picture">
+                  <pic:nvPicPr>
+                    <pic:cNvPr id="1560119526" name="Image 1" descr="Une image contenant texte, capture d’écran, Tracé, ligne"/>
+                    <pic:cNvPicPr/>
+                  </pic:nvPicPr>
+                  <pic:blipFill>
+                    <a:blip r:embed="rId15" cstate="print">
+                      <a:extLst>
+                        <a:ext uri="{28A0092B-C50C-407E-A947-70E740481C1C}">
+                          <a14:useLocalDpi xmlns:a14="http://schemas.microsoft.com/office/drawing/2010/main" val="0"/>
+                        </a:ext>
+                      </a:extLst>
+                    </a:blip>
+                    <a:stretch>
+                      <a:fillRect/>
+                    </a:stretch>
+                  </pic:blipFill>
+                  <pic:spPr>
+                    <a:xfrm>
+                      <a:off x="0" y="0"/>
+                      <a:ext cx="3327182" cy="2677886"/>
+                    </a:xfrm>
+                    <a:prstGeom prst="rect">
+                      <a:avLst/>
+                    </a:prstGeom>
+                  </pic:spPr>
+                </pic:pic>
+              </a:graphicData>
+            </a:graphic>
+          </wp:anchor>
+        </w:drawing>
+      </w:r>
+      <w:r>
+        <w:t>Une solution a été de transformer les barres en une ligne. Des couleurs pour chaque ville, et rajouter une légende.</w:t>
+      </w:r>
+      <w:r>
+        <w:t xml:space="preserve"> </w:t>
+      </w:r>
+    </w:p>
+    <w:p>
+      <w:pPr>
+        <w:pStyle w:val="Corpsdetexte"/>
+        <w:ind w:left="4395" w:hanging="3828"/>
+      </w:pPr>
+    </w:p>
+    <w:p>
+      <w:pPr>
         <w:pStyle w:val="Titre1"/>
       </w:pPr>
       <w:bookmarkStart w:id="7" w:name="_Toc208233607"/>
@@ -2079,7 +2245,7 @@
       <w:pPr>
         <w:pStyle w:val="Corpsdetexte"/>
       </w:pPr>
-      <w:hyperlink r:id="rId14" w:history="1">
+      <w:hyperlink r:id="rId16" w:history="1">
         <w:r>
           <w:rPr>
             <w:rStyle w:val="Lienhypertexte"/>
@@ -2112,7 +2278,10 @@
         <w:t>L’IA a été utilisée pour la génération des user stories</w:t>
       </w:r>
       <w:r>
-        <w:t>. La recherche d’une librairie de traçage adaptée à ce projet.</w:t>
+        <w:t>. La recherche d’une librairie de traçage adaptée à ce projet</w:t>
+      </w:r>
+      <w:r>
+        <w:t xml:space="preserve">, différents calculs et aide pour des bug fix. </w:t>
       </w:r>
     </w:p>
     <w:p>
@@ -2159,8 +2328,8 @@
     </w:p>
     <w:p/>
     <w:sectPr>
-      <w:headerReference w:type="default" r:id="rId15"/>
-      <w:footerReference w:type="default" r:id="rId16"/>
+      <w:headerReference w:type="default" r:id="rId17"/>
+      <w:footerReference w:type="default" r:id="rId18"/>
       <w:pgSz w:w="11906" w:h="16838" w:code="9"/>
       <w:pgMar w:top="1418" w:right="1418" w:bottom="1418" w:left="1418" w:header="709" w:footer="709" w:gutter="0"/>
       <w:cols w:space="708"/>
@@ -2172,7 +2341,7 @@
 </file>
 
 <file path=word/endnotes.xml><?xml version="1.0" encoding="utf-8"?>
-<w:endnotes xmlns:wpc="http://schemas.microsoft.com/office/word/2010/wordprocessingCanvas" xmlns:cx="http://schemas.microsoft.com/office/drawing/2014/chartex" xmlns:cx1="http://schemas.microsoft.com/office/drawing/2015/9/8/chartex" xmlns:cx2="http://schemas.microsoft.com/office/drawing/2015/10/21/chartex" xmlns:cx3="http://schemas.microsoft.com/office/drawing/2016/5/9/chartex" xmlns:cx4="http://schemas.microsoft.com/office/drawing/2016/5/10/chartex" xmlns:cx5="http://schemas.microsoft.com/office/drawing/2016/5/11/chartex" xmlns:cx6="http://schemas.microsoft.com/office/drawing/2016/5/12/chartex" xmlns:cx7="http://schemas.microsoft.com/office/drawing/2016/5/13/chartex" xmlns:cx8="http://schemas.microsoft.com/office/drawing/2016/5/14/chartex" xmlns:mc="http://schemas.openxmlformats.org/markup-compatibility/2006" xmlns:aink="http://schemas.microsoft.com/office/drawing/2016/ink" xmlns:am3d="http://schemas.microsoft.com/office/drawing/2017/model3d" xmlns:o="urn:schemas-microsoft-com:office:office" xmlns:oel="http://schemas.microsoft.com/office/2019/extlst" xmlns:r="http://schemas.openxmlformats.org/officeDocument/2006/relationships" xmlns:m="http://schemas.openxmlformats.org/officeDocument/2006/math" xmlns:v="urn:schemas-microsoft-com:vml" xmlns:wp14="http://schemas.microsoft.com/office/word/2010/wordprocessingDrawing" xmlns:wp="http://schemas.openxmlformats.org/drawingml/2006/wordprocessingDrawing" xmlns:w10="urn:schemas-microsoft-com:office:word" xmlns:w="http://schemas.openxmlformats.org/wordprocessingml/2006/main" xmlns:w14="http://schemas.microsoft.com/office/word/2010/wordml" xmlns:w15="http://schemas.microsoft.com/office/word/2012/wordml" xmlns:w16cex="http://schemas.microsoft.com/office/word/2018/wordml/cex" xmlns:w16cid="http://schemas.microsoft.com/office/word/2016/wordml/cid" xmlns:w16="http://schemas.microsoft.com/office/word/2018/wordml" xmlns:w16sdtdh="http://schemas.microsoft.com/office/word/2020/wordml/sdtdatahash" xmlns:w16se="http://schemas.microsoft.com/office/word/2015/wordml/symex" xmlns:wpg="http://schemas.microsoft.com/office/word/2010/wordprocessingGroup" xmlns:wpi="http://schemas.microsoft.com/office/word/2010/wordprocessingInk" xmlns:wne="http://schemas.microsoft.com/office/word/2006/wordml" xmlns:wps="http://schemas.microsoft.com/office/word/2010/wordprocessingShape" mc:Ignorable="w14 w15 w16se w16cid w16 w16cex w16sdtdh wp14">
+<w:endnotes xmlns:wpc="http://schemas.microsoft.com/office/word/2010/wordprocessingCanvas" xmlns:cx="http://schemas.microsoft.com/office/drawing/2014/chartex" xmlns:cx1="http://schemas.microsoft.com/office/drawing/2015/9/8/chartex" xmlns:cx2="http://schemas.microsoft.com/office/drawing/2015/10/21/chartex" xmlns:cx3="http://schemas.microsoft.com/office/drawing/2016/5/9/chartex" xmlns:cx4="http://schemas.microsoft.com/office/drawing/2016/5/10/chartex" xmlns:cx5="http://schemas.microsoft.com/office/drawing/2016/5/11/chartex" xmlns:cx6="http://schemas.microsoft.com/office/drawing/2016/5/12/chartex" xmlns:cx7="http://schemas.microsoft.com/office/drawing/2016/5/13/chartex" xmlns:cx8="http://schemas.microsoft.com/office/drawing/2016/5/14/chartex" xmlns:mc="http://schemas.openxmlformats.org/markup-compatibility/2006" xmlns:aink="http://schemas.microsoft.com/office/drawing/2016/ink" xmlns:am3d="http://schemas.microsoft.com/office/drawing/2017/model3d" xmlns:o="urn:schemas-microsoft-com:office:office" xmlns:oel="http://schemas.microsoft.com/office/2019/extlst" xmlns:r="http://schemas.openxmlformats.org/officeDocument/2006/relationships" xmlns:m="http://schemas.openxmlformats.org/officeDocument/2006/math" xmlns:v="urn:schemas-microsoft-com:vml" xmlns:wp14="http://schemas.microsoft.com/office/word/2010/wordprocessingDrawing" xmlns:wp="http://schemas.openxmlformats.org/drawingml/2006/wordprocessingDrawing" xmlns:w10="urn:schemas-microsoft-com:office:word" xmlns:w="http://schemas.openxmlformats.org/wordprocessingml/2006/main" xmlns:w14="http://schemas.microsoft.com/office/word/2010/wordml" xmlns:w15="http://schemas.microsoft.com/office/word/2012/wordml" xmlns:w16cex="http://schemas.microsoft.com/office/word/2018/wordml/cex" xmlns:w16cid="http://schemas.microsoft.com/office/word/2016/wordml/cid" xmlns:w16="http://schemas.microsoft.com/office/word/2018/wordml" xmlns:w16du="http://schemas.microsoft.com/office/word/2023/wordml/word16du" xmlns:w16sdtdh="http://schemas.microsoft.com/office/word/2020/wordml/sdtdatahash" xmlns:w16sdtfl="http://schemas.microsoft.com/office/word/2024/wordml/sdtformatlock" xmlns:w16se="http://schemas.microsoft.com/office/word/2015/wordml/symex" xmlns:wpg="http://schemas.microsoft.com/office/word/2010/wordprocessingGroup" xmlns:wpi="http://schemas.microsoft.com/office/word/2010/wordprocessingInk" xmlns:wne="http://schemas.microsoft.com/office/word/2006/wordml" xmlns:wps="http://schemas.microsoft.com/office/word/2010/wordprocessingShape" mc:Ignorable="w14 w15 w16se w16cid w16 w16cex w16sdtdh w16sdtfl w16du wp14">
   <w:endnote w:type="separator" w:id="-1">
     <w:p>
       <w:r>
@@ -2194,7 +2363,7 @@
 </file>
 
 <file path=word/footer1.xml><?xml version="1.0" encoding="utf-8"?>
-<w:ftr xmlns:wpc="http://schemas.microsoft.com/office/word/2010/wordprocessingCanvas" xmlns:cx="http://schemas.microsoft.com/office/drawing/2014/chartex" xmlns:cx1="http://schemas.microsoft.com/office/drawing/2015/9/8/chartex" xmlns:cx2="http://schemas.microsoft.com/office/drawing/2015/10/21/chartex" xmlns:cx3="http://schemas.microsoft.com/office/drawing/2016/5/9/chartex" xmlns:cx4="http://schemas.microsoft.com/office/drawing/2016/5/10/chartex" xmlns:cx5="http://schemas.microsoft.com/office/drawing/2016/5/11/chartex" xmlns:cx6="http://schemas.microsoft.com/office/drawing/2016/5/12/chartex" xmlns:cx7="http://schemas.microsoft.com/office/drawing/2016/5/13/chartex" xmlns:cx8="http://schemas.microsoft.com/office/drawing/2016/5/14/chartex" xmlns:mc="http://schemas.openxmlformats.org/markup-compatibility/2006" xmlns:aink="http://schemas.microsoft.com/office/drawing/2016/ink" xmlns:am3d="http://schemas.microsoft.com/office/drawing/2017/model3d" xmlns:o="urn:schemas-microsoft-com:office:office" xmlns:oel="http://schemas.microsoft.com/office/2019/extlst" xmlns:r="http://schemas.openxmlformats.org/officeDocument/2006/relationships" xmlns:m="http://schemas.openxmlformats.org/officeDocument/2006/math" xmlns:v="urn:schemas-microsoft-com:vml" xmlns:wp14="http://schemas.microsoft.com/office/word/2010/wordprocessingDrawing" xmlns:wp="http://schemas.openxmlformats.org/drawingml/2006/wordprocessingDrawing" xmlns:w10="urn:schemas-microsoft-com:office:word" xmlns:w="http://schemas.openxmlformats.org/wordprocessingml/2006/main" xmlns:w14="http://schemas.microsoft.com/office/word/2010/wordml" xmlns:w15="http://schemas.microsoft.com/office/word/2012/wordml" xmlns:w16cex="http://schemas.microsoft.com/office/word/2018/wordml/cex" xmlns:w16cid="http://schemas.microsoft.com/office/word/2016/wordml/cid" xmlns:w16="http://schemas.microsoft.com/office/word/2018/wordml" xmlns:w16sdtdh="http://schemas.microsoft.com/office/word/2020/wordml/sdtdatahash" xmlns:w16se="http://schemas.microsoft.com/office/word/2015/wordml/symex" xmlns:wpg="http://schemas.microsoft.com/office/word/2010/wordprocessingGroup" xmlns:wpi="http://schemas.microsoft.com/office/word/2010/wordprocessingInk" xmlns:wne="http://schemas.microsoft.com/office/word/2006/wordml" xmlns:wps="http://schemas.microsoft.com/office/word/2010/wordprocessingShape" mc:Ignorable="w14 w15 w16se w16cid w16 w16cex w16sdtdh wp14">
+<w:ftr xmlns:wpc="http://schemas.microsoft.com/office/word/2010/wordprocessingCanvas" xmlns:cx="http://schemas.microsoft.com/office/drawing/2014/chartex" xmlns:cx1="http://schemas.microsoft.com/office/drawing/2015/9/8/chartex" xmlns:cx2="http://schemas.microsoft.com/office/drawing/2015/10/21/chartex" xmlns:cx3="http://schemas.microsoft.com/office/drawing/2016/5/9/chartex" xmlns:cx4="http://schemas.microsoft.com/office/drawing/2016/5/10/chartex" xmlns:cx5="http://schemas.microsoft.com/office/drawing/2016/5/11/chartex" xmlns:cx6="http://schemas.microsoft.com/office/drawing/2016/5/12/chartex" xmlns:cx7="http://schemas.microsoft.com/office/drawing/2016/5/13/chartex" xmlns:cx8="http://schemas.microsoft.com/office/drawing/2016/5/14/chartex" xmlns:mc="http://schemas.openxmlformats.org/markup-compatibility/2006" xmlns:aink="http://schemas.microsoft.com/office/drawing/2016/ink" xmlns:am3d="http://schemas.microsoft.com/office/drawing/2017/model3d" xmlns:o="urn:schemas-microsoft-com:office:office" xmlns:oel="http://schemas.microsoft.com/office/2019/extlst" xmlns:r="http://schemas.openxmlformats.org/officeDocument/2006/relationships" xmlns:m="http://schemas.openxmlformats.org/officeDocument/2006/math" xmlns:v="urn:schemas-microsoft-com:vml" xmlns:wp14="http://schemas.microsoft.com/office/word/2010/wordprocessingDrawing" xmlns:wp="http://schemas.openxmlformats.org/drawingml/2006/wordprocessingDrawing" xmlns:w10="urn:schemas-microsoft-com:office:word" xmlns:w="http://schemas.openxmlformats.org/wordprocessingml/2006/main" xmlns:w14="http://schemas.microsoft.com/office/word/2010/wordml" xmlns:w15="http://schemas.microsoft.com/office/word/2012/wordml" xmlns:w16cex="http://schemas.microsoft.com/office/word/2018/wordml/cex" xmlns:w16cid="http://schemas.microsoft.com/office/word/2016/wordml/cid" xmlns:w16="http://schemas.microsoft.com/office/word/2018/wordml" xmlns:w16du="http://schemas.microsoft.com/office/word/2023/wordml/word16du" xmlns:w16sdtdh="http://schemas.microsoft.com/office/word/2020/wordml/sdtdatahash" xmlns:w16sdtfl="http://schemas.microsoft.com/office/word/2024/wordml/sdtformatlock" xmlns:w16se="http://schemas.microsoft.com/office/word/2015/wordml/symex" xmlns:wpg="http://schemas.microsoft.com/office/word/2010/wordprocessingGroup" xmlns:wpi="http://schemas.microsoft.com/office/word/2010/wordprocessingInk" xmlns:wne="http://schemas.microsoft.com/office/word/2006/wordml" xmlns:wps="http://schemas.microsoft.com/office/word/2010/wordprocessingShape" mc:Ignorable="w14 w15 w16se w16cid w16 w16cex w16sdtdh w16sdtfl w16du wp14">
   <w:tbl>
     <w:tblPr>
       <w:tblStyle w:val="Grilledutableau"/>
@@ -2588,21 +2757,12 @@
               <w:szCs w:val="16"/>
             </w:rPr>
           </w:pPr>
-          <w:proofErr w:type="gramStart"/>
           <w:r>
             <w:rPr>
               <w:rFonts w:cs="Arial"/>
               <w:szCs w:val="16"/>
             </w:rPr>
-            <w:t>Version:</w:t>
-          </w:r>
-          <w:proofErr w:type="gramEnd"/>
-          <w:r>
-            <w:rPr>
-              <w:rFonts w:cs="Arial"/>
-              <w:szCs w:val="16"/>
-            </w:rPr>
-            <w:t xml:space="preserve"> </w:t>
+            <w:t xml:space="preserve">Version: </w:t>
           </w:r>
           <w:fldSimple w:instr="REVNUM   \* MERGEFORMAT">
             <w:r>
@@ -2648,7 +2808,7 @@
               <w:noProof/>
               <w:szCs w:val="16"/>
             </w:rPr>
-            <w:t>01.09.2025 15:36</w:t>
+            <w:t>08.09.2025 14:19</w:t>
           </w:r>
           <w:r>
             <w:rPr>
@@ -2707,7 +2867,7 @@
 </file>
 
 <file path=word/footnotes.xml><?xml version="1.0" encoding="utf-8"?>
-<w:footnotes xmlns:wpc="http://schemas.microsoft.com/office/word/2010/wordprocessingCanvas" xmlns:cx="http://schemas.microsoft.com/office/drawing/2014/chartex" xmlns:cx1="http://schemas.microsoft.com/office/drawing/2015/9/8/chartex" xmlns:cx2="http://schemas.microsoft.com/office/drawing/2015/10/21/chartex" xmlns:cx3="http://schemas.microsoft.com/office/drawing/2016/5/9/chartex" xmlns:cx4="http://schemas.microsoft.com/office/drawing/2016/5/10/chartex" xmlns:cx5="http://schemas.microsoft.com/office/drawing/2016/5/11/chartex" xmlns:cx6="http://schemas.microsoft.com/office/drawing/2016/5/12/chartex" xmlns:cx7="http://schemas.microsoft.com/office/drawing/2016/5/13/chartex" xmlns:cx8="http://schemas.microsoft.com/office/drawing/2016/5/14/chartex" xmlns:mc="http://schemas.openxmlformats.org/markup-compatibility/2006" xmlns:aink="http://schemas.microsoft.com/office/drawing/2016/ink" xmlns:am3d="http://schemas.microsoft.com/office/drawing/2017/model3d" xmlns:o="urn:schemas-microsoft-com:office:office" xmlns:oel="http://schemas.microsoft.com/office/2019/extlst" xmlns:r="http://schemas.openxmlformats.org/officeDocument/2006/relationships" xmlns:m="http://schemas.openxmlformats.org/officeDocument/2006/math" xmlns:v="urn:schemas-microsoft-com:vml" xmlns:wp14="http://schemas.microsoft.com/office/word/2010/wordprocessingDrawing" xmlns:wp="http://schemas.openxmlformats.org/drawingml/2006/wordprocessingDrawing" xmlns:w10="urn:schemas-microsoft-com:office:word" xmlns:w="http://schemas.openxmlformats.org/wordprocessingml/2006/main" xmlns:w14="http://schemas.microsoft.com/office/word/2010/wordml" xmlns:w15="http://schemas.microsoft.com/office/word/2012/wordml" xmlns:w16cex="http://schemas.microsoft.com/office/word/2018/wordml/cex" xmlns:w16cid="http://schemas.microsoft.com/office/word/2016/wordml/cid" xmlns:w16="http://schemas.microsoft.com/office/word/2018/wordml" xmlns:w16sdtdh="http://schemas.microsoft.com/office/word/2020/wordml/sdtdatahash" xmlns:w16se="http://schemas.microsoft.com/office/word/2015/wordml/symex" xmlns:wpg="http://schemas.microsoft.com/office/word/2010/wordprocessingGroup" xmlns:wpi="http://schemas.microsoft.com/office/word/2010/wordprocessingInk" xmlns:wne="http://schemas.microsoft.com/office/word/2006/wordml" xmlns:wps="http://schemas.microsoft.com/office/word/2010/wordprocessingShape" mc:Ignorable="w14 w15 w16se w16cid w16 w16cex w16sdtdh wp14">
+<w:footnotes xmlns:wpc="http://schemas.microsoft.com/office/word/2010/wordprocessingCanvas" xmlns:cx="http://schemas.microsoft.com/office/drawing/2014/chartex" xmlns:cx1="http://schemas.microsoft.com/office/drawing/2015/9/8/chartex" xmlns:cx2="http://schemas.microsoft.com/office/drawing/2015/10/21/chartex" xmlns:cx3="http://schemas.microsoft.com/office/drawing/2016/5/9/chartex" xmlns:cx4="http://schemas.microsoft.com/office/drawing/2016/5/10/chartex" xmlns:cx5="http://schemas.microsoft.com/office/drawing/2016/5/11/chartex" xmlns:cx6="http://schemas.microsoft.com/office/drawing/2016/5/12/chartex" xmlns:cx7="http://schemas.microsoft.com/office/drawing/2016/5/13/chartex" xmlns:cx8="http://schemas.microsoft.com/office/drawing/2016/5/14/chartex" xmlns:mc="http://schemas.openxmlformats.org/markup-compatibility/2006" xmlns:aink="http://schemas.microsoft.com/office/drawing/2016/ink" xmlns:am3d="http://schemas.microsoft.com/office/drawing/2017/model3d" xmlns:o="urn:schemas-microsoft-com:office:office" xmlns:oel="http://schemas.microsoft.com/office/2019/extlst" xmlns:r="http://schemas.openxmlformats.org/officeDocument/2006/relationships" xmlns:m="http://schemas.openxmlformats.org/officeDocument/2006/math" xmlns:v="urn:schemas-microsoft-com:vml" xmlns:wp14="http://schemas.microsoft.com/office/word/2010/wordprocessingDrawing" xmlns:wp="http://schemas.openxmlformats.org/drawingml/2006/wordprocessingDrawing" xmlns:w10="urn:schemas-microsoft-com:office:word" xmlns:w="http://schemas.openxmlformats.org/wordprocessingml/2006/main" xmlns:w14="http://schemas.microsoft.com/office/word/2010/wordml" xmlns:w15="http://schemas.microsoft.com/office/word/2012/wordml" xmlns:w16cex="http://schemas.microsoft.com/office/word/2018/wordml/cex" xmlns:w16cid="http://schemas.microsoft.com/office/word/2016/wordml/cid" xmlns:w16="http://schemas.microsoft.com/office/word/2018/wordml" xmlns:w16du="http://schemas.microsoft.com/office/word/2023/wordml/word16du" xmlns:w16sdtdh="http://schemas.microsoft.com/office/word/2020/wordml/sdtdatahash" xmlns:w16sdtfl="http://schemas.microsoft.com/office/word/2024/wordml/sdtformatlock" xmlns:w16se="http://schemas.microsoft.com/office/word/2015/wordml/symex" xmlns:wpg="http://schemas.microsoft.com/office/word/2010/wordprocessingGroup" xmlns:wpi="http://schemas.microsoft.com/office/word/2010/wordprocessingInk" xmlns:wne="http://schemas.microsoft.com/office/word/2006/wordml" xmlns:wps="http://schemas.microsoft.com/office/word/2010/wordprocessingShape" mc:Ignorable="w14 w15 w16se w16cid w16 w16cex w16sdtdh w16sdtfl w16du wp14">
   <w:footnote w:type="separator" w:id="-1">
     <w:p>
       <w:r>
@@ -2729,7 +2889,7 @@
 </file>
 
 <file path=word/header1.xml><?xml version="1.0" encoding="utf-8"?>
-<w:hdr xmlns:wpc="http://schemas.microsoft.com/office/word/2010/wordprocessingCanvas" xmlns:cx="http://schemas.microsoft.com/office/drawing/2014/chartex" xmlns:cx1="http://schemas.microsoft.com/office/drawing/2015/9/8/chartex" xmlns:cx2="http://schemas.microsoft.com/office/drawing/2015/10/21/chartex" xmlns:cx3="http://schemas.microsoft.com/office/drawing/2016/5/9/chartex" xmlns:cx4="http://schemas.microsoft.com/office/drawing/2016/5/10/chartex" xmlns:cx5="http://schemas.microsoft.com/office/drawing/2016/5/11/chartex" xmlns:cx6="http://schemas.microsoft.com/office/drawing/2016/5/12/chartex" xmlns:cx7="http://schemas.microsoft.com/office/drawing/2016/5/13/chartex" xmlns:cx8="http://schemas.microsoft.com/office/drawing/2016/5/14/chartex" xmlns:mc="http://schemas.openxmlformats.org/markup-compatibility/2006" xmlns:aink="http://schemas.microsoft.com/office/drawing/2016/ink" xmlns:am3d="http://schemas.microsoft.com/office/drawing/2017/model3d" xmlns:o="urn:schemas-microsoft-com:office:office" xmlns:oel="http://schemas.microsoft.com/office/2019/extlst" xmlns:r="http://schemas.openxmlformats.org/officeDocument/2006/relationships" xmlns:m="http://schemas.openxmlformats.org/officeDocument/2006/math" xmlns:v="urn:schemas-microsoft-com:vml" xmlns:wp14="http://schemas.microsoft.com/office/word/2010/wordprocessingDrawing" xmlns:wp="http://schemas.openxmlformats.org/drawingml/2006/wordprocessingDrawing" xmlns:w10="urn:schemas-microsoft-com:office:word" xmlns:w="http://schemas.openxmlformats.org/wordprocessingml/2006/main" xmlns:w14="http://schemas.microsoft.com/office/word/2010/wordml" xmlns:w15="http://schemas.microsoft.com/office/word/2012/wordml" xmlns:w16cex="http://schemas.microsoft.com/office/word/2018/wordml/cex" xmlns:w16cid="http://schemas.microsoft.com/office/word/2016/wordml/cid" xmlns:w16="http://schemas.microsoft.com/office/word/2018/wordml" xmlns:w16sdtdh="http://schemas.microsoft.com/office/word/2020/wordml/sdtdatahash" xmlns:w16se="http://schemas.microsoft.com/office/word/2015/wordml/symex" xmlns:wpg="http://schemas.microsoft.com/office/word/2010/wordprocessingGroup" xmlns:wpi="http://schemas.microsoft.com/office/word/2010/wordprocessingInk" xmlns:wne="http://schemas.microsoft.com/office/word/2006/wordml" xmlns:wps="http://schemas.microsoft.com/office/word/2010/wordprocessingShape" mc:Ignorable="w14 w15 w16se w16cid w16 w16cex w16sdtdh wp14">
+<w:hdr xmlns:wpc="http://schemas.microsoft.com/office/word/2010/wordprocessingCanvas" xmlns:cx="http://schemas.microsoft.com/office/drawing/2014/chartex" xmlns:cx1="http://schemas.microsoft.com/office/drawing/2015/9/8/chartex" xmlns:cx2="http://schemas.microsoft.com/office/drawing/2015/10/21/chartex" xmlns:cx3="http://schemas.microsoft.com/office/drawing/2016/5/9/chartex" xmlns:cx4="http://schemas.microsoft.com/office/drawing/2016/5/10/chartex" xmlns:cx5="http://schemas.microsoft.com/office/drawing/2016/5/11/chartex" xmlns:cx6="http://schemas.microsoft.com/office/drawing/2016/5/12/chartex" xmlns:cx7="http://schemas.microsoft.com/office/drawing/2016/5/13/chartex" xmlns:cx8="http://schemas.microsoft.com/office/drawing/2016/5/14/chartex" xmlns:mc="http://schemas.openxmlformats.org/markup-compatibility/2006" xmlns:aink="http://schemas.microsoft.com/office/drawing/2016/ink" xmlns:am3d="http://schemas.microsoft.com/office/drawing/2017/model3d" xmlns:o="urn:schemas-microsoft-com:office:office" xmlns:oel="http://schemas.microsoft.com/office/2019/extlst" xmlns:r="http://schemas.openxmlformats.org/officeDocument/2006/relationships" xmlns:m="http://schemas.openxmlformats.org/officeDocument/2006/math" xmlns:v="urn:schemas-microsoft-com:vml" xmlns:wp14="http://schemas.microsoft.com/office/word/2010/wordprocessingDrawing" xmlns:wp="http://schemas.openxmlformats.org/drawingml/2006/wordprocessingDrawing" xmlns:w10="urn:schemas-microsoft-com:office:word" xmlns:w="http://schemas.openxmlformats.org/wordprocessingml/2006/main" xmlns:w14="http://schemas.microsoft.com/office/word/2010/wordml" xmlns:w15="http://schemas.microsoft.com/office/word/2012/wordml" xmlns:w16cex="http://schemas.microsoft.com/office/word/2018/wordml/cex" xmlns:w16cid="http://schemas.microsoft.com/office/word/2016/wordml/cid" xmlns:w16="http://schemas.microsoft.com/office/word/2018/wordml" xmlns:w16du="http://schemas.microsoft.com/office/word/2023/wordml/word16du" xmlns:w16sdtdh="http://schemas.microsoft.com/office/word/2020/wordml/sdtdatahash" xmlns:w16sdtfl="http://schemas.microsoft.com/office/word/2024/wordml/sdtformatlock" xmlns:w16se="http://schemas.microsoft.com/office/word/2015/wordml/symex" xmlns:wpg="http://schemas.microsoft.com/office/word/2010/wordprocessingGroup" xmlns:wpi="http://schemas.microsoft.com/office/word/2010/wordprocessingInk" xmlns:wne="http://schemas.microsoft.com/office/word/2006/wordml" xmlns:wps="http://schemas.microsoft.com/office/word/2010/wordprocessingShape" mc:Ignorable="w14 w15 w16se w16cid w16 w16cex w16sdtdh w16sdtfl w16du wp14">
   <w:tbl>
     <w:tblPr>
       <w:tblStyle w:val="Grilledutableau"/>
@@ -2744,9 +2904,9 @@
       <w:tblLook w:val="01E0" w:firstRow="1" w:lastRow="1" w:firstColumn="1" w:lastColumn="1" w:noHBand="0" w:noVBand="0"/>
     </w:tblPr>
     <w:tblGrid>
-      <w:gridCol w:w="2402"/>
-      <w:gridCol w:w="4400"/>
-      <w:gridCol w:w="2268"/>
+      <w:gridCol w:w="2390"/>
+      <w:gridCol w:w="4411"/>
+      <w:gridCol w:w="2269"/>
     </w:tblGrid>
     <w:tr>
       <w:trPr>
@@ -2847,7 +3007,7 @@
 </file>
 
 <file path=word/numbering.xml><?xml version="1.0" encoding="utf-8"?>
-<w:numbering xmlns:wpc="http://schemas.microsoft.com/office/word/2010/wordprocessingCanvas" xmlns:cx="http://schemas.microsoft.com/office/drawing/2014/chartex" xmlns:cx1="http://schemas.microsoft.com/office/drawing/2015/9/8/chartex" xmlns:cx2="http://schemas.microsoft.com/office/drawing/2015/10/21/chartex" xmlns:cx3="http://schemas.microsoft.com/office/drawing/2016/5/9/chartex" xmlns:cx4="http://schemas.microsoft.com/office/drawing/2016/5/10/chartex" xmlns:cx5="http://schemas.microsoft.com/office/drawing/2016/5/11/chartex" xmlns:cx6="http://schemas.microsoft.com/office/drawing/2016/5/12/chartex" xmlns:cx7="http://schemas.microsoft.com/office/drawing/2016/5/13/chartex" xmlns:cx8="http://schemas.microsoft.com/office/drawing/2016/5/14/chartex" xmlns:mc="http://schemas.openxmlformats.org/markup-compatibility/2006" xmlns:aink="http://schemas.microsoft.com/office/drawing/2016/ink" xmlns:am3d="http://schemas.microsoft.com/office/drawing/2017/model3d" xmlns:o="urn:schemas-microsoft-com:office:office" xmlns:oel="http://schemas.microsoft.com/office/2019/extlst" xmlns:r="http://schemas.openxmlformats.org/officeDocument/2006/relationships" xmlns:m="http://schemas.openxmlformats.org/officeDocument/2006/math" xmlns:v="urn:schemas-microsoft-com:vml" xmlns:wp14="http://schemas.microsoft.com/office/word/2010/wordprocessingDrawing" xmlns:wp="http://schemas.openxmlformats.org/drawingml/2006/wordprocessingDrawing" xmlns:w10="urn:schemas-microsoft-com:office:word" xmlns:w="http://schemas.openxmlformats.org/wordprocessingml/2006/main" xmlns:w14="http://schemas.microsoft.com/office/word/2010/wordml" xmlns:w15="http://schemas.microsoft.com/office/word/2012/wordml" xmlns:w16cex="http://schemas.microsoft.com/office/word/2018/wordml/cex" xmlns:w16cid="http://schemas.microsoft.com/office/word/2016/wordml/cid" xmlns:w16="http://schemas.microsoft.com/office/word/2018/wordml" xmlns:w16sdtdh="http://schemas.microsoft.com/office/word/2020/wordml/sdtdatahash" xmlns:w16se="http://schemas.microsoft.com/office/word/2015/wordml/symex" xmlns:wpg="http://schemas.microsoft.com/office/word/2010/wordprocessingGroup" xmlns:wpi="http://schemas.microsoft.com/office/word/2010/wordprocessingInk" xmlns:wne="http://schemas.microsoft.com/office/word/2006/wordml" xmlns:wps="http://schemas.microsoft.com/office/word/2010/wordprocessingShape" mc:Ignorable="w14 w15 w16se w16cid w16 w16cex w16sdtdh wp14">
+<w:numbering xmlns:wpc="http://schemas.microsoft.com/office/word/2010/wordprocessingCanvas" xmlns:cx="http://schemas.microsoft.com/office/drawing/2014/chartex" xmlns:cx1="http://schemas.microsoft.com/office/drawing/2015/9/8/chartex" xmlns:cx2="http://schemas.microsoft.com/office/drawing/2015/10/21/chartex" xmlns:cx3="http://schemas.microsoft.com/office/drawing/2016/5/9/chartex" xmlns:cx4="http://schemas.microsoft.com/office/drawing/2016/5/10/chartex" xmlns:cx5="http://schemas.microsoft.com/office/drawing/2016/5/11/chartex" xmlns:cx6="http://schemas.microsoft.com/office/drawing/2016/5/12/chartex" xmlns:cx7="http://schemas.microsoft.com/office/drawing/2016/5/13/chartex" xmlns:cx8="http://schemas.microsoft.com/office/drawing/2016/5/14/chartex" xmlns:mc="http://schemas.openxmlformats.org/markup-compatibility/2006" xmlns:aink="http://schemas.microsoft.com/office/drawing/2016/ink" xmlns:am3d="http://schemas.microsoft.com/office/drawing/2017/model3d" xmlns:o="urn:schemas-microsoft-com:office:office" xmlns:oel="http://schemas.microsoft.com/office/2019/extlst" xmlns:r="http://schemas.openxmlformats.org/officeDocument/2006/relationships" xmlns:m="http://schemas.openxmlformats.org/officeDocument/2006/math" xmlns:v="urn:schemas-microsoft-com:vml" xmlns:wp14="http://schemas.microsoft.com/office/word/2010/wordprocessingDrawing" xmlns:wp="http://schemas.openxmlformats.org/drawingml/2006/wordprocessingDrawing" xmlns:w10="urn:schemas-microsoft-com:office:word" xmlns:w="http://schemas.openxmlformats.org/wordprocessingml/2006/main" xmlns:w14="http://schemas.microsoft.com/office/word/2010/wordml" xmlns:w15="http://schemas.microsoft.com/office/word/2012/wordml" xmlns:w16cex="http://schemas.microsoft.com/office/word/2018/wordml/cex" xmlns:w16cid="http://schemas.microsoft.com/office/word/2016/wordml/cid" xmlns:w16="http://schemas.microsoft.com/office/word/2018/wordml" xmlns:w16du="http://schemas.microsoft.com/office/word/2023/wordml/word16du" xmlns:w16sdtdh="http://schemas.microsoft.com/office/word/2020/wordml/sdtdatahash" xmlns:w16sdtfl="http://schemas.microsoft.com/office/word/2024/wordml/sdtformatlock" xmlns:w16se="http://schemas.microsoft.com/office/word/2015/wordml/symex" xmlns:wpg="http://schemas.microsoft.com/office/word/2010/wordprocessingGroup" xmlns:wpi="http://schemas.microsoft.com/office/word/2010/wordprocessingInk" xmlns:wne="http://schemas.microsoft.com/office/word/2006/wordml" xmlns:wps="http://schemas.microsoft.com/office/word/2010/wordprocessingShape" mc:Ignorable="w14 w15 w16se w16cid w16 w16cex w16sdtdh w16sdtfl w16du wp14">
   <w:numPicBullet w:numPicBulletId="0">
     <w:pict>
       <v:shapetype id="_x0000_t75" coordsize="21600,21600" o:spt="75" o:preferrelative="t" path="m@4@5l@4@11@9@11@9@5xe" filled="f" stroked="f">
@@ -2869,7 +3029,7 @@
         <v:path o:extrusionok="f" gradientshapeok="t" o:connecttype="rect"/>
         <o:lock v:ext="edit" aspectratio="t"/>
       </v:shapetype>
-      <v:shape id="_x0000_i1055" type="#_x0000_t75" style="width:11.3pt;height:11.3pt" o:bullet="t">
+      <v:shape id="_x0000_i1038" type="#_x0000_t75" style="width:11.25pt;height:11.25pt" o:bullet="t">
         <v:imagedata r:id="rId1" o:title="BD10263_"/>
       </v:shape>
     </w:pict>
@@ -6172,7 +6332,7 @@
 </file>
 
 <file path=word/styles.xml><?xml version="1.0" encoding="utf-8"?>
-<w:styles xmlns:mc="http://schemas.openxmlformats.org/markup-compatibility/2006" xmlns:r="http://schemas.openxmlformats.org/officeDocument/2006/relationships" xmlns:w="http://schemas.openxmlformats.org/wordprocessingml/2006/main" xmlns:w14="http://schemas.microsoft.com/office/word/2010/wordml" xmlns:w15="http://schemas.microsoft.com/office/word/2012/wordml" xmlns:w16cex="http://schemas.microsoft.com/office/word/2018/wordml/cex" xmlns:w16cid="http://schemas.microsoft.com/office/word/2016/wordml/cid" xmlns:w16="http://schemas.microsoft.com/office/word/2018/wordml" xmlns:w16sdtdh="http://schemas.microsoft.com/office/word/2020/wordml/sdtdatahash" xmlns:w16se="http://schemas.microsoft.com/office/word/2015/wordml/symex" mc:Ignorable="w14 w15 w16se w16cid w16 w16cex w16sdtdh">
+<w:styles xmlns:mc="http://schemas.openxmlformats.org/markup-compatibility/2006" xmlns:r="http://schemas.openxmlformats.org/officeDocument/2006/relationships" xmlns:w="http://schemas.openxmlformats.org/wordprocessingml/2006/main" xmlns:w14="http://schemas.microsoft.com/office/word/2010/wordml" xmlns:w15="http://schemas.microsoft.com/office/word/2012/wordml" xmlns:w16cex="http://schemas.microsoft.com/office/word/2018/wordml/cex" xmlns:w16cid="http://schemas.microsoft.com/office/word/2016/wordml/cid" xmlns:w16="http://schemas.microsoft.com/office/word/2018/wordml" xmlns:w16du="http://schemas.microsoft.com/office/word/2023/wordml/word16du" xmlns:w16sdtdh="http://schemas.microsoft.com/office/word/2020/wordml/sdtdatahash" xmlns:w16sdtfl="http://schemas.microsoft.com/office/word/2024/wordml/sdtformatlock" xmlns:w16se="http://schemas.microsoft.com/office/word/2015/wordml/symex" mc:Ignorable="w14 w15 w16se w16cid w16 w16cex w16sdtdh w16sdtfl w16du">
   <w:docDefaults>
     <w:rPrDefault>
       <w:rPr>
@@ -7712,6 +7872,15 @@
 </file>
 
 <file path=customXml/item1.xml><?xml version="1.0" encoding="utf-8"?>
+<?mso-contentType ?>
+<FormTemplates xmlns="http://schemas.microsoft.com/sharepoint/v3/contenttype/forms">
+  <Display>DocumentLibraryForm</Display>
+  <Edit>DocumentLibraryForm</Edit>
+  <New>DocumentLibraryForm</New>
+</FormTemplates>
+</file>
+
+<file path=customXml/item2.xml><?xml version="1.0" encoding="utf-8"?>
 <ct:contentTypeSchema xmlns:ct="http://schemas.microsoft.com/office/2006/metadata/contentType" xmlns:ma="http://schemas.microsoft.com/office/2006/metadata/properties/metaAttributes" ct:_="" ma:_="" ma:contentTypeName="Document" ma:contentTypeID="0x01010080C9F2488912074FB587B9AD9ADAE5BB" ma:contentTypeVersion="13" ma:contentTypeDescription="Crée un document." ma:contentTypeScope="" ma:versionID="98cb6024266d177b928872b226e6993e">
   <xsd:schema xmlns:xsd="http://www.w3.org/2001/XMLSchema" xmlns:xs="http://www.w3.org/2001/XMLSchema" xmlns:p="http://schemas.microsoft.com/office/2006/metadata/properties" xmlns:ns2="b5cf4370-ac38-4b9e-9836-ef6f5df64f24" xmlns:ns3="eefa3612-053e-497a-ae76-8a76877f5e22" targetNamespace="http://schemas.microsoft.com/office/2006/metadata/properties" ma:root="true" ma:fieldsID="005441ce51d7a2dcada4efd17c7a03e9" ns2:_="" ns3:_="">
     <xsd:import namespace="b5cf4370-ac38-4b9e-9836-ef6f5df64f24"/>
@@ -7918,27 +8087,7 @@
 </ct:contentTypeSchema>
 </file>
 
-<file path=customXml/item2.xml><?xml version="1.0" encoding="utf-8"?>
-<?mso-contentType ?>
-<FormTemplates xmlns="http://schemas.microsoft.com/sharepoint/v3/contenttype/forms">
-  <Display>DocumentLibraryForm</Display>
-  <Edit>DocumentLibraryForm</Edit>
-  <New>DocumentLibraryForm</New>
-</FormTemplates>
-</file>
-
 <file path=customXml/item3.xml><?xml version="1.0" encoding="utf-8"?>
-<p:properties xmlns:p="http://schemas.microsoft.com/office/2006/metadata/properties" xmlns:xsi="http://www.w3.org/2001/XMLSchema-instance" xmlns:pc="http://schemas.microsoft.com/office/infopath/2007/PartnerControls">
-  <documentManagement>
-    <lcf76f155ced4ddcb4097134ff3c332f xmlns="b5cf4370-ac38-4b9e-9836-ef6f5df64f24">
-      <Terms xmlns="http://schemas.microsoft.com/office/infopath/2007/PartnerControls"/>
-    </lcf76f155ced4ddcb4097134ff3c332f>
-    <TaxCatchAll xmlns="eefa3612-053e-497a-ae76-8a76877f5e22" xsi:nil="true"/>
-  </documentManagement>
-</p:properties>
-</file>
-
-<file path=customXml/item4.xml><?xml version="1.0" encoding="utf-8"?>
 <b:Sources xmlns:b="http://schemas.openxmlformats.org/officeDocument/2006/bibliography" xmlns="http://schemas.openxmlformats.org/officeDocument/2006/bibliography" SelectedStyle="\APASixthEditionOfficeOnline.xsl" StyleName="APA" Version="6">
   <b:Source>
     <b:Tag>Espace_réservé1</b:Tag>
@@ -7961,7 +8110,26 @@
 </b:Sources>
 </file>
 
+<file path=customXml/item4.xml><?xml version="1.0" encoding="utf-8"?>
+<p:properties xmlns:p="http://schemas.microsoft.com/office/2006/metadata/properties" xmlns:xsi="http://www.w3.org/2001/XMLSchema-instance" xmlns:pc="http://schemas.microsoft.com/office/infopath/2007/PartnerControls">
+  <documentManagement>
+    <lcf76f155ced4ddcb4097134ff3c332f xmlns="b5cf4370-ac38-4b9e-9836-ef6f5df64f24">
+      <Terms xmlns="http://schemas.microsoft.com/office/infopath/2007/PartnerControls"/>
+    </lcf76f155ced4ddcb4097134ff3c332f>
+    <TaxCatchAll xmlns="eefa3612-053e-497a-ae76-8a76877f5e22" xsi:nil="true"/>
+  </documentManagement>
+</p:properties>
+</file>
+
 <file path=customXml/itemProps1.xml><?xml version="1.0" encoding="utf-8"?>
+<ds:datastoreItem xmlns:ds="http://schemas.openxmlformats.org/officeDocument/2006/customXml" ds:itemID="{DF8E7934-3F3A-4F32-A7D4-1B248DBE707D}">
+  <ds:schemaRefs>
+    <ds:schemaRef ds:uri="http://schemas.microsoft.com/sharepoint/v3/contenttype/forms"/>
+  </ds:schemaRefs>
+</ds:datastoreItem>
+</file>
+
+<file path=customXml/itemProps2.xml><?xml version="1.0" encoding="utf-8"?>
 <ds:datastoreItem xmlns:ds="http://schemas.openxmlformats.org/officeDocument/2006/customXml" ds:itemID="{FDA51230-EF27-4A68-A446-37F9E544E2A2}">
   <ds:schemaRefs>
     <ds:schemaRef ds:uri="http://schemas.microsoft.com/office/2006/metadata/contentType"/>
@@ -7980,15 +8148,15 @@
 </ds:datastoreItem>
 </file>
 
-<file path=customXml/itemProps2.xml><?xml version="1.0" encoding="utf-8"?>
-<ds:datastoreItem xmlns:ds="http://schemas.openxmlformats.org/officeDocument/2006/customXml" ds:itemID="{DF8E7934-3F3A-4F32-A7D4-1B248DBE707D}">
+<file path=customXml/itemProps3.xml><?xml version="1.0" encoding="utf-8"?>
+<ds:datastoreItem xmlns:ds="http://schemas.openxmlformats.org/officeDocument/2006/customXml" ds:itemID="{A507DE50-9571-420A-B97A-D696E6EB7C50}">
   <ds:schemaRefs>
-    <ds:schemaRef ds:uri="http://schemas.microsoft.com/sharepoint/v3/contenttype/forms"/>
+    <ds:schemaRef ds:uri="http://schemas.openxmlformats.org/officeDocument/2006/bibliography"/>
   </ds:schemaRefs>
 </ds:datastoreItem>
 </file>
 
-<file path=customXml/itemProps3.xml><?xml version="1.0" encoding="utf-8"?>
+<file path=customXml/itemProps4.xml><?xml version="1.0" encoding="utf-8"?>
 <ds:datastoreItem xmlns:ds="http://schemas.openxmlformats.org/officeDocument/2006/customXml" ds:itemID="{4181FC95-92B5-446F-AE57-E4A44C8C450C}">
   <ds:schemaRefs>
     <ds:schemaRef ds:uri="http://schemas.microsoft.com/office/2006/metadata/properties"/>
@@ -7997,12 +8165,4 @@
     <ds:schemaRef ds:uri="eefa3612-053e-497a-ae76-8a76877f5e22"/>
   </ds:schemaRefs>
 </ds:datastoreItem>
-</file>
-
-<file path=customXml/itemProps4.xml><?xml version="1.0" encoding="utf-8"?>
-<ds:datastoreItem xmlns:ds="http://schemas.openxmlformats.org/officeDocument/2006/customXml" ds:itemID="{A507DE50-9571-420A-B97A-D696E6EB7C50}">
-  <ds:schemaRefs>
-    <ds:schemaRef ds:uri="http://schemas.openxmlformats.org/officeDocument/2006/bibliography"/>
-  </ds:schemaRefs>
-</ds:datastoreItem>
 </file>
</xml_diff>

<commit_message>
doc(rapport): chapitre sur les rapport de test
</commit_message>
<xml_diff>
--- a/Doc/Christopher_Ristic_Rapport.docx
+++ b/Doc/Christopher_Ristic_Rapport.docx
@@ -161,7 +161,7 @@
         </w:rPr>
         <w:fldChar w:fldCharType="separate"/>
       </w:r>
-      <w:hyperlink w:anchor="_Toc208233601" w:history="1">
+      <w:hyperlink w:anchor="_Toc210841171" w:history="1">
         <w:r>
           <w:rPr>
             <w:rStyle w:val="Lienhypertexte"/>
@@ -209,7 +209,7 @@
             <w:noProof/>
             <w:webHidden/>
           </w:rPr>
-          <w:instrText xml:space="preserve"> PAGEREF _Toc208233601 \h </w:instrText>
+          <w:instrText xml:space="preserve"> PAGEREF _Toc210841171 \h </w:instrText>
         </w:r>
         <w:r>
           <w:rPr>
@@ -257,7 +257,7 @@
           <w14:ligatures w14:val="standardContextual"/>
         </w:rPr>
       </w:pPr>
-      <w:hyperlink w:anchor="_Toc208233602" w:history="1">
+      <w:hyperlink w:anchor="_Toc210841172" w:history="1">
         <w:r>
           <w:rPr>
             <w:rStyle w:val="Lienhypertexte"/>
@@ -303,7 +303,7 @@
             <w:noProof/>
             <w:webHidden/>
           </w:rPr>
-          <w:instrText xml:space="preserve"> PAGEREF _Toc208233602 \h </w:instrText>
+          <w:instrText xml:space="preserve"> PAGEREF _Toc210841172 \h </w:instrText>
         </w:r>
         <w:r>
           <w:rPr>
@@ -351,7 +351,7 @@
           <w14:ligatures w14:val="standardContextual"/>
         </w:rPr>
       </w:pPr>
-      <w:hyperlink w:anchor="_Toc208233603" w:history="1">
+      <w:hyperlink w:anchor="_Toc210841173" w:history="1">
         <w:r>
           <w:rPr>
             <w:rStyle w:val="Lienhypertexte"/>
@@ -397,7 +397,7 @@
             <w:noProof/>
             <w:webHidden/>
           </w:rPr>
-          <w:instrText xml:space="preserve"> PAGEREF _Toc208233603 \h </w:instrText>
+          <w:instrText xml:space="preserve"> PAGEREF _Toc210841173 \h </w:instrText>
         </w:r>
         <w:r>
           <w:rPr>
@@ -447,7 +447,7 @@
           <w14:ligatures w14:val="standardContextual"/>
         </w:rPr>
       </w:pPr>
-      <w:hyperlink w:anchor="_Toc208233604" w:history="1">
+      <w:hyperlink w:anchor="_Toc210841174" w:history="1">
         <w:r>
           <w:rPr>
             <w:rStyle w:val="Lienhypertexte"/>
@@ -495,7 +495,7 @@
             <w:noProof/>
             <w:webHidden/>
           </w:rPr>
-          <w:instrText xml:space="preserve"> PAGEREF _Toc208233604 \h </w:instrText>
+          <w:instrText xml:space="preserve"> PAGEREF _Toc210841174 \h </w:instrText>
         </w:r>
         <w:r>
           <w:rPr>
@@ -545,7 +545,7 @@
           <w14:ligatures w14:val="standardContextual"/>
         </w:rPr>
       </w:pPr>
-      <w:hyperlink w:anchor="_Toc208233605" w:history="1">
+      <w:hyperlink w:anchor="_Toc210841175" w:history="1">
         <w:r>
           <w:rPr>
             <w:rStyle w:val="Lienhypertexte"/>
@@ -593,7 +593,7 @@
             <w:noProof/>
             <w:webHidden/>
           </w:rPr>
-          <w:instrText xml:space="preserve"> PAGEREF _Toc208233605 \h </w:instrText>
+          <w:instrText xml:space="preserve"> PAGEREF _Toc210841175 \h </w:instrText>
         </w:r>
         <w:r>
           <w:rPr>
@@ -643,7 +643,7 @@
           <w14:ligatures w14:val="standardContextual"/>
         </w:rPr>
       </w:pPr>
-      <w:hyperlink w:anchor="_Toc208233606" w:history="1">
+      <w:hyperlink w:anchor="_Toc210841176" w:history="1">
         <w:r>
           <w:rPr>
             <w:rStyle w:val="Lienhypertexte"/>
@@ -691,7 +691,7 @@
             <w:noProof/>
             <w:webHidden/>
           </w:rPr>
-          <w:instrText xml:space="preserve"> PAGEREF _Toc208233606 \h </w:instrText>
+          <w:instrText xml:space="preserve"> PAGEREF _Toc210841176 \h </w:instrText>
         </w:r>
         <w:r>
           <w:rPr>
@@ -711,7 +711,7 @@
             <w:noProof/>
             <w:webHidden/>
           </w:rPr>
-          <w:t>5</w:t>
+          <w:t>6</w:t>
         </w:r>
         <w:r>
           <w:rPr>
@@ -741,7 +741,7 @@
           <w14:ligatures w14:val="standardContextual"/>
         </w:rPr>
       </w:pPr>
-      <w:hyperlink w:anchor="_Toc208233607" w:history="1">
+      <w:hyperlink w:anchor="_Toc210841177" w:history="1">
         <w:r>
           <w:rPr>
             <w:rStyle w:val="Lienhypertexte"/>
@@ -789,7 +789,7 @@
             <w:noProof/>
             <w:webHidden/>
           </w:rPr>
-          <w:instrText xml:space="preserve"> PAGEREF _Toc208233607 \h </w:instrText>
+          <w:instrText xml:space="preserve"> PAGEREF _Toc210841177 \h </w:instrText>
         </w:r>
         <w:r>
           <w:rPr>
@@ -809,7 +809,7 @@
             <w:noProof/>
             <w:webHidden/>
           </w:rPr>
-          <w:t>5</w:t>
+          <w:t>7</w:t>
         </w:r>
         <w:r>
           <w:rPr>
@@ -839,7 +839,7 @@
           <w14:ligatures w14:val="standardContextual"/>
         </w:rPr>
       </w:pPr>
-      <w:hyperlink w:anchor="_Toc208233608" w:history="1">
+      <w:hyperlink w:anchor="_Toc210841178" w:history="1">
         <w:r>
           <w:rPr>
             <w:rStyle w:val="Lienhypertexte"/>
@@ -887,7 +887,7 @@
             <w:noProof/>
             <w:webHidden/>
           </w:rPr>
-          <w:instrText xml:space="preserve"> PAGEREF _Toc208233608 \h </w:instrText>
+          <w:instrText xml:space="preserve"> PAGEREF _Toc210841178 \h </w:instrText>
         </w:r>
         <w:r>
           <w:rPr>
@@ -907,7 +907,7 @@
             <w:noProof/>
             <w:webHidden/>
           </w:rPr>
-          <w:t>6</w:t>
+          <w:t>8</w:t>
         </w:r>
         <w:r>
           <w:rPr>
@@ -937,7 +937,7 @@
           <w14:ligatures w14:val="standardContextual"/>
         </w:rPr>
       </w:pPr>
-      <w:hyperlink w:anchor="_Toc208233609" w:history="1">
+      <w:hyperlink w:anchor="_Toc210841179" w:history="1">
         <w:r>
           <w:rPr>
             <w:rStyle w:val="Lienhypertexte"/>
@@ -987,7 +987,7 @@
             <w:noProof/>
             <w:webHidden/>
           </w:rPr>
-          <w:instrText xml:space="preserve"> PAGEREF _Toc208233609 \h </w:instrText>
+          <w:instrText xml:space="preserve"> PAGEREF _Toc210841179 \h </w:instrText>
         </w:r>
         <w:r>
           <w:rPr>
@@ -1007,7 +1007,7 @@
             <w:noProof/>
             <w:webHidden/>
           </w:rPr>
-          <w:t>6</w:t>
+          <w:t>8</w:t>
         </w:r>
         <w:r>
           <w:rPr>
@@ -1035,7 +1035,7 @@
           <w14:ligatures w14:val="standardContextual"/>
         </w:rPr>
       </w:pPr>
-      <w:hyperlink w:anchor="_Toc208233610" w:history="1">
+      <w:hyperlink w:anchor="_Toc210841180" w:history="1">
         <w:r>
           <w:rPr>
             <w:rStyle w:val="Lienhypertexte"/>
@@ -1081,7 +1081,7 @@
             <w:noProof/>
             <w:webHidden/>
           </w:rPr>
-          <w:instrText xml:space="preserve"> PAGEREF _Toc208233610 \h </w:instrText>
+          <w:instrText xml:space="preserve"> PAGEREF _Toc210841180 \h </w:instrText>
         </w:r>
         <w:r>
           <w:rPr>
@@ -1101,7 +1101,7 @@
             <w:noProof/>
             <w:webHidden/>
           </w:rPr>
-          <w:t>6</w:t>
+          <w:t>8</w:t>
         </w:r>
         <w:r>
           <w:rPr>
@@ -1166,7 +1166,7 @@
       <w:pPr>
         <w:pStyle w:val="Titre1"/>
       </w:pPr>
-      <w:bookmarkStart w:id="1" w:name="_Toc208233601"/>
+      <w:bookmarkStart w:id="1" w:name="_Toc210841171"/>
       <w:r>
         <w:lastRenderedPageBreak/>
         <w:t>Introduction</w:t>
@@ -1189,7 +1189,7 @@
       <w:pPr>
         <w:pStyle w:val="Titre2"/>
       </w:pPr>
-      <w:bookmarkStart w:id="2" w:name="_Toc208233602"/>
+      <w:bookmarkStart w:id="2" w:name="_Toc210841172"/>
       <w:r>
         <w:t>Objectif</w:t>
       </w:r>
@@ -1238,47 +1238,7 @@
         <w:pStyle w:val="Retraitcorpsdetexte"/>
       </w:pPr>
       <w:r>
-        <w:t>• Librairie graphique à choix (</w:t>
-      </w:r>
-      <w:proofErr w:type="spellStart"/>
-      <w:r>
-        <w:t>forms</w:t>
-      </w:r>
-      <w:proofErr w:type="spellEnd"/>
-      <w:r>
-        <w:t xml:space="preserve">, </w:t>
-      </w:r>
-      <w:proofErr w:type="spellStart"/>
-      <w:r>
-        <w:t>maui</w:t>
-      </w:r>
-      <w:proofErr w:type="spellEnd"/>
-      <w:r>
-        <w:t xml:space="preserve">, </w:t>
-      </w:r>
-      <w:proofErr w:type="spellStart"/>
-      <w:r>
-        <w:t>uno</w:t>
-      </w:r>
-      <w:proofErr w:type="spellEnd"/>
-      <w:r>
-        <w:t xml:space="preserve">, </w:t>
-      </w:r>
-      <w:proofErr w:type="spellStart"/>
-      <w:r>
-        <w:t>wpf</w:t>
-      </w:r>
-      <w:proofErr w:type="spellEnd"/>
-      <w:r>
-        <w:t xml:space="preserve">, </w:t>
-      </w:r>
-      <w:proofErr w:type="spellStart"/>
-      <w:r>
-        <w:t>fna</w:t>
-      </w:r>
-      <w:proofErr w:type="spellEnd"/>
-      <w:r>
-        <w:t xml:space="preserve">, …) </w:t>
+        <w:t xml:space="preserve">• Librairie graphique à choix (forms, maui, uno, wpf, fna, …) </w:t>
       </w:r>
     </w:p>
     <w:p>
@@ -1293,7 +1253,7 @@
       <w:pPr>
         <w:pStyle w:val="Titre2"/>
       </w:pPr>
-      <w:bookmarkStart w:id="3" w:name="_Toc208233603"/>
+      <w:bookmarkStart w:id="3" w:name="_Toc210841173"/>
       <w:r>
         <w:t>Objectif pédagogique</w:t>
       </w:r>
@@ -1304,15 +1264,7 @@
         <w:pStyle w:val="Retraitcorpsdetexte"/>
       </w:pPr>
       <w:r>
-        <w:t xml:space="preserve">Le but est de s’améliorer à utiliser la librairie LINQ, d’utiliser </w:t>
-      </w:r>
-      <w:proofErr w:type="spellStart"/>
-      <w:r>
-        <w:t>Scottplot</w:t>
-      </w:r>
-      <w:proofErr w:type="spellEnd"/>
-      <w:r>
-        <w:t xml:space="preserve"> comme librairie </w:t>
+        <w:t xml:space="preserve">Le but est de s’améliorer à utiliser la librairie LINQ, d’utiliser Scottplot comme librairie </w:t>
       </w:r>
       <w:r>
         <w:t>de traçage libre et open-source pour .NET</w:t>
@@ -1330,7 +1282,7 @@
       <w:pPr>
         <w:pStyle w:val="Titre1"/>
       </w:pPr>
-      <w:bookmarkStart w:id="4" w:name="_Toc208233604"/>
+      <w:bookmarkStart w:id="4" w:name="_Toc210841174"/>
       <w:r>
         <w:t>Planification</w:t>
       </w:r>
@@ -1349,15 +1301,7 @@
         <w:t xml:space="preserve">08.09.25 - </w:t>
       </w:r>
       <w:r>
-        <w:t xml:space="preserve">En tant qu’utilisateur, je veux afficher une représentation graphique de plusieurs séries temporelles (time </w:t>
-      </w:r>
-      <w:proofErr w:type="spellStart"/>
-      <w:r>
-        <w:t>series</w:t>
-      </w:r>
-      <w:proofErr w:type="spellEnd"/>
-      <w:r>
-        <w:t>) simultanément, afin de comparer différentes données météorologiques comme la température, les précipitations et l’humidité sur une même période.</w:t>
+        <w:t>En tant qu’utilisateur, je veux afficher une représentation graphique de plusieurs séries temporelles (time series) simultanément, afin de comparer différentes données météorologiques comme la température, les précipitations et l’humidité sur une même période.</w:t>
       </w:r>
     </w:p>
     <w:p>
@@ -1411,15 +1355,7 @@
         <w:t>Critères d'acceptation</w:t>
       </w:r>
       <w:r>
-        <w:t> : Voir les dates (jj-mm-</w:t>
-      </w:r>
-      <w:proofErr w:type="spellStart"/>
-      <w:r>
-        <w:t>aa</w:t>
-      </w:r>
-      <w:proofErr w:type="spellEnd"/>
-      <w:r>
-        <w:t>)</w:t>
+        <w:t> : Voir les dates (jj-mm-aa)</w:t>
       </w:r>
       <w:r>
         <w:t xml:space="preserve"> | plages de dates du 01.05 au 05.05</w:t>
@@ -1685,7 +1621,7 @@
       <w:pPr>
         <w:pStyle w:val="Titre1"/>
       </w:pPr>
-      <w:bookmarkStart w:id="5" w:name="_Toc208233605"/>
+      <w:bookmarkStart w:id="5" w:name="_Toc210841175"/>
       <w:r>
         <w:t>Maquette haute-fidélité</w:t>
       </w:r>
@@ -2058,7 +1994,6 @@
           <w:szCs w:val="32"/>
         </w:rPr>
       </w:pPr>
-      <w:bookmarkStart w:id="6" w:name="_Toc208233606"/>
       <w:r>
         <w:br w:type="page"/>
       </w:r>
@@ -2067,6 +2002,7 @@
       <w:pPr>
         <w:pStyle w:val="Titre1"/>
       </w:pPr>
+      <w:bookmarkStart w:id="6" w:name="_Toc210841176"/>
       <w:r>
         <w:lastRenderedPageBreak/>
         <w:t>Rapport de tests</w:t>
@@ -2160,8 +2096,11 @@
         <w:spacing w:before="240"/>
       </w:pPr>
       <w:r>
+        <w:rPr>
+          <w:noProof/>
+        </w:rPr>
         <w:drawing>
-          <wp:anchor distT="0" distB="0" distL="114300" distR="114300" simplePos="0" relativeHeight="251665408" behindDoc="0" locked="0" layoutInCell="1" allowOverlap="1" wp14:anchorId="2F46E21F" wp14:editId="3E1D4FE4">
+          <wp:anchor distT="0" distB="0" distL="114300" distR="114300" simplePos="0" relativeHeight="251665408" behindDoc="0" locked="0" layoutInCell="1" allowOverlap="1" wp14:anchorId="2F46E21F" wp14:editId="02D2F9D3">
             <wp:simplePos x="0" y="0"/>
             <wp:positionH relativeFrom="margin">
               <wp:posOffset>1274445</wp:posOffset>
@@ -2220,14 +2159,623 @@
     <w:p>
       <w:pPr>
         <w:pStyle w:val="Corpsdetexte"/>
-        <w:ind w:left="4395" w:hanging="3828"/>
-      </w:pPr>
+        <w:tabs>
+          <w:tab w:val="clear" w:pos="4395"/>
+        </w:tabs>
+      </w:pPr>
+    </w:p>
+    <w:p>
+      <w:pPr>
+        <w:pStyle w:val="Corpsdetexte"/>
+        <w:tabs>
+          <w:tab w:val="clear" w:pos="4395"/>
+        </w:tabs>
+      </w:pPr>
+    </w:p>
+    <w:p>
+      <w:pPr>
+        <w:pStyle w:val="Corpsdetexte"/>
+        <w:tabs>
+          <w:tab w:val="clear" w:pos="4395"/>
+        </w:tabs>
+      </w:pPr>
+    </w:p>
+    <w:p>
+      <w:pPr>
+        <w:pStyle w:val="Corpsdetexte"/>
+        <w:tabs>
+          <w:tab w:val="clear" w:pos="4395"/>
+        </w:tabs>
+      </w:pPr>
+    </w:p>
+    <w:p>
+      <w:pPr>
+        <w:pStyle w:val="Corpsdetexte"/>
+        <w:tabs>
+          <w:tab w:val="clear" w:pos="4395"/>
+        </w:tabs>
+      </w:pPr>
+    </w:p>
+    <w:p>
+      <w:pPr>
+        <w:pStyle w:val="Corpsdetexte"/>
+        <w:tabs>
+          <w:tab w:val="clear" w:pos="4395"/>
+        </w:tabs>
+      </w:pPr>
+    </w:p>
+    <w:p>
+      <w:pPr>
+        <w:pStyle w:val="Corpsdetexte"/>
+        <w:tabs>
+          <w:tab w:val="clear" w:pos="4395"/>
+        </w:tabs>
+      </w:pPr>
+    </w:p>
+    <w:p>
+      <w:pPr>
+        <w:pStyle w:val="Corpsdetexte"/>
+        <w:tabs>
+          <w:tab w:val="clear" w:pos="4395"/>
+        </w:tabs>
+      </w:pPr>
+    </w:p>
+    <w:p>
+      <w:pPr>
+        <w:pStyle w:val="Corpsdetexte"/>
+        <w:tabs>
+          <w:tab w:val="clear" w:pos="4395"/>
+        </w:tabs>
+      </w:pPr>
+    </w:p>
+    <w:p>
+      <w:pPr>
+        <w:pStyle w:val="Corpsdetexte"/>
+        <w:tabs>
+          <w:tab w:val="clear" w:pos="4395"/>
+        </w:tabs>
+      </w:pPr>
+      <w:r>
+        <w:rPr>
+          <w:noProof/>
+        </w:rPr>
+        <w:lastRenderedPageBreak/>
+        <mc:AlternateContent>
+          <mc:Choice Requires="wps">
+            <w:drawing>
+              <wp:anchor distT="0" distB="0" distL="114300" distR="114300" simplePos="0" relativeHeight="251676672" behindDoc="0" locked="0" layoutInCell="1" allowOverlap="1" wp14:anchorId="49D33377" wp14:editId="7A1D8931">
+                <wp:simplePos x="0" y="0"/>
+                <wp:positionH relativeFrom="column">
+                  <wp:posOffset>2466225</wp:posOffset>
+                </wp:positionH>
+                <wp:positionV relativeFrom="paragraph">
+                  <wp:posOffset>822861</wp:posOffset>
+                </wp:positionV>
+                <wp:extent cx="991589" cy="112651"/>
+                <wp:effectExtent l="0" t="0" r="18415" b="20955"/>
+                <wp:wrapNone/>
+                <wp:docPr id="390531000" name="Rectangle 1"/>
+                <wp:cNvGraphicFramePr/>
+                <a:graphic xmlns:a="http://schemas.openxmlformats.org/drawingml/2006/main">
+                  <a:graphicData uri="http://schemas.microsoft.com/office/word/2010/wordprocessingShape">
+                    <wps:wsp>
+                      <wps:cNvSpPr/>
+                      <wps:spPr>
+                        <a:xfrm>
+                          <a:off x="0" y="0"/>
+                          <a:ext cx="991589" cy="112651"/>
+                        </a:xfrm>
+                        <a:prstGeom prst="rect">
+                          <a:avLst/>
+                        </a:prstGeom>
+                        <a:noFill/>
+                        <a:ln>
+                          <a:solidFill>
+                            <a:srgbClr val="EE0000"/>
+                          </a:solidFill>
+                        </a:ln>
+                      </wps:spPr>
+                      <wps:style>
+                        <a:lnRef idx="2">
+                          <a:schemeClr val="accent6"/>
+                        </a:lnRef>
+                        <a:fillRef idx="1">
+                          <a:schemeClr val="lt1"/>
+                        </a:fillRef>
+                        <a:effectRef idx="0">
+                          <a:schemeClr val="accent6"/>
+                        </a:effectRef>
+                        <a:fontRef idx="minor">
+                          <a:schemeClr val="dk1"/>
+                        </a:fontRef>
+                      </wps:style>
+                      <wps:bodyPr rot="0" spcFirstLastPara="0" vertOverflow="overflow" horzOverflow="overflow" vert="horz" wrap="square" lIns="91440" tIns="45720" rIns="91440" bIns="45720" numCol="1" spcCol="0" rtlCol="0" fromWordArt="0" anchor="ctr" anchorCtr="0" forceAA="0" compatLnSpc="1">
+                        <a:prstTxWarp prst="textNoShape">
+                          <a:avLst/>
+                        </a:prstTxWarp>
+                        <a:noAutofit/>
+                      </wps:bodyPr>
+                    </wps:wsp>
+                  </a:graphicData>
+                </a:graphic>
+                <wp14:sizeRelH relativeFrom="margin">
+                  <wp14:pctWidth>0</wp14:pctWidth>
+                </wp14:sizeRelH>
+                <wp14:sizeRelV relativeFrom="margin">
+                  <wp14:pctHeight>0</wp14:pctHeight>
+                </wp14:sizeRelV>
+              </wp:anchor>
+            </w:drawing>
+          </mc:Choice>
+          <mc:Fallback>
+            <w:pict>
+              <v:rect w14:anchorId="6E06DC6A" id="Rectangle 1" o:spid="_x0000_s1026" style="position:absolute;margin-left:194.2pt;margin-top:64.8pt;width:78.1pt;height:8.85pt;z-index:251676672;visibility:visible;mso-wrap-style:square;mso-width-percent:0;mso-height-percent:0;mso-wrap-distance-left:9pt;mso-wrap-distance-top:0;mso-wrap-distance-right:9pt;mso-wrap-distance-bottom:0;mso-position-horizontal:absolute;mso-position-horizontal-relative:text;mso-position-vertical:absolute;mso-position-vertical-relative:text;mso-width-percent:0;mso-height-percent:0;mso-width-relative:margin;mso-height-relative:margin;v-text-anchor:middle" o:gfxdata="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" filled="f" strokecolor="#e00" strokeweight="1.25pt"/>
+            </w:pict>
+          </mc:Fallback>
+        </mc:AlternateContent>
+      </w:r>
+      <w:r>
+        <w:rPr>
+          <w:noProof/>
+        </w:rPr>
+        <mc:AlternateContent>
+          <mc:Choice Requires="wps">
+            <w:drawing>
+              <wp:anchor distT="0" distB="0" distL="114300" distR="114300" simplePos="0" relativeHeight="251668480" behindDoc="0" locked="0" layoutInCell="1" allowOverlap="1" wp14:anchorId="03C2CDAF" wp14:editId="32DF725B">
+                <wp:simplePos x="0" y="0"/>
+                <wp:positionH relativeFrom="column">
+                  <wp:posOffset>2256790</wp:posOffset>
+                </wp:positionH>
+                <wp:positionV relativeFrom="paragraph">
+                  <wp:posOffset>603941</wp:posOffset>
+                </wp:positionV>
+                <wp:extent cx="777240" cy="81280"/>
+                <wp:effectExtent l="0" t="0" r="22860" b="13970"/>
+                <wp:wrapNone/>
+                <wp:docPr id="479567585" name="Rectangle 1"/>
+                <wp:cNvGraphicFramePr/>
+                <a:graphic xmlns:a="http://schemas.openxmlformats.org/drawingml/2006/main">
+                  <a:graphicData uri="http://schemas.microsoft.com/office/word/2010/wordprocessingShape">
+                    <wps:wsp>
+                      <wps:cNvSpPr/>
+                      <wps:spPr>
+                        <a:xfrm>
+                          <a:off x="0" y="0"/>
+                          <a:ext cx="777240" cy="81280"/>
+                        </a:xfrm>
+                        <a:prstGeom prst="rect">
+                          <a:avLst/>
+                        </a:prstGeom>
+                        <a:noFill/>
+                        <a:ln>
+                          <a:solidFill>
+                            <a:srgbClr val="EE0000"/>
+                          </a:solidFill>
+                        </a:ln>
+                      </wps:spPr>
+                      <wps:style>
+                        <a:lnRef idx="2">
+                          <a:schemeClr val="accent6"/>
+                        </a:lnRef>
+                        <a:fillRef idx="1">
+                          <a:schemeClr val="lt1"/>
+                        </a:fillRef>
+                        <a:effectRef idx="0">
+                          <a:schemeClr val="accent6"/>
+                        </a:effectRef>
+                        <a:fontRef idx="minor">
+                          <a:schemeClr val="dk1"/>
+                        </a:fontRef>
+                      </wps:style>
+                      <wps:bodyPr rot="0" spcFirstLastPara="0" vertOverflow="overflow" horzOverflow="overflow" vert="horz" wrap="square" lIns="91440" tIns="45720" rIns="91440" bIns="45720" numCol="1" spcCol="0" rtlCol="0" fromWordArt="0" anchor="ctr" anchorCtr="0" forceAA="0" compatLnSpc="1">
+                        <a:prstTxWarp prst="textNoShape">
+                          <a:avLst/>
+                        </a:prstTxWarp>
+                        <a:noAutofit/>
+                      </wps:bodyPr>
+                    </wps:wsp>
+                  </a:graphicData>
+                </a:graphic>
+                <wp14:sizeRelV relativeFrom="margin">
+                  <wp14:pctHeight>0</wp14:pctHeight>
+                </wp14:sizeRelV>
+              </wp:anchor>
+            </w:drawing>
+          </mc:Choice>
+          <mc:Fallback>
+            <w:pict>
+              <v:rect w14:anchorId="4EC5C775" id="Rectangle 1" o:spid="_x0000_s1026" style="position:absolute;margin-left:177.7pt;margin-top:47.55pt;width:61.2pt;height:6.4pt;z-index:251668480;visibility:visible;mso-wrap-style:square;mso-height-percent:0;mso-wrap-distance-left:9pt;mso-wrap-distance-top:0;mso-wrap-distance-right:9pt;mso-wrap-distance-bottom:0;mso-position-horizontal:absolute;mso-position-horizontal-relative:text;mso-position-vertical:absolute;mso-position-vertical-relative:text;mso-height-percent:0;mso-height-relative:margin;v-text-anchor:middle" o:gfxdata="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" filled="f" strokecolor="#e00" strokeweight="1.25pt"/>
+            </w:pict>
+          </mc:Fallback>
+        </mc:AlternateContent>
+      </w:r>
+      <w:r>
+        <w:rPr>
+          <w:noProof/>
+        </w:rPr>
+        <mc:AlternateContent>
+          <mc:Choice Requires="wps">
+            <w:drawing>
+              <wp:anchor distT="0" distB="0" distL="114300" distR="114300" simplePos="0" relativeHeight="251670528" behindDoc="0" locked="0" layoutInCell="1" allowOverlap="1" wp14:anchorId="61FF4079" wp14:editId="3FB387B9">
+                <wp:simplePos x="0" y="0"/>
+                <wp:positionH relativeFrom="column">
+                  <wp:posOffset>1239869</wp:posOffset>
+                </wp:positionH>
+                <wp:positionV relativeFrom="paragraph">
+                  <wp:posOffset>3091962</wp:posOffset>
+                </wp:positionV>
+                <wp:extent cx="502417" cy="86304"/>
+                <wp:effectExtent l="0" t="0" r="12065" b="28575"/>
+                <wp:wrapNone/>
+                <wp:docPr id="694129639" name="Rectangle 1"/>
+                <wp:cNvGraphicFramePr/>
+                <a:graphic xmlns:a="http://schemas.openxmlformats.org/drawingml/2006/main">
+                  <a:graphicData uri="http://schemas.microsoft.com/office/word/2010/wordprocessingShape">
+                    <wps:wsp>
+                      <wps:cNvSpPr/>
+                      <wps:spPr>
+                        <a:xfrm>
+                          <a:off x="0" y="0"/>
+                          <a:ext cx="502417" cy="86304"/>
+                        </a:xfrm>
+                        <a:prstGeom prst="rect">
+                          <a:avLst/>
+                        </a:prstGeom>
+                        <a:noFill/>
+                        <a:ln>
+                          <a:solidFill>
+                            <a:srgbClr val="EE0000"/>
+                          </a:solidFill>
+                        </a:ln>
+                      </wps:spPr>
+                      <wps:style>
+                        <a:lnRef idx="2">
+                          <a:schemeClr val="accent6"/>
+                        </a:lnRef>
+                        <a:fillRef idx="1">
+                          <a:schemeClr val="lt1"/>
+                        </a:fillRef>
+                        <a:effectRef idx="0">
+                          <a:schemeClr val="accent6"/>
+                        </a:effectRef>
+                        <a:fontRef idx="minor">
+                          <a:schemeClr val="dk1"/>
+                        </a:fontRef>
+                      </wps:style>
+                      <wps:bodyPr rot="0" spcFirstLastPara="0" vertOverflow="overflow" horzOverflow="overflow" vert="horz" wrap="square" lIns="91440" tIns="45720" rIns="91440" bIns="45720" numCol="1" spcCol="0" rtlCol="0" fromWordArt="0" anchor="ctr" anchorCtr="0" forceAA="0" compatLnSpc="1">
+                        <a:prstTxWarp prst="textNoShape">
+                          <a:avLst/>
+                        </a:prstTxWarp>
+                        <a:noAutofit/>
+                      </wps:bodyPr>
+                    </wps:wsp>
+                  </a:graphicData>
+                </a:graphic>
+                <wp14:sizeRelH relativeFrom="margin">
+                  <wp14:pctWidth>0</wp14:pctWidth>
+                </wp14:sizeRelH>
+                <wp14:sizeRelV relativeFrom="margin">
+                  <wp14:pctHeight>0</wp14:pctHeight>
+                </wp14:sizeRelV>
+              </wp:anchor>
+            </w:drawing>
+          </mc:Choice>
+          <mc:Fallback>
+            <w:pict>
+              <v:rect w14:anchorId="71745C9D" id="Rectangle 1" o:spid="_x0000_s1026" style="position:absolute;margin-left:97.65pt;margin-top:243.45pt;width:39.55pt;height:6.8pt;z-index:251670528;visibility:visible;mso-wrap-style:square;mso-width-percent:0;mso-height-percent:0;mso-wrap-distance-left:9pt;mso-wrap-distance-top:0;mso-wrap-distance-right:9pt;mso-wrap-distance-bottom:0;mso-position-horizontal:absolute;mso-position-horizontal-relative:text;mso-position-vertical:absolute;mso-position-vertical-relative:text;mso-width-percent:0;mso-height-percent:0;mso-width-relative:margin;mso-height-relative:margin;v-text-anchor:middle" o:gfxdata="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" filled="f" strokecolor="#e00" strokeweight="1.25pt"/>
+            </w:pict>
+          </mc:Fallback>
+        </mc:AlternateContent>
+      </w:r>
+      <w:r>
+        <w:drawing>
+          <wp:anchor distT="0" distB="0" distL="114300" distR="114300" simplePos="0" relativeHeight="251667456" behindDoc="0" locked="0" layoutInCell="1" allowOverlap="1" wp14:anchorId="6733AAEB" wp14:editId="33C0B455">
+            <wp:simplePos x="0" y="0"/>
+            <wp:positionH relativeFrom="margin">
+              <wp:align>center</wp:align>
+            </wp:positionH>
+            <wp:positionV relativeFrom="paragraph">
+              <wp:posOffset>503514</wp:posOffset>
+            </wp:positionV>
+            <wp:extent cx="3426460" cy="2762885"/>
+            <wp:effectExtent l="0" t="0" r="2540" b="0"/>
+            <wp:wrapTopAndBottom/>
+            <wp:docPr id="358496277" name="Image 1" descr="Une image contenant texte, capture d’écran, Tracé, diagramme"/>
+            <wp:cNvGraphicFramePr>
+              <a:graphicFrameLocks xmlns:a="http://schemas.openxmlformats.org/drawingml/2006/main" noChangeAspect="1"/>
+            </wp:cNvGraphicFramePr>
+            <a:graphic xmlns:a="http://schemas.openxmlformats.org/drawingml/2006/main">
+              <a:graphicData uri="http://schemas.openxmlformats.org/drawingml/2006/picture">
+                <pic:pic xmlns:pic="http://schemas.openxmlformats.org/drawingml/2006/picture">
+                  <pic:nvPicPr>
+                    <pic:cNvPr id="358496277" name="Image 1" descr="Une image contenant texte, capture d’écran, Tracé, diagramme"/>
+                    <pic:cNvPicPr/>
+                  </pic:nvPicPr>
+                  <pic:blipFill>
+                    <a:blip r:embed="rId16" cstate="print">
+                      <a:extLst>
+                        <a:ext uri="{28A0092B-C50C-407E-A947-70E740481C1C}">
+                          <a14:useLocalDpi xmlns:a14="http://schemas.microsoft.com/office/drawing/2010/main" val="0"/>
+                        </a:ext>
+                      </a:extLst>
+                    </a:blip>
+                    <a:stretch>
+                      <a:fillRect/>
+                    </a:stretch>
+                  </pic:blipFill>
+                  <pic:spPr>
+                    <a:xfrm>
+                      <a:off x="0" y="0"/>
+                      <a:ext cx="3426460" cy="2762885"/>
+                    </a:xfrm>
+                    <a:prstGeom prst="rect">
+                      <a:avLst/>
+                    </a:prstGeom>
+                  </pic:spPr>
+                </pic:pic>
+              </a:graphicData>
+            </a:graphic>
+            <wp14:sizeRelH relativeFrom="margin">
+              <wp14:pctWidth>0</wp14:pctWidth>
+            </wp14:sizeRelH>
+            <wp14:sizeRelV relativeFrom="margin">
+              <wp14:pctHeight>0</wp14:pctHeight>
+            </wp14:sizeRelV>
+          </wp:anchor>
+        </w:drawing>
+      </w:r>
+      <w:r>
+        <w:t>Il est possible de filtrer les données en sélectionnant une plage spécifique située avant la date maximale de la dernière collecte de données.</w:t>
+      </w:r>
+    </w:p>
+    <w:p>
+      <w:pPr>
+        <w:pStyle w:val="Corpsdetexte"/>
+        <w:tabs>
+          <w:tab w:val="clear" w:pos="4395"/>
+        </w:tabs>
+      </w:pPr>
+    </w:p>
+    <w:p>
+      <w:pPr>
+        <w:pStyle w:val="Corpsdetexte"/>
+        <w:tabs>
+          <w:tab w:val="clear" w:pos="4395"/>
+        </w:tabs>
+      </w:pPr>
+      <w:r>
+        <w:rPr>
+          <w:noProof/>
+        </w:rPr>
+        <mc:AlternateContent>
+          <mc:Choice Requires="wps">
+            <w:drawing>
+              <wp:anchor distT="0" distB="0" distL="114300" distR="114300" simplePos="0" relativeHeight="251672576" behindDoc="0" locked="0" layoutInCell="1" allowOverlap="1" wp14:anchorId="7BC9500C" wp14:editId="421C5373">
+                <wp:simplePos x="0" y="0"/>
+                <wp:positionH relativeFrom="column">
+                  <wp:posOffset>4333240</wp:posOffset>
+                </wp:positionH>
+                <wp:positionV relativeFrom="paragraph">
+                  <wp:posOffset>3475411</wp:posOffset>
+                </wp:positionV>
+                <wp:extent cx="309880" cy="107315"/>
+                <wp:effectExtent l="0" t="0" r="13970" b="26035"/>
+                <wp:wrapNone/>
+                <wp:docPr id="1933872169" name="Rectangle 1"/>
+                <wp:cNvGraphicFramePr/>
+                <a:graphic xmlns:a="http://schemas.openxmlformats.org/drawingml/2006/main">
+                  <a:graphicData uri="http://schemas.microsoft.com/office/word/2010/wordprocessingShape">
+                    <wps:wsp>
+                      <wps:cNvSpPr/>
+                      <wps:spPr>
+                        <a:xfrm>
+                          <a:off x="0" y="0"/>
+                          <a:ext cx="309880" cy="107315"/>
+                        </a:xfrm>
+                        <a:prstGeom prst="rect">
+                          <a:avLst/>
+                        </a:prstGeom>
+                        <a:noFill/>
+                        <a:ln>
+                          <a:solidFill>
+                            <a:srgbClr val="EE0000"/>
+                          </a:solidFill>
+                        </a:ln>
+                      </wps:spPr>
+                      <wps:style>
+                        <a:lnRef idx="2">
+                          <a:schemeClr val="accent6"/>
+                        </a:lnRef>
+                        <a:fillRef idx="1">
+                          <a:schemeClr val="lt1"/>
+                        </a:fillRef>
+                        <a:effectRef idx="0">
+                          <a:schemeClr val="accent6"/>
+                        </a:effectRef>
+                        <a:fontRef idx="minor">
+                          <a:schemeClr val="dk1"/>
+                        </a:fontRef>
+                      </wps:style>
+                      <wps:bodyPr rot="0" spcFirstLastPara="0" vertOverflow="overflow" horzOverflow="overflow" vert="horz" wrap="square" lIns="91440" tIns="45720" rIns="91440" bIns="45720" numCol="1" spcCol="0" rtlCol="0" fromWordArt="0" anchor="ctr" anchorCtr="0" forceAA="0" compatLnSpc="1">
+                        <a:prstTxWarp prst="textNoShape">
+                          <a:avLst/>
+                        </a:prstTxWarp>
+                        <a:noAutofit/>
+                      </wps:bodyPr>
+                    </wps:wsp>
+                  </a:graphicData>
+                </a:graphic>
+                <wp14:sizeRelH relativeFrom="margin">
+                  <wp14:pctWidth>0</wp14:pctWidth>
+                </wp14:sizeRelH>
+                <wp14:sizeRelV relativeFrom="margin">
+                  <wp14:pctHeight>0</wp14:pctHeight>
+                </wp14:sizeRelV>
+              </wp:anchor>
+            </w:drawing>
+          </mc:Choice>
+          <mc:Fallback>
+            <w:pict>
+              <v:rect w14:anchorId="6E3B0768" id="Rectangle 1" o:spid="_x0000_s1026" style="position:absolute;margin-left:341.2pt;margin-top:273.65pt;width:24.4pt;height:8.45pt;z-index:251672576;visibility:visible;mso-wrap-style:square;mso-width-percent:0;mso-height-percent:0;mso-wrap-distance-left:9pt;mso-wrap-distance-top:0;mso-wrap-distance-right:9pt;mso-wrap-distance-bottom:0;mso-position-horizontal:absolute;mso-position-horizontal-relative:text;mso-position-vertical:absolute;mso-position-vertical-relative:text;mso-width-percent:0;mso-height-percent:0;mso-width-relative:margin;mso-height-relative:margin;v-text-anchor:middle" o:gfxdata="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" filled="f" strokecolor="#e00" strokeweight="1.25pt"/>
+            </w:pict>
+          </mc:Fallback>
+        </mc:AlternateContent>
+      </w:r>
+      <w:r>
+        <w:rPr>
+          <w:noProof/>
+        </w:rPr>
+        <mc:AlternateContent>
+          <mc:Choice Requires="wps">
+            <w:drawing>
+              <wp:anchor distT="0" distB="0" distL="114300" distR="114300" simplePos="0" relativeHeight="251674624" behindDoc="0" locked="0" layoutInCell="1" allowOverlap="1" wp14:anchorId="3609475B" wp14:editId="2227428C">
+                <wp:simplePos x="0" y="0"/>
+                <wp:positionH relativeFrom="column">
+                  <wp:posOffset>1065446</wp:posOffset>
+                </wp:positionH>
+                <wp:positionV relativeFrom="paragraph">
+                  <wp:posOffset>3112861</wp:posOffset>
+                </wp:positionV>
+                <wp:extent cx="309886" cy="107577"/>
+                <wp:effectExtent l="0" t="0" r="13970" b="26035"/>
+                <wp:wrapNone/>
+                <wp:docPr id="1762144001" name="Rectangle 1"/>
+                <wp:cNvGraphicFramePr/>
+                <a:graphic xmlns:a="http://schemas.openxmlformats.org/drawingml/2006/main">
+                  <a:graphicData uri="http://schemas.microsoft.com/office/word/2010/wordprocessingShape">
+                    <wps:wsp>
+                      <wps:cNvSpPr/>
+                      <wps:spPr>
+                        <a:xfrm>
+                          <a:off x="0" y="0"/>
+                          <a:ext cx="309886" cy="107577"/>
+                        </a:xfrm>
+                        <a:prstGeom prst="rect">
+                          <a:avLst/>
+                        </a:prstGeom>
+                        <a:noFill/>
+                        <a:ln>
+                          <a:solidFill>
+                            <a:srgbClr val="EE0000"/>
+                          </a:solidFill>
+                        </a:ln>
+                      </wps:spPr>
+                      <wps:style>
+                        <a:lnRef idx="2">
+                          <a:schemeClr val="accent6"/>
+                        </a:lnRef>
+                        <a:fillRef idx="1">
+                          <a:schemeClr val="lt1"/>
+                        </a:fillRef>
+                        <a:effectRef idx="0">
+                          <a:schemeClr val="accent6"/>
+                        </a:effectRef>
+                        <a:fontRef idx="minor">
+                          <a:schemeClr val="dk1"/>
+                        </a:fontRef>
+                      </wps:style>
+                      <wps:bodyPr rot="0" spcFirstLastPara="0" vertOverflow="overflow" horzOverflow="overflow" vert="horz" wrap="square" lIns="91440" tIns="45720" rIns="91440" bIns="45720" numCol="1" spcCol="0" rtlCol="0" fromWordArt="0" anchor="ctr" anchorCtr="0" forceAA="0" compatLnSpc="1">
+                        <a:prstTxWarp prst="textNoShape">
+                          <a:avLst/>
+                        </a:prstTxWarp>
+                        <a:noAutofit/>
+                      </wps:bodyPr>
+                    </wps:wsp>
+                  </a:graphicData>
+                </a:graphic>
+                <wp14:sizeRelH relativeFrom="margin">
+                  <wp14:pctWidth>0</wp14:pctWidth>
+                </wp14:sizeRelH>
+                <wp14:sizeRelV relativeFrom="margin">
+                  <wp14:pctHeight>0</wp14:pctHeight>
+                </wp14:sizeRelV>
+              </wp:anchor>
+            </w:drawing>
+          </mc:Choice>
+          <mc:Fallback>
+            <w:pict>
+              <v:rect w14:anchorId="52419733" id="Rectangle 1" o:spid="_x0000_s1026" style="position:absolute;margin-left:83.9pt;margin-top:245.1pt;width:24.4pt;height:8.45pt;z-index:251674624;visibility:visible;mso-wrap-style:square;mso-width-percent:0;mso-height-percent:0;mso-wrap-distance-left:9pt;mso-wrap-distance-top:0;mso-wrap-distance-right:9pt;mso-wrap-distance-bottom:0;mso-position-horizontal:absolute;mso-position-horizontal-relative:text;mso-position-vertical:absolute;mso-position-vertical-relative:text;mso-width-percent:0;mso-height-percent:0;mso-width-relative:margin;mso-height-relative:margin;v-text-anchor:middle" o:gfxdata="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" filled="f" strokecolor="#e00" strokeweight="1.25pt"/>
+            </w:pict>
+          </mc:Fallback>
+        </mc:AlternateContent>
+      </w:r>
+      <w:r>
+        <w:t>Pour la partie fonction f(x), on arrive à afficher des constantes mais l’évaluation de fonctions trigonométrique ne fonctionne pas.</w:t>
+      </w:r>
+      <w:r>
+        <w:t xml:space="preserve"> Puis si l’on veut exporter une image PNG du graphique tel qu’il est affiché, il suffit d’appuyer sur le bouton « Export ».</w:t>
+      </w:r>
+    </w:p>
+    <w:p>
+      <w:pPr>
+        <w:pStyle w:val="Corpsdetexte"/>
+        <w:tabs>
+          <w:tab w:val="clear" w:pos="4395"/>
+        </w:tabs>
+      </w:pPr>
+      <w:r>
+        <w:drawing>
+          <wp:anchor distT="0" distB="0" distL="114300" distR="114300" simplePos="0" relativeHeight="251666432" behindDoc="0" locked="0" layoutInCell="1" allowOverlap="1" wp14:anchorId="42619CFE" wp14:editId="1D612B24">
+            <wp:simplePos x="0" y="0"/>
+            <wp:positionH relativeFrom="margin">
+              <wp:align>center</wp:align>
+            </wp:positionH>
+            <wp:positionV relativeFrom="paragraph">
+              <wp:posOffset>7315</wp:posOffset>
+            </wp:positionV>
+            <wp:extent cx="3792855" cy="3057525"/>
+            <wp:effectExtent l="0" t="0" r="0" b="9525"/>
+            <wp:wrapTopAndBottom/>
+            <wp:docPr id="1304880501" name="Image 1" descr="Une image contenant texte, capture d’écran, diagramme, ligne"/>
+            <wp:cNvGraphicFramePr>
+              <a:graphicFrameLocks xmlns:a="http://schemas.openxmlformats.org/drawingml/2006/main" noChangeAspect="1"/>
+            </wp:cNvGraphicFramePr>
+            <a:graphic xmlns:a="http://schemas.openxmlformats.org/drawingml/2006/main">
+              <a:graphicData uri="http://schemas.openxmlformats.org/drawingml/2006/picture">
+                <pic:pic xmlns:pic="http://schemas.openxmlformats.org/drawingml/2006/picture">
+                  <pic:nvPicPr>
+                    <pic:cNvPr id="1304880501" name="Image 1" descr="Une image contenant texte, capture d’écran, diagramme, ligne"/>
+                    <pic:cNvPicPr/>
+                  </pic:nvPicPr>
+                  <pic:blipFill>
+                    <a:blip r:embed="rId17" cstate="print">
+                      <a:extLst>
+                        <a:ext uri="{28A0092B-C50C-407E-A947-70E740481C1C}">
+                          <a14:useLocalDpi xmlns:a14="http://schemas.microsoft.com/office/drawing/2010/main" val="0"/>
+                        </a:ext>
+                      </a:extLst>
+                    </a:blip>
+                    <a:stretch>
+                      <a:fillRect/>
+                    </a:stretch>
+                  </pic:blipFill>
+                  <pic:spPr>
+                    <a:xfrm>
+                      <a:off x="0" y="0"/>
+                      <a:ext cx="3792855" cy="3057525"/>
+                    </a:xfrm>
+                    <a:prstGeom prst="rect">
+                      <a:avLst/>
+                    </a:prstGeom>
+                  </pic:spPr>
+                </pic:pic>
+              </a:graphicData>
+            </a:graphic>
+            <wp14:sizeRelH relativeFrom="margin">
+              <wp14:pctWidth>0</wp14:pctWidth>
+            </wp14:sizeRelH>
+            <wp14:sizeRelV relativeFrom="margin">
+              <wp14:pctHeight>0</wp14:pctHeight>
+            </wp14:sizeRelV>
+          </wp:anchor>
+        </w:drawing>
+      </w:r>
     </w:p>
     <w:p>
       <w:pPr>
         <w:pStyle w:val="Titre1"/>
       </w:pPr>
-      <w:bookmarkStart w:id="7" w:name="_Toc208233607"/>
+      <w:bookmarkStart w:id="7" w:name="_Toc210841177"/>
       <w:r>
         <w:t>Journal de travail</w:t>
       </w:r>
@@ -2245,7 +2793,7 @@
       <w:pPr>
         <w:pStyle w:val="Corpsdetexte"/>
       </w:pPr>
-      <w:hyperlink r:id="rId16" w:history="1">
+      <w:hyperlink r:id="rId18" w:history="1">
         <w:r>
           <w:rPr>
             <w:rStyle w:val="Lienhypertexte"/>
@@ -2263,7 +2811,7 @@
       <w:pPr>
         <w:pStyle w:val="Titre1"/>
       </w:pPr>
-      <w:bookmarkStart w:id="8" w:name="_Toc208233608"/>
+      <w:bookmarkStart w:id="8" w:name="_Toc210841178"/>
       <w:r>
         <w:lastRenderedPageBreak/>
         <w:t>Usage de l’IA</w:t>
@@ -2281,7 +2829,13 @@
         <w:t>. La recherche d’une librairie de traçage adaptée à ce projet</w:t>
       </w:r>
       <w:r>
-        <w:t xml:space="preserve">, différents calculs et aide pour des bug fix. </w:t>
+        <w:t>, différents calculs et aide pour des bug fix</w:t>
+      </w:r>
+      <w:r>
+        <w:t xml:space="preserve"> sur le code</w:t>
+      </w:r>
+      <w:r>
+        <w:t>, ainsi qu’une assistance sur le code.</w:t>
       </w:r>
     </w:p>
     <w:p>
@@ -2291,7 +2845,7 @@
           <w:lang w:val="en-US"/>
         </w:rPr>
       </w:pPr>
-      <w:bookmarkStart w:id="9" w:name="_Toc208233609"/>
+      <w:bookmarkStart w:id="9" w:name="_Toc210841179"/>
       <w:r>
         <w:rPr>
           <w:lang w:val="en-US"/>
@@ -2304,7 +2858,7 @@
       <w:pPr>
         <w:pStyle w:val="Titre2"/>
       </w:pPr>
-      <w:bookmarkStart w:id="10" w:name="_Toc208233610"/>
+      <w:bookmarkStart w:id="10" w:name="_Toc210841180"/>
       <w:r>
         <w:t xml:space="preserve">Conclusion </w:t>
       </w:r>
@@ -2328,8 +2882,8 @@
     </w:p>
     <w:p/>
     <w:sectPr>
-      <w:headerReference w:type="default" r:id="rId17"/>
-      <w:footerReference w:type="default" r:id="rId18"/>
+      <w:headerReference w:type="default" r:id="rId19"/>
+      <w:footerReference w:type="default" r:id="rId20"/>
       <w:pgSz w:w="11906" w:h="16838" w:code="9"/>
       <w:pgMar w:top="1418" w:right="1418" w:bottom="1418" w:left="1418" w:header="709" w:footer="709" w:gutter="0"/>
       <w:cols w:space="708"/>
@@ -2808,7 +3362,7 @@
               <w:noProof/>
               <w:szCs w:val="16"/>
             </w:rPr>
-            <w:t>08.09.2025 14:19</w:t>
+            <w:t>06.10.2025 16:28</w:t>
           </w:r>
           <w:r>
             <w:rPr>
@@ -3029,7 +3583,7 @@
         <v:path o:extrusionok="f" gradientshapeok="t" o:connecttype="rect"/>
         <o:lock v:ext="edit" aspectratio="t"/>
       </v:shapetype>
-      <v:shape id="_x0000_i1038" type="#_x0000_t75" style="width:11.25pt;height:11.25pt" o:bullet="t">
+      <v:shape id="_x0000_i1059" type="#_x0000_t75" style="width:11.2pt;height:11.2pt" o:bullet="t">
         <v:imagedata r:id="rId1" o:title="BD10263_"/>
       </v:shape>
     </w:pict>
@@ -7872,15 +8426,6 @@
 </file>
 
 <file path=customXml/item1.xml><?xml version="1.0" encoding="utf-8"?>
-<?mso-contentType ?>
-<FormTemplates xmlns="http://schemas.microsoft.com/sharepoint/v3/contenttype/forms">
-  <Display>DocumentLibraryForm</Display>
-  <Edit>DocumentLibraryForm</Edit>
-  <New>DocumentLibraryForm</New>
-</FormTemplates>
-</file>
-
-<file path=customXml/item2.xml><?xml version="1.0" encoding="utf-8"?>
 <ct:contentTypeSchema xmlns:ct="http://schemas.microsoft.com/office/2006/metadata/contentType" xmlns:ma="http://schemas.microsoft.com/office/2006/metadata/properties/metaAttributes" ct:_="" ma:_="" ma:contentTypeName="Document" ma:contentTypeID="0x01010080C9F2488912074FB587B9AD9ADAE5BB" ma:contentTypeVersion="13" ma:contentTypeDescription="Crée un document." ma:contentTypeScope="" ma:versionID="98cb6024266d177b928872b226e6993e">
   <xsd:schema xmlns:xsd="http://www.w3.org/2001/XMLSchema" xmlns:xs="http://www.w3.org/2001/XMLSchema" xmlns:p="http://schemas.microsoft.com/office/2006/metadata/properties" xmlns:ns2="b5cf4370-ac38-4b9e-9836-ef6f5df64f24" xmlns:ns3="eefa3612-053e-497a-ae76-8a76877f5e22" targetNamespace="http://schemas.microsoft.com/office/2006/metadata/properties" ma:root="true" ma:fieldsID="005441ce51d7a2dcada4efd17c7a03e9" ns2:_="" ns3:_="">
     <xsd:import namespace="b5cf4370-ac38-4b9e-9836-ef6f5df64f24"/>
@@ -8087,7 +8632,27 @@
 </ct:contentTypeSchema>
 </file>
 
+<file path=customXml/item2.xml><?xml version="1.0" encoding="utf-8"?>
+<?mso-contentType ?>
+<FormTemplates xmlns="http://schemas.microsoft.com/sharepoint/v3/contenttype/forms">
+  <Display>DocumentLibraryForm</Display>
+  <Edit>DocumentLibraryForm</Edit>
+  <New>DocumentLibraryForm</New>
+</FormTemplates>
+</file>
+
 <file path=customXml/item3.xml><?xml version="1.0" encoding="utf-8"?>
+<p:properties xmlns:p="http://schemas.microsoft.com/office/2006/metadata/properties" xmlns:xsi="http://www.w3.org/2001/XMLSchema-instance" xmlns:pc="http://schemas.microsoft.com/office/infopath/2007/PartnerControls">
+  <documentManagement>
+    <lcf76f155ced4ddcb4097134ff3c332f xmlns="b5cf4370-ac38-4b9e-9836-ef6f5df64f24">
+      <Terms xmlns="http://schemas.microsoft.com/office/infopath/2007/PartnerControls"/>
+    </lcf76f155ced4ddcb4097134ff3c332f>
+    <TaxCatchAll xmlns="eefa3612-053e-497a-ae76-8a76877f5e22" xsi:nil="true"/>
+  </documentManagement>
+</p:properties>
+</file>
+
+<file path=customXml/item4.xml><?xml version="1.0" encoding="utf-8"?>
 <b:Sources xmlns:b="http://schemas.openxmlformats.org/officeDocument/2006/bibliography" xmlns="http://schemas.openxmlformats.org/officeDocument/2006/bibliography" SelectedStyle="\APASixthEditionOfficeOnline.xsl" StyleName="APA" Version="6">
   <b:Source>
     <b:Tag>Espace_réservé1</b:Tag>
@@ -8110,26 +8675,7 @@
 </b:Sources>
 </file>
 
-<file path=customXml/item4.xml><?xml version="1.0" encoding="utf-8"?>
-<p:properties xmlns:p="http://schemas.microsoft.com/office/2006/metadata/properties" xmlns:xsi="http://www.w3.org/2001/XMLSchema-instance" xmlns:pc="http://schemas.microsoft.com/office/infopath/2007/PartnerControls">
-  <documentManagement>
-    <lcf76f155ced4ddcb4097134ff3c332f xmlns="b5cf4370-ac38-4b9e-9836-ef6f5df64f24">
-      <Terms xmlns="http://schemas.microsoft.com/office/infopath/2007/PartnerControls"/>
-    </lcf76f155ced4ddcb4097134ff3c332f>
-    <TaxCatchAll xmlns="eefa3612-053e-497a-ae76-8a76877f5e22" xsi:nil="true"/>
-  </documentManagement>
-</p:properties>
-</file>
-
 <file path=customXml/itemProps1.xml><?xml version="1.0" encoding="utf-8"?>
-<ds:datastoreItem xmlns:ds="http://schemas.openxmlformats.org/officeDocument/2006/customXml" ds:itemID="{DF8E7934-3F3A-4F32-A7D4-1B248DBE707D}">
-  <ds:schemaRefs>
-    <ds:schemaRef ds:uri="http://schemas.microsoft.com/sharepoint/v3/contenttype/forms"/>
-  </ds:schemaRefs>
-</ds:datastoreItem>
-</file>
-
-<file path=customXml/itemProps2.xml><?xml version="1.0" encoding="utf-8"?>
 <ds:datastoreItem xmlns:ds="http://schemas.openxmlformats.org/officeDocument/2006/customXml" ds:itemID="{FDA51230-EF27-4A68-A446-37F9E544E2A2}">
   <ds:schemaRefs>
     <ds:schemaRef ds:uri="http://schemas.microsoft.com/office/2006/metadata/contentType"/>
@@ -8148,15 +8694,15 @@
 </ds:datastoreItem>
 </file>
 
-<file path=customXml/itemProps3.xml><?xml version="1.0" encoding="utf-8"?>
-<ds:datastoreItem xmlns:ds="http://schemas.openxmlformats.org/officeDocument/2006/customXml" ds:itemID="{A507DE50-9571-420A-B97A-D696E6EB7C50}">
+<file path=customXml/itemProps2.xml><?xml version="1.0" encoding="utf-8"?>
+<ds:datastoreItem xmlns:ds="http://schemas.openxmlformats.org/officeDocument/2006/customXml" ds:itemID="{DF8E7934-3F3A-4F32-A7D4-1B248DBE707D}">
   <ds:schemaRefs>
-    <ds:schemaRef ds:uri="http://schemas.openxmlformats.org/officeDocument/2006/bibliography"/>
+    <ds:schemaRef ds:uri="http://schemas.microsoft.com/sharepoint/v3/contenttype/forms"/>
   </ds:schemaRefs>
 </ds:datastoreItem>
 </file>
 
-<file path=customXml/itemProps4.xml><?xml version="1.0" encoding="utf-8"?>
+<file path=customXml/itemProps3.xml><?xml version="1.0" encoding="utf-8"?>
 <ds:datastoreItem xmlns:ds="http://schemas.openxmlformats.org/officeDocument/2006/customXml" ds:itemID="{4181FC95-92B5-446F-AE57-E4A44C8C450C}">
   <ds:schemaRefs>
     <ds:schemaRef ds:uri="http://schemas.microsoft.com/office/2006/metadata/properties"/>
@@ -8165,4 +8711,12 @@
     <ds:schemaRef ds:uri="eefa3612-053e-497a-ae76-8a76877f5e22"/>
   </ds:schemaRefs>
 </ds:datastoreItem>
+</file>
+
+<file path=customXml/itemProps4.xml><?xml version="1.0" encoding="utf-8"?>
+<ds:datastoreItem xmlns:ds="http://schemas.openxmlformats.org/officeDocument/2006/customXml" ds:itemID="{A507DE50-9571-420A-B97A-D696E6EB7C50}">
+  <ds:schemaRefs>
+    <ds:schemaRef ds:uri="http://schemas.openxmlformats.org/officeDocument/2006/bibliography"/>
+  </ds:schemaRefs>
+</ds:datastoreItem>
 </file>
</xml_diff>

<commit_message>
doc(word): mise a jour de la TDM
</commit_message>
<xml_diff>
--- a/Doc/Christopher_Ristic_Rapport.docx
+++ b/Doc/Christopher_Ristic_Rapport.docx
@@ -1,6 +1,6 @@
 
 <file path=word/document.xml><?xml version="1.0" encoding="utf-8"?>
-<w:document xmlns:wpc="http://schemas.microsoft.com/office/word/2010/wordprocessingCanvas" xmlns:cx="http://schemas.microsoft.com/office/drawing/2014/chartex" xmlns:cx1="http://schemas.microsoft.com/office/drawing/2015/9/8/chartex" xmlns:cx2="http://schemas.microsoft.com/office/drawing/2015/10/21/chartex" xmlns:cx3="http://schemas.microsoft.com/office/drawing/2016/5/9/chartex" xmlns:cx4="http://schemas.microsoft.com/office/drawing/2016/5/10/chartex" xmlns:cx5="http://schemas.microsoft.com/office/drawing/2016/5/11/chartex" xmlns:cx6="http://schemas.microsoft.com/office/drawing/2016/5/12/chartex" xmlns:cx7="http://schemas.microsoft.com/office/drawing/2016/5/13/chartex" xmlns:cx8="http://schemas.microsoft.com/office/drawing/2016/5/14/chartex" xmlns:mc="http://schemas.openxmlformats.org/markup-compatibility/2006" xmlns:aink="http://schemas.microsoft.com/office/drawing/2016/ink" xmlns:am3d="http://schemas.microsoft.com/office/drawing/2017/model3d" xmlns:o="urn:schemas-microsoft-com:office:office" xmlns:oel="http://schemas.microsoft.com/office/2019/extlst" xmlns:r="http://schemas.openxmlformats.org/officeDocument/2006/relationships" xmlns:m="http://schemas.openxmlformats.org/officeDocument/2006/math" xmlns:v="urn:schemas-microsoft-com:vml" xmlns:wp14="http://schemas.microsoft.com/office/word/2010/wordprocessingDrawing" xmlns:wp="http://schemas.openxmlformats.org/drawingml/2006/wordprocessingDrawing" xmlns:w10="urn:schemas-microsoft-com:office:word" xmlns:w="http://schemas.openxmlformats.org/wordprocessingml/2006/main" xmlns:w14="http://schemas.microsoft.com/office/word/2010/wordml" xmlns:w15="http://schemas.microsoft.com/office/word/2012/wordml" xmlns:w16cex="http://schemas.microsoft.com/office/word/2018/wordml/cex" xmlns:w16cid="http://schemas.microsoft.com/office/word/2016/wordml/cid" xmlns:w16="http://schemas.microsoft.com/office/word/2018/wordml" xmlns:w16du="http://schemas.microsoft.com/office/word/2023/wordml/word16du" xmlns:w16sdtdh="http://schemas.microsoft.com/office/word/2020/wordml/sdtdatahash" xmlns:w16sdtfl="http://schemas.microsoft.com/office/word/2024/wordml/sdtformatlock" xmlns:w16se="http://schemas.microsoft.com/office/word/2015/wordml/symex" xmlns:wpg="http://schemas.microsoft.com/office/word/2010/wordprocessingGroup" xmlns:wpi="http://schemas.microsoft.com/office/word/2010/wordprocessingInk" xmlns:wne="http://schemas.microsoft.com/office/word/2006/wordml" xmlns:wps="http://schemas.microsoft.com/office/word/2010/wordprocessingShape" mc:Ignorable="w14 w15 w16se w16cid w16 w16cex w16sdtdh w16sdtfl w16du wp14">
+<w:document xmlns:wpc="http://schemas.microsoft.com/office/word/2010/wordprocessingCanvas" xmlns:cx="http://schemas.microsoft.com/office/drawing/2014/chartex" xmlns:cx1="http://schemas.microsoft.com/office/drawing/2015/9/8/chartex" xmlns:cx2="http://schemas.microsoft.com/office/drawing/2015/10/21/chartex" xmlns:cx3="http://schemas.microsoft.com/office/drawing/2016/5/9/chartex" xmlns:cx4="http://schemas.microsoft.com/office/drawing/2016/5/10/chartex" xmlns:cx5="http://schemas.microsoft.com/office/drawing/2016/5/11/chartex" xmlns:cx6="http://schemas.microsoft.com/office/drawing/2016/5/12/chartex" xmlns:cx7="http://schemas.microsoft.com/office/drawing/2016/5/13/chartex" xmlns:cx8="http://schemas.microsoft.com/office/drawing/2016/5/14/chartex" xmlns:mc="http://schemas.openxmlformats.org/markup-compatibility/2006" xmlns:aink="http://schemas.microsoft.com/office/drawing/2016/ink" xmlns:am3d="http://schemas.microsoft.com/office/drawing/2017/model3d" xmlns:o="urn:schemas-microsoft-com:office:office" xmlns:oel="http://schemas.microsoft.com/office/2019/extlst" xmlns:r="http://schemas.openxmlformats.org/officeDocument/2006/relationships" xmlns:m="http://schemas.openxmlformats.org/officeDocument/2006/math" xmlns:v="urn:schemas-microsoft-com:vml" xmlns:wp14="http://schemas.microsoft.com/office/word/2010/wordprocessingDrawing" xmlns:wp="http://schemas.openxmlformats.org/drawingml/2006/wordprocessingDrawing" xmlns:w10="urn:schemas-microsoft-com:office:word" xmlns:w="http://schemas.openxmlformats.org/wordprocessingml/2006/main" xmlns:w14="http://schemas.microsoft.com/office/word/2010/wordml" xmlns:w15="http://schemas.microsoft.com/office/word/2012/wordml" xmlns:w16cex="http://schemas.microsoft.com/office/word/2018/wordml/cex" xmlns:w16cid="http://schemas.microsoft.com/office/word/2016/wordml/cid" xmlns:w16="http://schemas.microsoft.com/office/word/2018/wordml" xmlns:w16sdtdh="http://schemas.microsoft.com/office/word/2020/wordml/sdtdatahash" xmlns:w16se="http://schemas.microsoft.com/office/word/2015/wordml/symex" xmlns:wpg="http://schemas.microsoft.com/office/word/2010/wordprocessingGroup" xmlns:wpi="http://schemas.microsoft.com/office/word/2010/wordprocessingInk" xmlns:wne="http://schemas.microsoft.com/office/word/2006/wordml" xmlns:wps="http://schemas.microsoft.com/office/word/2010/wordprocessingShape" mc:Ignorable="w14 w15 w16se w16cid w16 w16cex w16sdtdh wp14">
   <w:body>
     <w:p>
       <w:pPr>
@@ -9,11 +9,20 @@
           <w:bottom w:val="single" w:sz="8" w:space="4" w:color="4F81BD"/>
         </w:pBdr>
         <w:spacing w:line="259" w:lineRule="auto"/>
-      </w:pPr>
-      <w:r>
+        <w:rPr>
+          <w:lang w:val="en-US"/>
+        </w:rPr>
+      </w:pPr>
+      <w:r>
+        <w:rPr>
+          <w:lang w:val="en-US"/>
+        </w:rPr>
         <w:t>P_</w:t>
       </w:r>
       <w:r>
+        <w:rPr>
+          <w:lang w:val="en-US"/>
+        </w:rPr>
         <w:t>FUN</w:t>
       </w:r>
     </w:p>
@@ -24,49 +33,17 @@
         <w:rPr>
           <w:sz w:val="48"/>
           <w:szCs w:val="48"/>
+          <w:lang w:val="en-US"/>
         </w:rPr>
       </w:pPr>
       <w:r>
         <w:rPr>
           <w:sz w:val="48"/>
           <w:szCs w:val="48"/>
+          <w:lang w:val="en-US"/>
         </w:rPr>
-        <w:t xml:space="preserve">Plot </w:t>
-      </w:r>
-      <w:proofErr w:type="spellStart"/>
-      <w:r>
-        <w:rPr>
-          <w:sz w:val="48"/>
-          <w:szCs w:val="48"/>
-        </w:rPr>
-        <w:t>those</w:t>
-      </w:r>
-      <w:proofErr w:type="spellEnd"/>
-      <w:r>
-        <w:rPr>
-          <w:sz w:val="48"/>
-          <w:szCs w:val="48"/>
-        </w:rPr>
-        <w:t xml:space="preserve"> </w:t>
-      </w:r>
-      <w:proofErr w:type="spellStart"/>
-      <w:proofErr w:type="gramStart"/>
-      <w:r>
-        <w:rPr>
-          <w:sz w:val="48"/>
-          <w:szCs w:val="48"/>
-        </w:rPr>
-        <w:t>lines</w:t>
-      </w:r>
-      <w:proofErr w:type="spellEnd"/>
-      <w:r>
-        <w:rPr>
-          <w:sz w:val="48"/>
-          <w:szCs w:val="48"/>
-        </w:rPr>
-        <w:t>!</w:t>
-      </w:r>
-      <w:proofErr w:type="gramEnd"/>
+        <w:t>Plot those lines!</w:t>
+      </w:r>
     </w:p>
     <w:p>
       <w:pPr>
@@ -185,7 +162,7 @@
         </w:rPr>
         <w:fldChar w:fldCharType="separate"/>
       </w:r>
-      <w:hyperlink w:anchor="_Toc210844984" w:history="1">
+      <w:hyperlink w:anchor="_Toc212636051" w:history="1">
         <w:r>
           <w:rPr>
             <w:rStyle w:val="Lienhypertexte"/>
@@ -234,7 +211,7 @@
             <w:noProof/>
             <w:webHidden/>
           </w:rPr>
-          <w:instrText xml:space="preserve"> PAGEREF _Toc210844984 \h </w:instrText>
+          <w:instrText xml:space="preserve"> PAGEREF _Toc212636051 \h </w:instrText>
         </w:r>
         <w:r>
           <w:rPr>
@@ -283,7 +260,7 @@
           <w14:ligatures w14:val="standardContextual"/>
         </w:rPr>
       </w:pPr>
-      <w:hyperlink w:anchor="_Toc210844985" w:history="1">
+      <w:hyperlink w:anchor="_Toc212636052" w:history="1">
         <w:r>
           <w:rPr>
             <w:rStyle w:val="Lienhypertexte"/>
@@ -330,7 +307,7 @@
             <w:noProof/>
             <w:webHidden/>
           </w:rPr>
-          <w:instrText xml:space="preserve"> PAGEREF _Toc210844985 \h </w:instrText>
+          <w:instrText xml:space="preserve"> PAGEREF _Toc212636052 \h </w:instrText>
         </w:r>
         <w:r>
           <w:rPr>
@@ -379,7 +356,7 @@
           <w14:ligatures w14:val="standardContextual"/>
         </w:rPr>
       </w:pPr>
-      <w:hyperlink w:anchor="_Toc210844986" w:history="1">
+      <w:hyperlink w:anchor="_Toc212636053" w:history="1">
         <w:r>
           <w:rPr>
             <w:rStyle w:val="Lienhypertexte"/>
@@ -426,7 +403,7 @@
             <w:noProof/>
             <w:webHidden/>
           </w:rPr>
-          <w:instrText xml:space="preserve"> PAGEREF _Toc210844986 \h </w:instrText>
+          <w:instrText xml:space="preserve"> PAGEREF _Toc212636053 \h </w:instrText>
         </w:r>
         <w:r>
           <w:rPr>
@@ -477,7 +454,7 @@
           <w14:ligatures w14:val="standardContextual"/>
         </w:rPr>
       </w:pPr>
-      <w:hyperlink w:anchor="_Toc210844987" w:history="1">
+      <w:hyperlink w:anchor="_Toc212636054" w:history="1">
         <w:r>
           <w:rPr>
             <w:rStyle w:val="Lienhypertexte"/>
@@ -526,7 +503,7 @@
             <w:noProof/>
             <w:webHidden/>
           </w:rPr>
-          <w:instrText xml:space="preserve"> PAGEREF _Toc210844987 \h </w:instrText>
+          <w:instrText xml:space="preserve"> PAGEREF _Toc212636054 \h </w:instrText>
         </w:r>
         <w:r>
           <w:rPr>
@@ -577,7 +554,7 @@
           <w14:ligatures w14:val="standardContextual"/>
         </w:rPr>
       </w:pPr>
-      <w:hyperlink w:anchor="_Toc210844988" w:history="1">
+      <w:hyperlink w:anchor="_Toc212636055" w:history="1">
         <w:r>
           <w:rPr>
             <w:rStyle w:val="Lienhypertexte"/>
@@ -626,7 +603,7 @@
             <w:noProof/>
             <w:webHidden/>
           </w:rPr>
-          <w:instrText xml:space="preserve"> PAGEREF _Toc210844988 \h </w:instrText>
+          <w:instrText xml:space="preserve"> PAGEREF _Toc212636055 \h </w:instrText>
         </w:r>
         <w:r>
           <w:rPr>
@@ -677,7 +654,7 @@
           <w14:ligatures w14:val="standardContextual"/>
         </w:rPr>
       </w:pPr>
-      <w:hyperlink w:anchor="_Toc210844989" w:history="1">
+      <w:hyperlink w:anchor="_Toc212636056" w:history="1">
         <w:r>
           <w:rPr>
             <w:rStyle w:val="Lienhypertexte"/>
@@ -726,7 +703,7 @@
             <w:noProof/>
             <w:webHidden/>
           </w:rPr>
-          <w:instrText xml:space="preserve"> PAGEREF _Toc210844989 \h </w:instrText>
+          <w:instrText xml:space="preserve"> PAGEREF _Toc212636056 \h </w:instrText>
         </w:r>
         <w:r>
           <w:rPr>
@@ -777,7 +754,7 @@
           <w14:ligatures w14:val="standardContextual"/>
         </w:rPr>
       </w:pPr>
-      <w:hyperlink w:anchor="_Toc210844990" w:history="1">
+      <w:hyperlink w:anchor="_Toc212636057" w:history="1">
         <w:r>
           <w:rPr>
             <w:rStyle w:val="Lienhypertexte"/>
@@ -826,7 +803,7 @@
             <w:noProof/>
             <w:webHidden/>
           </w:rPr>
-          <w:instrText xml:space="preserve"> PAGEREF _Toc210844990 \h </w:instrText>
+          <w:instrText xml:space="preserve"> PAGEREF _Toc212636057 \h </w:instrText>
         </w:r>
         <w:r>
           <w:rPr>
@@ -877,7 +854,7 @@
           <w14:ligatures w14:val="standardContextual"/>
         </w:rPr>
       </w:pPr>
-      <w:hyperlink w:anchor="_Toc210844991" w:history="1">
+      <w:hyperlink w:anchor="_Toc212636058" w:history="1">
         <w:r>
           <w:rPr>
             <w:rStyle w:val="Lienhypertexte"/>
@@ -926,7 +903,7 @@
             <w:noProof/>
             <w:webHidden/>
           </w:rPr>
-          <w:instrText xml:space="preserve"> PAGEREF _Toc210844991 \h </w:instrText>
+          <w:instrText xml:space="preserve"> PAGEREF _Toc212636058 \h </w:instrText>
         </w:r>
         <w:r>
           <w:rPr>
@@ -977,7 +954,7 @@
           <w14:ligatures w14:val="standardContextual"/>
         </w:rPr>
       </w:pPr>
-      <w:hyperlink w:anchor="_Toc210844992" w:history="1">
+      <w:hyperlink w:anchor="_Toc212636059" w:history="1">
         <w:r>
           <w:rPr>
             <w:rStyle w:val="Lienhypertexte"/>
@@ -1026,7 +1003,7 @@
             <w:noProof/>
             <w:webHidden/>
           </w:rPr>
-          <w:instrText xml:space="preserve"> PAGEREF _Toc210844992 \h </w:instrText>
+          <w:instrText xml:space="preserve"> PAGEREF _Toc212636059 \h </w:instrText>
         </w:r>
         <w:r>
           <w:rPr>
@@ -1075,7 +1052,7 @@
           <w14:ligatures w14:val="standardContextual"/>
         </w:rPr>
       </w:pPr>
-      <w:hyperlink w:anchor="_Toc210844993" w:history="1">
+      <w:hyperlink w:anchor="_Toc212636060" w:history="1">
         <w:r>
           <w:rPr>
             <w:rStyle w:val="Lienhypertexte"/>
@@ -1122,7 +1099,7 @@
             <w:noProof/>
             <w:webHidden/>
           </w:rPr>
-          <w:instrText xml:space="preserve"> PAGEREF _Toc210844993 \h </w:instrText>
+          <w:instrText xml:space="preserve"> PAGEREF _Toc212636060 \h </w:instrText>
         </w:r>
         <w:r>
           <w:rPr>
@@ -1207,7 +1184,7 @@
       <w:pPr>
         <w:pStyle w:val="Titre1"/>
       </w:pPr>
-      <w:bookmarkStart w:id="1" w:name="_Toc210844984"/>
+      <w:bookmarkStart w:id="1" w:name="_Toc212636051"/>
       <w:r>
         <w:lastRenderedPageBreak/>
         <w:t>Introduction</w:t>
@@ -1230,7 +1207,7 @@
       <w:pPr>
         <w:pStyle w:val="Titre2"/>
       </w:pPr>
-      <w:bookmarkStart w:id="2" w:name="_Toc210844985"/>
+      <w:bookmarkStart w:id="2" w:name="_Toc212636052"/>
       <w:r>
         <w:t>Objectif</w:t>
       </w:r>
@@ -1334,7 +1311,7 @@
       <w:pPr>
         <w:pStyle w:val="Titre2"/>
       </w:pPr>
-      <w:bookmarkStart w:id="3" w:name="_Toc210844986"/>
+      <w:bookmarkStart w:id="3" w:name="_Toc212636053"/>
       <w:r>
         <w:t>Objectif pédagogique</w:t>
       </w:r>
@@ -1368,7 +1345,7 @@
       <w:pPr>
         <w:pStyle w:val="Titre1"/>
       </w:pPr>
-      <w:bookmarkStart w:id="4" w:name="_Toc210844987"/>
+      <w:bookmarkStart w:id="4" w:name="_Toc212636054"/>
       <w:r>
         <w:t>Planification</w:t>
       </w:r>
@@ -1693,7 +1670,7 @@
       <w:pPr>
         <w:pStyle w:val="Titre1"/>
       </w:pPr>
-      <w:bookmarkStart w:id="5" w:name="_Toc210844988"/>
+      <w:bookmarkStart w:id="5" w:name="_Toc212636055"/>
       <w:r>
         <w:t>Maquette haute-fidélité</w:t>
       </w:r>
@@ -1802,6 +1779,9 @@
         </w:rPr>
       </w:pPr>
       <w:r>
+        <w:rPr>
+          <w:noProof/>
+        </w:rPr>
         <w:drawing>
           <wp:anchor distT="0" distB="0" distL="114300" distR="114300" simplePos="0" relativeHeight="251661312" behindDoc="0" locked="0" layoutInCell="1" allowOverlap="1" wp14:anchorId="5E2EB8D8" wp14:editId="0A47D887">
             <wp:simplePos x="0" y="0"/>
@@ -1894,6 +1874,9 @@
         </w:numPr>
       </w:pPr>
       <w:r>
+        <w:rPr>
+          <w:noProof/>
+        </w:rPr>
         <w:drawing>
           <wp:anchor distT="0" distB="0" distL="114300" distR="114300" simplePos="0" relativeHeight="251662336" behindDoc="0" locked="0" layoutInCell="1" allowOverlap="1" wp14:anchorId="49CA4750" wp14:editId="2EAA6808">
             <wp:simplePos x="0" y="0"/>
@@ -1982,6 +1965,9 @@
         </w:numPr>
       </w:pPr>
       <w:r>
+        <w:rPr>
+          <w:noProof/>
+        </w:rPr>
         <w:drawing>
           <wp:anchor distT="0" distB="0" distL="114300" distR="114300" simplePos="0" relativeHeight="251663360" behindDoc="0" locked="0" layoutInCell="1" allowOverlap="1" wp14:anchorId="52D13987" wp14:editId="0EDB9604">
             <wp:simplePos x="0" y="0"/>
@@ -2065,7 +2051,7 @@
       <w:pPr>
         <w:pStyle w:val="Titre1"/>
       </w:pPr>
-      <w:bookmarkStart w:id="6" w:name="_Toc210844989"/>
+      <w:bookmarkStart w:id="6" w:name="_Toc212636056"/>
       <w:r>
         <w:lastRenderedPageBreak/>
         <w:t>Rapport de tests</w:t>
@@ -2089,6 +2075,9 @@
         <w:ind w:left="4395" w:hanging="3828"/>
       </w:pPr>
       <w:r>
+        <w:rPr>
+          <w:noProof/>
+        </w:rPr>
         <w:drawing>
           <wp:anchor distT="0" distB="0" distL="114300" distR="114300" simplePos="0" relativeHeight="251664384" behindDoc="1" locked="0" layoutInCell="1" allowOverlap="1" wp14:anchorId="0770167F" wp14:editId="058EB679">
             <wp:simplePos x="0" y="0"/>
@@ -2156,8 +2145,11 @@
         <w:spacing w:before="240"/>
       </w:pPr>
       <w:r>
+        <w:rPr>
+          <w:noProof/>
+        </w:rPr>
         <w:drawing>
-          <wp:anchor distT="0" distB="0" distL="114300" distR="114300" simplePos="0" relativeHeight="251665408" behindDoc="0" locked="0" layoutInCell="1" allowOverlap="1" wp14:anchorId="2F46E21F" wp14:editId="02D2F9D3">
+          <wp:anchor distT="0" distB="0" distL="114300" distR="114300" simplePos="0" relativeHeight="251665408" behindDoc="0" locked="0" layoutInCell="1" allowOverlap="1" wp14:anchorId="2F46E21F" wp14:editId="17256C8E">
             <wp:simplePos x="0" y="0"/>
             <wp:positionH relativeFrom="margin">
               <wp:posOffset>1274445</wp:posOffset>
@@ -2293,6 +2285,9 @@
         </w:tabs>
       </w:pPr>
       <w:r>
+        <w:rPr>
+          <w:noProof/>
+        </w:rPr>
         <w:lastRenderedPageBreak/>
         <mc:AlternateContent>
           <mc:Choice Requires="wps">
@@ -2361,7 +2356,7 @@
               </wp:anchor>
             </w:drawing>
           </mc:Choice>
-          <mc:Fallback>
+          <mc:Fallback xmlns:w16sdtfl="http://schemas.microsoft.com/office/word/2024/wordml/sdtformatlock" xmlns:w16du="http://schemas.microsoft.com/office/word/2023/wordml/word16du">
             <w:pict>
               <v:rect w14:anchorId="4772474C" id="Rectangle 1" o:spid="_x0000_s1026" style="position:absolute;margin-left:194.2pt;margin-top:64.8pt;width:78.1pt;height:8.85pt;z-index:251676672;visibility:visible;mso-wrap-style:square;mso-width-percent:0;mso-height-percent:0;mso-wrap-distance-left:9pt;mso-wrap-distance-top:0;mso-wrap-distance-right:9pt;mso-wrap-distance-bottom:0;mso-position-horizontal:absolute;mso-position-horizontal-relative:text;mso-position-vertical:absolute;mso-position-vertical-relative:text;mso-width-percent:0;mso-height-percent:0;mso-width-relative:margin;mso-height-relative:margin;v-text-anchor:middle" o:gfxdata="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" filled="f" strokecolor="#e00" strokeweight="1.25pt"/>
             </w:pict>
@@ -2369,6 +2364,9 @@
         </mc:AlternateContent>
       </w:r>
       <w:r>
+        <w:rPr>
+          <w:noProof/>
+        </w:rPr>
         <mc:AlternateContent>
           <mc:Choice Requires="wps">
             <w:drawing>
@@ -2433,7 +2431,7 @@
               </wp:anchor>
             </w:drawing>
           </mc:Choice>
-          <mc:Fallback>
+          <mc:Fallback xmlns:w16sdtfl="http://schemas.microsoft.com/office/word/2024/wordml/sdtformatlock" xmlns:w16du="http://schemas.microsoft.com/office/word/2023/wordml/word16du">
             <w:pict>
               <v:rect w14:anchorId="584D8F05" id="Rectangle 1" o:spid="_x0000_s1026" style="position:absolute;margin-left:177.7pt;margin-top:47.55pt;width:61.2pt;height:6.4pt;z-index:251668480;visibility:visible;mso-wrap-style:square;mso-height-percent:0;mso-wrap-distance-left:9pt;mso-wrap-distance-top:0;mso-wrap-distance-right:9pt;mso-wrap-distance-bottom:0;mso-position-horizontal:absolute;mso-position-horizontal-relative:text;mso-position-vertical:absolute;mso-position-vertical-relative:text;mso-height-percent:0;mso-height-relative:margin;v-text-anchor:middle" o:gfxdata="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" filled="f" strokecolor="#e00" strokeweight="1.25pt"/>
             </w:pict>
@@ -2441,6 +2439,9 @@
         </mc:AlternateContent>
       </w:r>
       <w:r>
+        <w:rPr>
+          <w:noProof/>
+        </w:rPr>
         <mc:AlternateContent>
           <mc:Choice Requires="wps">
             <w:drawing>
@@ -2508,7 +2509,7 @@
               </wp:anchor>
             </w:drawing>
           </mc:Choice>
-          <mc:Fallback>
+          <mc:Fallback xmlns:w16sdtfl="http://schemas.microsoft.com/office/word/2024/wordml/sdtformatlock" xmlns:w16du="http://schemas.microsoft.com/office/word/2023/wordml/word16du">
             <w:pict>
               <v:rect w14:anchorId="0ED01C9B" id="Rectangle 1" o:spid="_x0000_s1026" style="position:absolute;margin-left:97.65pt;margin-top:243.45pt;width:39.55pt;height:6.8pt;z-index:251670528;visibility:visible;mso-wrap-style:square;mso-width-percent:0;mso-height-percent:0;mso-wrap-distance-left:9pt;mso-wrap-distance-top:0;mso-wrap-distance-right:9pt;mso-wrap-distance-bottom:0;mso-position-horizontal:absolute;mso-position-horizontal-relative:text;mso-position-vertical:absolute;mso-position-vertical-relative:text;mso-width-percent:0;mso-height-percent:0;mso-width-relative:margin;mso-height-relative:margin;v-text-anchor:middle" o:gfxdata="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" filled="f" strokecolor="#e00" strokeweight="1.25pt"/>
             </w:pict>
@@ -2516,8 +2517,11 @@
         </mc:AlternateContent>
       </w:r>
       <w:r>
+        <w:rPr>
+          <w:noProof/>
+        </w:rPr>
         <w:drawing>
-          <wp:anchor distT="0" distB="0" distL="114300" distR="114300" simplePos="0" relativeHeight="251667456" behindDoc="0" locked="0" layoutInCell="1" allowOverlap="1" wp14:anchorId="6733AAEB" wp14:editId="33C0B455">
+          <wp:anchor distT="0" distB="0" distL="114300" distR="114300" simplePos="0" relativeHeight="251667456" behindDoc="0" locked="0" layoutInCell="1" allowOverlap="1" wp14:anchorId="6733AAEB" wp14:editId="35A1B18E">
             <wp:simplePos x="0" y="0"/>
             <wp:positionH relativeFrom="margin">
               <wp:align>center</wp:align>
@@ -2592,6 +2596,9 @@
         </w:tabs>
       </w:pPr>
       <w:r>
+        <w:rPr>
+          <w:noProof/>
+        </w:rPr>
         <mc:AlternateContent>
           <mc:Choice Requires="wps">
             <w:drawing>
@@ -2659,7 +2666,7 @@
               </wp:anchor>
             </w:drawing>
           </mc:Choice>
-          <mc:Fallback>
+          <mc:Fallback xmlns:w16sdtfl="http://schemas.microsoft.com/office/word/2024/wordml/sdtformatlock" xmlns:w16du="http://schemas.microsoft.com/office/word/2023/wordml/word16du">
             <w:pict>
               <v:rect w14:anchorId="70F2A260" id="Rectangle 1" o:spid="_x0000_s1026" style="position:absolute;margin-left:341.2pt;margin-top:273.65pt;width:24.4pt;height:8.45pt;z-index:251672576;visibility:visible;mso-wrap-style:square;mso-width-percent:0;mso-height-percent:0;mso-wrap-distance-left:9pt;mso-wrap-distance-top:0;mso-wrap-distance-right:9pt;mso-wrap-distance-bottom:0;mso-position-horizontal:absolute;mso-position-horizontal-relative:text;mso-position-vertical:absolute;mso-position-vertical-relative:text;mso-width-percent:0;mso-height-percent:0;mso-width-relative:margin;mso-height-relative:margin;v-text-anchor:middle" o:gfxdata="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" filled="f" strokecolor="#e00" strokeweight="1.25pt"/>
             </w:pict>
@@ -2667,6 +2674,9 @@
         </mc:AlternateContent>
       </w:r>
       <w:r>
+        <w:rPr>
+          <w:noProof/>
+        </w:rPr>
         <mc:AlternateContent>
           <mc:Choice Requires="wps">
             <w:drawing>
@@ -2734,7 +2744,7 @@
               </wp:anchor>
             </w:drawing>
           </mc:Choice>
-          <mc:Fallback>
+          <mc:Fallback xmlns:w16sdtfl="http://schemas.microsoft.com/office/word/2024/wordml/sdtformatlock" xmlns:w16du="http://schemas.microsoft.com/office/word/2023/wordml/word16du">
             <w:pict>
               <v:rect w14:anchorId="0D829427" id="Rectangle 1" o:spid="_x0000_s1026" style="position:absolute;margin-left:83.9pt;margin-top:245.1pt;width:24.4pt;height:8.45pt;z-index:251674624;visibility:visible;mso-wrap-style:square;mso-width-percent:0;mso-height-percent:0;mso-wrap-distance-left:9pt;mso-wrap-distance-top:0;mso-wrap-distance-right:9pt;mso-wrap-distance-bottom:0;mso-position-horizontal:absolute;mso-position-horizontal-relative:text;mso-position-vertical:absolute;mso-position-vertical-relative:text;mso-width-percent:0;mso-height-percent:0;mso-width-relative:margin;mso-height-relative:margin;v-text-anchor:middle" o:gfxdata="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" filled="f" strokecolor="#e00" strokeweight="1.25pt"/>
             </w:pict>
@@ -2756,8 +2766,11 @@
         </w:tabs>
       </w:pPr>
       <w:r>
+        <w:rPr>
+          <w:noProof/>
+        </w:rPr>
         <w:drawing>
-          <wp:anchor distT="0" distB="0" distL="114300" distR="114300" simplePos="0" relativeHeight="251666432" behindDoc="0" locked="0" layoutInCell="1" allowOverlap="1" wp14:anchorId="42619CFE" wp14:editId="1D612B24">
+          <wp:anchor distT="0" distB="0" distL="114300" distR="114300" simplePos="0" relativeHeight="251666432" behindDoc="0" locked="0" layoutInCell="1" allowOverlap="1" wp14:anchorId="42619CFE" wp14:editId="65457B8D">
             <wp:simplePos x="0" y="0"/>
             <wp:positionH relativeFrom="margin">
               <wp:align>center</wp:align>
@@ -2817,7 +2830,7 @@
       <w:pPr>
         <w:pStyle w:val="Titre1"/>
       </w:pPr>
-      <w:bookmarkStart w:id="7" w:name="_Toc210844990"/>
+      <w:bookmarkStart w:id="7" w:name="_Toc212636057"/>
       <w:r>
         <w:t>Journal de travail</w:t>
       </w:r>
@@ -2853,7 +2866,7 @@
       <w:pPr>
         <w:pStyle w:val="Titre1"/>
       </w:pPr>
-      <w:bookmarkStart w:id="8" w:name="_Toc210844991"/>
+      <w:bookmarkStart w:id="8" w:name="_Toc212636058"/>
       <w:r>
         <w:lastRenderedPageBreak/>
         <w:t>Usage de l’IA</w:t>
@@ -2884,7 +2897,7 @@
       <w:pPr>
         <w:pStyle w:val="Titre1"/>
       </w:pPr>
-      <w:bookmarkStart w:id="9" w:name="_Toc210844992"/>
+      <w:bookmarkStart w:id="9" w:name="_Toc212636059"/>
       <w:r>
         <w:t>Conclusion</w:t>
       </w:r>
@@ -2895,10 +2908,7 @@
         <w:pStyle w:val="Corpsdetexte"/>
       </w:pPr>
       <w:r>
-        <w:t xml:space="preserve">Le projet </w:t>
-      </w:r>
-      <w:r>
-        <w:t>a permis de concevoir un logiciel capable d’afficher des séries temporelles météorologiques de manière claire et flexible.</w:t>
+        <w:t>Le projet a permis de concevoir un logiciel capable d’afficher des séries temporelles météorologiques de manière claire et flexible.</w:t>
       </w:r>
       <w:r>
         <w:t xml:space="preserve"> </w:t>
@@ -2953,7 +2963,7 @@
       <w:pPr>
         <w:pStyle w:val="Titre2"/>
       </w:pPr>
-      <w:bookmarkStart w:id="10" w:name="_Toc210844993"/>
+      <w:bookmarkStart w:id="10" w:name="_Toc212636060"/>
       <w:r>
         <w:t>Conclusion personnelle</w:t>
       </w:r>
@@ -3008,7 +3018,7 @@
 </file>
 
 <file path=word/endnotes.xml><?xml version="1.0" encoding="utf-8"?>
-<w:endnotes xmlns:wpc="http://schemas.microsoft.com/office/word/2010/wordprocessingCanvas" xmlns:cx="http://schemas.microsoft.com/office/drawing/2014/chartex" xmlns:cx1="http://schemas.microsoft.com/office/drawing/2015/9/8/chartex" xmlns:cx2="http://schemas.microsoft.com/office/drawing/2015/10/21/chartex" xmlns:cx3="http://schemas.microsoft.com/office/drawing/2016/5/9/chartex" xmlns:cx4="http://schemas.microsoft.com/office/drawing/2016/5/10/chartex" xmlns:cx5="http://schemas.microsoft.com/office/drawing/2016/5/11/chartex" xmlns:cx6="http://schemas.microsoft.com/office/drawing/2016/5/12/chartex" xmlns:cx7="http://schemas.microsoft.com/office/drawing/2016/5/13/chartex" xmlns:cx8="http://schemas.microsoft.com/office/drawing/2016/5/14/chartex" xmlns:mc="http://schemas.openxmlformats.org/markup-compatibility/2006" xmlns:aink="http://schemas.microsoft.com/office/drawing/2016/ink" xmlns:am3d="http://schemas.microsoft.com/office/drawing/2017/model3d" xmlns:o="urn:schemas-microsoft-com:office:office" xmlns:oel="http://schemas.microsoft.com/office/2019/extlst" xmlns:r="http://schemas.openxmlformats.org/officeDocument/2006/relationships" xmlns:m="http://schemas.openxmlformats.org/officeDocument/2006/math" xmlns:v="urn:schemas-microsoft-com:vml" xmlns:wp14="http://schemas.microsoft.com/office/word/2010/wordprocessingDrawing" xmlns:wp="http://schemas.openxmlformats.org/drawingml/2006/wordprocessingDrawing" xmlns:w10="urn:schemas-microsoft-com:office:word" xmlns:w="http://schemas.openxmlformats.org/wordprocessingml/2006/main" xmlns:w14="http://schemas.microsoft.com/office/word/2010/wordml" xmlns:w15="http://schemas.microsoft.com/office/word/2012/wordml" xmlns:w16cex="http://schemas.microsoft.com/office/word/2018/wordml/cex" xmlns:w16cid="http://schemas.microsoft.com/office/word/2016/wordml/cid" xmlns:w16="http://schemas.microsoft.com/office/word/2018/wordml" xmlns:w16du="http://schemas.microsoft.com/office/word/2023/wordml/word16du" xmlns:w16sdtdh="http://schemas.microsoft.com/office/word/2020/wordml/sdtdatahash" xmlns:w16sdtfl="http://schemas.microsoft.com/office/word/2024/wordml/sdtformatlock" xmlns:w16se="http://schemas.microsoft.com/office/word/2015/wordml/symex" xmlns:wpg="http://schemas.microsoft.com/office/word/2010/wordprocessingGroup" xmlns:wpi="http://schemas.microsoft.com/office/word/2010/wordprocessingInk" xmlns:wne="http://schemas.microsoft.com/office/word/2006/wordml" xmlns:wps="http://schemas.microsoft.com/office/word/2010/wordprocessingShape" mc:Ignorable="w14 w15 w16se w16cid w16 w16cex w16sdtdh w16sdtfl w16du wp14">
+<w:endnotes xmlns:wpc="http://schemas.microsoft.com/office/word/2010/wordprocessingCanvas" xmlns:cx="http://schemas.microsoft.com/office/drawing/2014/chartex" xmlns:cx1="http://schemas.microsoft.com/office/drawing/2015/9/8/chartex" xmlns:cx2="http://schemas.microsoft.com/office/drawing/2015/10/21/chartex" xmlns:cx3="http://schemas.microsoft.com/office/drawing/2016/5/9/chartex" xmlns:cx4="http://schemas.microsoft.com/office/drawing/2016/5/10/chartex" xmlns:cx5="http://schemas.microsoft.com/office/drawing/2016/5/11/chartex" xmlns:cx6="http://schemas.microsoft.com/office/drawing/2016/5/12/chartex" xmlns:cx7="http://schemas.microsoft.com/office/drawing/2016/5/13/chartex" xmlns:cx8="http://schemas.microsoft.com/office/drawing/2016/5/14/chartex" xmlns:mc="http://schemas.openxmlformats.org/markup-compatibility/2006" xmlns:aink="http://schemas.microsoft.com/office/drawing/2016/ink" xmlns:am3d="http://schemas.microsoft.com/office/drawing/2017/model3d" xmlns:o="urn:schemas-microsoft-com:office:office" xmlns:oel="http://schemas.microsoft.com/office/2019/extlst" xmlns:r="http://schemas.openxmlformats.org/officeDocument/2006/relationships" xmlns:m="http://schemas.openxmlformats.org/officeDocument/2006/math" xmlns:v="urn:schemas-microsoft-com:vml" xmlns:wp14="http://schemas.microsoft.com/office/word/2010/wordprocessingDrawing" xmlns:wp="http://schemas.openxmlformats.org/drawingml/2006/wordprocessingDrawing" xmlns:w10="urn:schemas-microsoft-com:office:word" xmlns:w="http://schemas.openxmlformats.org/wordprocessingml/2006/main" xmlns:w14="http://schemas.microsoft.com/office/word/2010/wordml" xmlns:w15="http://schemas.microsoft.com/office/word/2012/wordml" xmlns:w16cex="http://schemas.microsoft.com/office/word/2018/wordml/cex" xmlns:w16cid="http://schemas.microsoft.com/office/word/2016/wordml/cid" xmlns:w16="http://schemas.microsoft.com/office/word/2018/wordml" xmlns:w16sdtdh="http://schemas.microsoft.com/office/word/2020/wordml/sdtdatahash" xmlns:w16se="http://schemas.microsoft.com/office/word/2015/wordml/symex" xmlns:wpg="http://schemas.microsoft.com/office/word/2010/wordprocessingGroup" xmlns:wpi="http://schemas.microsoft.com/office/word/2010/wordprocessingInk" xmlns:wne="http://schemas.microsoft.com/office/word/2006/wordml" xmlns:wps="http://schemas.microsoft.com/office/word/2010/wordprocessingShape" mc:Ignorable="w14 w15 w16se w16cid w16 w16cex w16sdtdh wp14">
   <w:endnote w:type="separator" w:id="-1">
     <w:p>
       <w:r>
@@ -3030,7 +3040,7 @@
 </file>
 
 <file path=word/footer1.xml><?xml version="1.0" encoding="utf-8"?>
-<w:ftr xmlns:wpc="http://schemas.microsoft.com/office/word/2010/wordprocessingCanvas" xmlns:cx="http://schemas.microsoft.com/office/drawing/2014/chartex" xmlns:cx1="http://schemas.microsoft.com/office/drawing/2015/9/8/chartex" xmlns:cx2="http://schemas.microsoft.com/office/drawing/2015/10/21/chartex" xmlns:cx3="http://schemas.microsoft.com/office/drawing/2016/5/9/chartex" xmlns:cx4="http://schemas.microsoft.com/office/drawing/2016/5/10/chartex" xmlns:cx5="http://schemas.microsoft.com/office/drawing/2016/5/11/chartex" xmlns:cx6="http://schemas.microsoft.com/office/drawing/2016/5/12/chartex" xmlns:cx7="http://schemas.microsoft.com/office/drawing/2016/5/13/chartex" xmlns:cx8="http://schemas.microsoft.com/office/drawing/2016/5/14/chartex" xmlns:mc="http://schemas.openxmlformats.org/markup-compatibility/2006" xmlns:aink="http://schemas.microsoft.com/office/drawing/2016/ink" xmlns:am3d="http://schemas.microsoft.com/office/drawing/2017/model3d" xmlns:o="urn:schemas-microsoft-com:office:office" xmlns:oel="http://schemas.microsoft.com/office/2019/extlst" xmlns:r="http://schemas.openxmlformats.org/officeDocument/2006/relationships" xmlns:m="http://schemas.openxmlformats.org/officeDocument/2006/math" xmlns:v="urn:schemas-microsoft-com:vml" xmlns:wp14="http://schemas.microsoft.com/office/word/2010/wordprocessingDrawing" xmlns:wp="http://schemas.openxmlformats.org/drawingml/2006/wordprocessingDrawing" xmlns:w10="urn:schemas-microsoft-com:office:word" xmlns:w="http://schemas.openxmlformats.org/wordprocessingml/2006/main" xmlns:w14="http://schemas.microsoft.com/office/word/2010/wordml" xmlns:w15="http://schemas.microsoft.com/office/word/2012/wordml" xmlns:w16cex="http://schemas.microsoft.com/office/word/2018/wordml/cex" xmlns:w16cid="http://schemas.microsoft.com/office/word/2016/wordml/cid" xmlns:w16="http://schemas.microsoft.com/office/word/2018/wordml" xmlns:w16du="http://schemas.microsoft.com/office/word/2023/wordml/word16du" xmlns:w16sdtdh="http://schemas.microsoft.com/office/word/2020/wordml/sdtdatahash" xmlns:w16sdtfl="http://schemas.microsoft.com/office/word/2024/wordml/sdtformatlock" xmlns:w16se="http://schemas.microsoft.com/office/word/2015/wordml/symex" xmlns:wpg="http://schemas.microsoft.com/office/word/2010/wordprocessingGroup" xmlns:wpi="http://schemas.microsoft.com/office/word/2010/wordprocessingInk" xmlns:wne="http://schemas.microsoft.com/office/word/2006/wordml" xmlns:wps="http://schemas.microsoft.com/office/word/2010/wordprocessingShape" mc:Ignorable="w14 w15 w16se w16cid w16 w16cex w16sdtdh w16sdtfl w16du wp14">
+<w:ftr xmlns:wpc="http://schemas.microsoft.com/office/word/2010/wordprocessingCanvas" xmlns:cx="http://schemas.microsoft.com/office/drawing/2014/chartex" xmlns:cx1="http://schemas.microsoft.com/office/drawing/2015/9/8/chartex" xmlns:cx2="http://schemas.microsoft.com/office/drawing/2015/10/21/chartex" xmlns:cx3="http://schemas.microsoft.com/office/drawing/2016/5/9/chartex" xmlns:cx4="http://schemas.microsoft.com/office/drawing/2016/5/10/chartex" xmlns:cx5="http://schemas.microsoft.com/office/drawing/2016/5/11/chartex" xmlns:cx6="http://schemas.microsoft.com/office/drawing/2016/5/12/chartex" xmlns:cx7="http://schemas.microsoft.com/office/drawing/2016/5/13/chartex" xmlns:cx8="http://schemas.microsoft.com/office/drawing/2016/5/14/chartex" xmlns:mc="http://schemas.openxmlformats.org/markup-compatibility/2006" xmlns:aink="http://schemas.microsoft.com/office/drawing/2016/ink" xmlns:am3d="http://schemas.microsoft.com/office/drawing/2017/model3d" xmlns:o="urn:schemas-microsoft-com:office:office" xmlns:oel="http://schemas.microsoft.com/office/2019/extlst" xmlns:r="http://schemas.openxmlformats.org/officeDocument/2006/relationships" xmlns:m="http://schemas.openxmlformats.org/officeDocument/2006/math" xmlns:v="urn:schemas-microsoft-com:vml" xmlns:wp14="http://schemas.microsoft.com/office/word/2010/wordprocessingDrawing" xmlns:wp="http://schemas.openxmlformats.org/drawingml/2006/wordprocessingDrawing" xmlns:w10="urn:schemas-microsoft-com:office:word" xmlns:w="http://schemas.openxmlformats.org/wordprocessingml/2006/main" xmlns:w14="http://schemas.microsoft.com/office/word/2010/wordml" xmlns:w15="http://schemas.microsoft.com/office/word/2012/wordml" xmlns:w16cex="http://schemas.microsoft.com/office/word/2018/wordml/cex" xmlns:w16cid="http://schemas.microsoft.com/office/word/2016/wordml/cid" xmlns:w16="http://schemas.microsoft.com/office/word/2018/wordml" xmlns:w16sdtdh="http://schemas.microsoft.com/office/word/2020/wordml/sdtdatahash" xmlns:w16se="http://schemas.microsoft.com/office/word/2015/wordml/symex" xmlns:wpg="http://schemas.microsoft.com/office/word/2010/wordprocessingGroup" xmlns:wpi="http://schemas.microsoft.com/office/word/2010/wordprocessingInk" xmlns:wne="http://schemas.microsoft.com/office/word/2006/wordml" xmlns:wps="http://schemas.microsoft.com/office/word/2010/wordprocessingShape" mc:Ignorable="w14 w15 w16se w16cid w16 w16cex w16sdtdh wp14">
   <w:tbl>
     <w:tblPr>
       <w:tblStyle w:val="Grilledutableau"/>
@@ -3372,23 +3382,7 @@
               <w:rFonts w:cs="Arial"/>
               <w:szCs w:val="16"/>
             </w:rPr>
-            <w:t xml:space="preserve">04.09.2009 </w:t>
-          </w:r>
-          <w:proofErr w:type="gramStart"/>
-          <w:r>
-            <w:rPr>
-              <w:rFonts w:cs="Arial"/>
-              <w:szCs w:val="16"/>
-            </w:rPr>
-            <w:t>15:</w:t>
-          </w:r>
-          <w:proofErr w:type="gramEnd"/>
-          <w:r>
-            <w:rPr>
-              <w:rFonts w:cs="Arial"/>
-              <w:szCs w:val="16"/>
-            </w:rPr>
-            <w:t>21</w:t>
+            <w:t>04.09.2009 15:21</w:t>
           </w:r>
           <w:r>
             <w:rPr>
@@ -3473,25 +3467,10 @@
           <w:r>
             <w:rPr>
               <w:rFonts w:cs="Arial"/>
+              <w:noProof/>
               <w:szCs w:val="16"/>
             </w:rPr>
-            <w:t xml:space="preserve">06.10.2025 </w:t>
-          </w:r>
-          <w:proofErr w:type="gramStart"/>
-          <w:r>
-            <w:rPr>
-              <w:rFonts w:cs="Arial"/>
-              <w:szCs w:val="16"/>
-            </w:rPr>
-            <w:t>16:</w:t>
-          </w:r>
-          <w:proofErr w:type="gramEnd"/>
-          <w:r>
-            <w:rPr>
-              <w:rFonts w:cs="Arial"/>
-              <w:szCs w:val="16"/>
-            </w:rPr>
-            <w:t>28</w:t>
+            <w:t>08.10.2025 19:42</w:t>
           </w:r>
           <w:r>
             <w:rPr>
@@ -3517,30 +3496,18 @@
               <w:szCs w:val="16"/>
             </w:rPr>
           </w:pPr>
-          <w:r>
-            <w:fldChar w:fldCharType="begin"/>
-          </w:r>
-          <w:r>
-            <w:instrText>FILENAME  \* FirstCap  \* MERGEFORMAT</w:instrText>
-          </w:r>
-          <w:r>
-            <w:fldChar w:fldCharType="separate"/>
-          </w:r>
-          <w:proofErr w:type="spellStart"/>
-          <w:r>
-            <w:rPr>
-              <w:rFonts w:cs="Arial"/>
-              <w:szCs w:val="16"/>
-            </w:rPr>
-            <w:t>Christopher</w:t>
-          </w:r>
-          <w:r>
-            <w:t>_Ristic_Rapport</w:t>
-          </w:r>
-          <w:proofErr w:type="spellEnd"/>
-          <w:r>
-            <w:fldChar w:fldCharType="end"/>
-          </w:r>
+          <w:fldSimple w:instr="FILENAME  \* FirstCap  \* MERGEFORMAT">
+            <w:r>
+              <w:rPr>
+                <w:rFonts w:cs="Arial"/>
+                <w:szCs w:val="16"/>
+              </w:rPr>
+              <w:t>Christopher</w:t>
+            </w:r>
+            <w:r>
+              <w:t>_Ristic_Rapport</w:t>
+            </w:r>
+          </w:fldSimple>
         </w:p>
       </w:tc>
     </w:tr>
@@ -3558,7 +3525,7 @@
 </file>
 
 <file path=word/footnotes.xml><?xml version="1.0" encoding="utf-8"?>
-<w:footnotes xmlns:wpc="http://schemas.microsoft.com/office/word/2010/wordprocessingCanvas" xmlns:cx="http://schemas.microsoft.com/office/drawing/2014/chartex" xmlns:cx1="http://schemas.microsoft.com/office/drawing/2015/9/8/chartex" xmlns:cx2="http://schemas.microsoft.com/office/drawing/2015/10/21/chartex" xmlns:cx3="http://schemas.microsoft.com/office/drawing/2016/5/9/chartex" xmlns:cx4="http://schemas.microsoft.com/office/drawing/2016/5/10/chartex" xmlns:cx5="http://schemas.microsoft.com/office/drawing/2016/5/11/chartex" xmlns:cx6="http://schemas.microsoft.com/office/drawing/2016/5/12/chartex" xmlns:cx7="http://schemas.microsoft.com/office/drawing/2016/5/13/chartex" xmlns:cx8="http://schemas.microsoft.com/office/drawing/2016/5/14/chartex" xmlns:mc="http://schemas.openxmlformats.org/markup-compatibility/2006" xmlns:aink="http://schemas.microsoft.com/office/drawing/2016/ink" xmlns:am3d="http://schemas.microsoft.com/office/drawing/2017/model3d" xmlns:o="urn:schemas-microsoft-com:office:office" xmlns:oel="http://schemas.microsoft.com/office/2019/extlst" xmlns:r="http://schemas.openxmlformats.org/officeDocument/2006/relationships" xmlns:m="http://schemas.openxmlformats.org/officeDocument/2006/math" xmlns:v="urn:schemas-microsoft-com:vml" xmlns:wp14="http://schemas.microsoft.com/office/word/2010/wordprocessingDrawing" xmlns:wp="http://schemas.openxmlformats.org/drawingml/2006/wordprocessingDrawing" xmlns:w10="urn:schemas-microsoft-com:office:word" xmlns:w="http://schemas.openxmlformats.org/wordprocessingml/2006/main" xmlns:w14="http://schemas.microsoft.com/office/word/2010/wordml" xmlns:w15="http://schemas.microsoft.com/office/word/2012/wordml" xmlns:w16cex="http://schemas.microsoft.com/office/word/2018/wordml/cex" xmlns:w16cid="http://schemas.microsoft.com/office/word/2016/wordml/cid" xmlns:w16="http://schemas.microsoft.com/office/word/2018/wordml" xmlns:w16du="http://schemas.microsoft.com/office/word/2023/wordml/word16du" xmlns:w16sdtdh="http://schemas.microsoft.com/office/word/2020/wordml/sdtdatahash" xmlns:w16sdtfl="http://schemas.microsoft.com/office/word/2024/wordml/sdtformatlock" xmlns:w16se="http://schemas.microsoft.com/office/word/2015/wordml/symex" xmlns:wpg="http://schemas.microsoft.com/office/word/2010/wordprocessingGroup" xmlns:wpi="http://schemas.microsoft.com/office/word/2010/wordprocessingInk" xmlns:wne="http://schemas.microsoft.com/office/word/2006/wordml" xmlns:wps="http://schemas.microsoft.com/office/word/2010/wordprocessingShape" mc:Ignorable="w14 w15 w16se w16cid w16 w16cex w16sdtdh w16sdtfl w16du wp14">
+<w:footnotes xmlns:wpc="http://schemas.microsoft.com/office/word/2010/wordprocessingCanvas" xmlns:cx="http://schemas.microsoft.com/office/drawing/2014/chartex" xmlns:cx1="http://schemas.microsoft.com/office/drawing/2015/9/8/chartex" xmlns:cx2="http://schemas.microsoft.com/office/drawing/2015/10/21/chartex" xmlns:cx3="http://schemas.microsoft.com/office/drawing/2016/5/9/chartex" xmlns:cx4="http://schemas.microsoft.com/office/drawing/2016/5/10/chartex" xmlns:cx5="http://schemas.microsoft.com/office/drawing/2016/5/11/chartex" xmlns:cx6="http://schemas.microsoft.com/office/drawing/2016/5/12/chartex" xmlns:cx7="http://schemas.microsoft.com/office/drawing/2016/5/13/chartex" xmlns:cx8="http://schemas.microsoft.com/office/drawing/2016/5/14/chartex" xmlns:mc="http://schemas.openxmlformats.org/markup-compatibility/2006" xmlns:aink="http://schemas.microsoft.com/office/drawing/2016/ink" xmlns:am3d="http://schemas.microsoft.com/office/drawing/2017/model3d" xmlns:o="urn:schemas-microsoft-com:office:office" xmlns:oel="http://schemas.microsoft.com/office/2019/extlst" xmlns:r="http://schemas.openxmlformats.org/officeDocument/2006/relationships" xmlns:m="http://schemas.openxmlformats.org/officeDocument/2006/math" xmlns:v="urn:schemas-microsoft-com:vml" xmlns:wp14="http://schemas.microsoft.com/office/word/2010/wordprocessingDrawing" xmlns:wp="http://schemas.openxmlformats.org/drawingml/2006/wordprocessingDrawing" xmlns:w10="urn:schemas-microsoft-com:office:word" xmlns:w="http://schemas.openxmlformats.org/wordprocessingml/2006/main" xmlns:w14="http://schemas.microsoft.com/office/word/2010/wordml" xmlns:w15="http://schemas.microsoft.com/office/word/2012/wordml" xmlns:w16cex="http://schemas.microsoft.com/office/word/2018/wordml/cex" xmlns:w16cid="http://schemas.microsoft.com/office/word/2016/wordml/cid" xmlns:w16="http://schemas.microsoft.com/office/word/2018/wordml" xmlns:w16sdtdh="http://schemas.microsoft.com/office/word/2020/wordml/sdtdatahash" xmlns:w16se="http://schemas.microsoft.com/office/word/2015/wordml/symex" xmlns:wpg="http://schemas.microsoft.com/office/word/2010/wordprocessingGroup" xmlns:wpi="http://schemas.microsoft.com/office/word/2010/wordprocessingInk" xmlns:wne="http://schemas.microsoft.com/office/word/2006/wordml" xmlns:wps="http://schemas.microsoft.com/office/word/2010/wordprocessingShape" mc:Ignorable="w14 w15 w16se w16cid w16 w16cex w16sdtdh wp14">
   <w:footnote w:type="separator" w:id="-1">
     <w:p>
       <w:r>
@@ -3580,7 +3547,7 @@
 </file>
 
 <file path=word/header1.xml><?xml version="1.0" encoding="utf-8"?>
-<w:hdr xmlns:wpc="http://schemas.microsoft.com/office/word/2010/wordprocessingCanvas" xmlns:cx="http://schemas.microsoft.com/office/drawing/2014/chartex" xmlns:cx1="http://schemas.microsoft.com/office/drawing/2015/9/8/chartex" xmlns:cx2="http://schemas.microsoft.com/office/drawing/2015/10/21/chartex" xmlns:cx3="http://schemas.microsoft.com/office/drawing/2016/5/9/chartex" xmlns:cx4="http://schemas.microsoft.com/office/drawing/2016/5/10/chartex" xmlns:cx5="http://schemas.microsoft.com/office/drawing/2016/5/11/chartex" xmlns:cx6="http://schemas.microsoft.com/office/drawing/2016/5/12/chartex" xmlns:cx7="http://schemas.microsoft.com/office/drawing/2016/5/13/chartex" xmlns:cx8="http://schemas.microsoft.com/office/drawing/2016/5/14/chartex" xmlns:mc="http://schemas.openxmlformats.org/markup-compatibility/2006" xmlns:aink="http://schemas.microsoft.com/office/drawing/2016/ink" xmlns:am3d="http://schemas.microsoft.com/office/drawing/2017/model3d" xmlns:o="urn:schemas-microsoft-com:office:office" xmlns:oel="http://schemas.microsoft.com/office/2019/extlst" xmlns:r="http://schemas.openxmlformats.org/officeDocument/2006/relationships" xmlns:m="http://schemas.openxmlformats.org/officeDocument/2006/math" xmlns:v="urn:schemas-microsoft-com:vml" xmlns:wp14="http://schemas.microsoft.com/office/word/2010/wordprocessingDrawing" xmlns:wp="http://schemas.openxmlformats.org/drawingml/2006/wordprocessingDrawing" xmlns:w10="urn:schemas-microsoft-com:office:word" xmlns:w="http://schemas.openxmlformats.org/wordprocessingml/2006/main" xmlns:w14="http://schemas.microsoft.com/office/word/2010/wordml" xmlns:w15="http://schemas.microsoft.com/office/word/2012/wordml" xmlns:w16cex="http://schemas.microsoft.com/office/word/2018/wordml/cex" xmlns:w16cid="http://schemas.microsoft.com/office/word/2016/wordml/cid" xmlns:w16="http://schemas.microsoft.com/office/word/2018/wordml" xmlns:w16du="http://schemas.microsoft.com/office/word/2023/wordml/word16du" xmlns:w16sdtdh="http://schemas.microsoft.com/office/word/2020/wordml/sdtdatahash" xmlns:w16sdtfl="http://schemas.microsoft.com/office/word/2024/wordml/sdtformatlock" xmlns:w16se="http://schemas.microsoft.com/office/word/2015/wordml/symex" xmlns:wpg="http://schemas.microsoft.com/office/word/2010/wordprocessingGroup" xmlns:wpi="http://schemas.microsoft.com/office/word/2010/wordprocessingInk" xmlns:wne="http://schemas.microsoft.com/office/word/2006/wordml" xmlns:wps="http://schemas.microsoft.com/office/word/2010/wordprocessingShape" mc:Ignorable="w14 w15 w16se w16cid w16 w16cex w16sdtdh w16sdtfl w16du wp14">
+<w:hdr xmlns:wpc="http://schemas.microsoft.com/office/word/2010/wordprocessingCanvas" xmlns:cx="http://schemas.microsoft.com/office/drawing/2014/chartex" xmlns:cx1="http://schemas.microsoft.com/office/drawing/2015/9/8/chartex" xmlns:cx2="http://schemas.microsoft.com/office/drawing/2015/10/21/chartex" xmlns:cx3="http://schemas.microsoft.com/office/drawing/2016/5/9/chartex" xmlns:cx4="http://schemas.microsoft.com/office/drawing/2016/5/10/chartex" xmlns:cx5="http://schemas.microsoft.com/office/drawing/2016/5/11/chartex" xmlns:cx6="http://schemas.microsoft.com/office/drawing/2016/5/12/chartex" xmlns:cx7="http://schemas.microsoft.com/office/drawing/2016/5/13/chartex" xmlns:cx8="http://schemas.microsoft.com/office/drawing/2016/5/14/chartex" xmlns:mc="http://schemas.openxmlformats.org/markup-compatibility/2006" xmlns:aink="http://schemas.microsoft.com/office/drawing/2016/ink" xmlns:am3d="http://schemas.microsoft.com/office/drawing/2017/model3d" xmlns:o="urn:schemas-microsoft-com:office:office" xmlns:oel="http://schemas.microsoft.com/office/2019/extlst" xmlns:r="http://schemas.openxmlformats.org/officeDocument/2006/relationships" xmlns:m="http://schemas.openxmlformats.org/officeDocument/2006/math" xmlns:v="urn:schemas-microsoft-com:vml" xmlns:wp14="http://schemas.microsoft.com/office/word/2010/wordprocessingDrawing" xmlns:wp="http://schemas.openxmlformats.org/drawingml/2006/wordprocessingDrawing" xmlns:w10="urn:schemas-microsoft-com:office:word" xmlns:w="http://schemas.openxmlformats.org/wordprocessingml/2006/main" xmlns:w14="http://schemas.microsoft.com/office/word/2010/wordml" xmlns:w15="http://schemas.microsoft.com/office/word/2012/wordml" xmlns:w16cex="http://schemas.microsoft.com/office/word/2018/wordml/cex" xmlns:w16cid="http://schemas.microsoft.com/office/word/2016/wordml/cid" xmlns:w16="http://schemas.microsoft.com/office/word/2018/wordml" xmlns:w16sdtdh="http://schemas.microsoft.com/office/word/2020/wordml/sdtdatahash" xmlns:w16se="http://schemas.microsoft.com/office/word/2015/wordml/symex" xmlns:wpg="http://schemas.microsoft.com/office/word/2010/wordprocessingGroup" xmlns:wpi="http://schemas.microsoft.com/office/word/2010/wordprocessingInk" xmlns:wne="http://schemas.microsoft.com/office/word/2006/wordml" xmlns:wps="http://schemas.microsoft.com/office/word/2010/wordprocessingShape" mc:Ignorable="w14 w15 w16se w16cid w16 w16cex w16sdtdh wp14">
   <w:tbl>
     <w:tblPr>
       <w:tblStyle w:val="Grilledutableau"/>
@@ -3595,9 +3562,9 @@
       <w:tblLook w:val="01E0" w:firstRow="1" w:lastRow="1" w:firstColumn="1" w:lastColumn="1" w:noHBand="0" w:noVBand="0"/>
     </w:tblPr>
     <w:tblGrid>
-      <w:gridCol w:w="2390"/>
-      <w:gridCol w:w="4411"/>
-      <w:gridCol w:w="2269"/>
+      <w:gridCol w:w="2402"/>
+      <w:gridCol w:w="4400"/>
+      <w:gridCol w:w="2268"/>
     </w:tblGrid>
     <w:tr>
       <w:trPr>
@@ -3636,6 +3603,9 @@
             <w:jc w:val="right"/>
           </w:pPr>
           <w:r>
+            <w:rPr>
+              <w:noProof/>
+            </w:rPr>
             <w:drawing>
               <wp:inline distT="0" distB="0" distL="0" distR="0" wp14:anchorId="0C0EC7FE" wp14:editId="2E1B1F62">
                 <wp:extent cx="1046480" cy="315680"/>
@@ -3695,7 +3665,7 @@
 </file>
 
 <file path=word/numbering.xml><?xml version="1.0" encoding="utf-8"?>
-<w:numbering xmlns:wpc="http://schemas.microsoft.com/office/word/2010/wordprocessingCanvas" xmlns:cx="http://schemas.microsoft.com/office/drawing/2014/chartex" xmlns:cx1="http://schemas.microsoft.com/office/drawing/2015/9/8/chartex" xmlns:cx2="http://schemas.microsoft.com/office/drawing/2015/10/21/chartex" xmlns:cx3="http://schemas.microsoft.com/office/drawing/2016/5/9/chartex" xmlns:cx4="http://schemas.microsoft.com/office/drawing/2016/5/10/chartex" xmlns:cx5="http://schemas.microsoft.com/office/drawing/2016/5/11/chartex" xmlns:cx6="http://schemas.microsoft.com/office/drawing/2016/5/12/chartex" xmlns:cx7="http://schemas.microsoft.com/office/drawing/2016/5/13/chartex" xmlns:cx8="http://schemas.microsoft.com/office/drawing/2016/5/14/chartex" xmlns:mc="http://schemas.openxmlformats.org/markup-compatibility/2006" xmlns:aink="http://schemas.microsoft.com/office/drawing/2016/ink" xmlns:am3d="http://schemas.microsoft.com/office/drawing/2017/model3d" xmlns:o="urn:schemas-microsoft-com:office:office" xmlns:oel="http://schemas.microsoft.com/office/2019/extlst" xmlns:r="http://schemas.openxmlformats.org/officeDocument/2006/relationships" xmlns:m="http://schemas.openxmlformats.org/officeDocument/2006/math" xmlns:v="urn:schemas-microsoft-com:vml" xmlns:wp14="http://schemas.microsoft.com/office/word/2010/wordprocessingDrawing" xmlns:wp="http://schemas.openxmlformats.org/drawingml/2006/wordprocessingDrawing" xmlns:w10="urn:schemas-microsoft-com:office:word" xmlns:w="http://schemas.openxmlformats.org/wordprocessingml/2006/main" xmlns:w14="http://schemas.microsoft.com/office/word/2010/wordml" xmlns:w15="http://schemas.microsoft.com/office/word/2012/wordml" xmlns:w16cex="http://schemas.microsoft.com/office/word/2018/wordml/cex" xmlns:w16cid="http://schemas.microsoft.com/office/word/2016/wordml/cid" xmlns:w16="http://schemas.microsoft.com/office/word/2018/wordml" xmlns:w16du="http://schemas.microsoft.com/office/word/2023/wordml/word16du" xmlns:w16sdtdh="http://schemas.microsoft.com/office/word/2020/wordml/sdtdatahash" xmlns:w16sdtfl="http://schemas.microsoft.com/office/word/2024/wordml/sdtformatlock" xmlns:w16se="http://schemas.microsoft.com/office/word/2015/wordml/symex" xmlns:wpg="http://schemas.microsoft.com/office/word/2010/wordprocessingGroup" xmlns:wpi="http://schemas.microsoft.com/office/word/2010/wordprocessingInk" xmlns:wne="http://schemas.microsoft.com/office/word/2006/wordml" xmlns:wps="http://schemas.microsoft.com/office/word/2010/wordprocessingShape" mc:Ignorable="w14 w15 w16se w16cid w16 w16cex w16sdtdh w16sdtfl w16du wp14">
+<w:numbering xmlns:wpc="http://schemas.microsoft.com/office/word/2010/wordprocessingCanvas" xmlns:cx="http://schemas.microsoft.com/office/drawing/2014/chartex" xmlns:cx1="http://schemas.microsoft.com/office/drawing/2015/9/8/chartex" xmlns:cx2="http://schemas.microsoft.com/office/drawing/2015/10/21/chartex" xmlns:cx3="http://schemas.microsoft.com/office/drawing/2016/5/9/chartex" xmlns:cx4="http://schemas.microsoft.com/office/drawing/2016/5/10/chartex" xmlns:cx5="http://schemas.microsoft.com/office/drawing/2016/5/11/chartex" xmlns:cx6="http://schemas.microsoft.com/office/drawing/2016/5/12/chartex" xmlns:cx7="http://schemas.microsoft.com/office/drawing/2016/5/13/chartex" xmlns:cx8="http://schemas.microsoft.com/office/drawing/2016/5/14/chartex" xmlns:mc="http://schemas.openxmlformats.org/markup-compatibility/2006" xmlns:aink="http://schemas.microsoft.com/office/drawing/2016/ink" xmlns:am3d="http://schemas.microsoft.com/office/drawing/2017/model3d" xmlns:o="urn:schemas-microsoft-com:office:office" xmlns:oel="http://schemas.microsoft.com/office/2019/extlst" xmlns:r="http://schemas.openxmlformats.org/officeDocument/2006/relationships" xmlns:m="http://schemas.openxmlformats.org/officeDocument/2006/math" xmlns:v="urn:schemas-microsoft-com:vml" xmlns:wp14="http://schemas.microsoft.com/office/word/2010/wordprocessingDrawing" xmlns:wp="http://schemas.openxmlformats.org/drawingml/2006/wordprocessingDrawing" xmlns:w10="urn:schemas-microsoft-com:office:word" xmlns:w="http://schemas.openxmlformats.org/wordprocessingml/2006/main" xmlns:w14="http://schemas.microsoft.com/office/word/2010/wordml" xmlns:w15="http://schemas.microsoft.com/office/word/2012/wordml" xmlns:w16cex="http://schemas.microsoft.com/office/word/2018/wordml/cex" xmlns:w16cid="http://schemas.microsoft.com/office/word/2016/wordml/cid" xmlns:w16="http://schemas.microsoft.com/office/word/2018/wordml" xmlns:w16sdtdh="http://schemas.microsoft.com/office/word/2020/wordml/sdtdatahash" xmlns:w16se="http://schemas.microsoft.com/office/word/2015/wordml/symex" xmlns:wpg="http://schemas.microsoft.com/office/word/2010/wordprocessingGroup" xmlns:wpi="http://schemas.microsoft.com/office/word/2010/wordprocessingInk" xmlns:wne="http://schemas.microsoft.com/office/word/2006/wordml" xmlns:wps="http://schemas.microsoft.com/office/word/2010/wordprocessingShape" mc:Ignorable="w14 w15 w16se w16cid w16 w16cex w16sdtdh wp14">
   <w:numPicBullet w:numPicBulletId="0">
     <w:pict>
       <v:shapetype id="_x0000_t75" coordsize="21600,21600" o:spt="75" o:preferrelative="t" path="m@4@5l@4@11@9@11@9@5xe" filled="f" stroked="f">
@@ -3717,7 +3687,7 @@
         <v:path o:extrusionok="f" gradientshapeok="t" o:connecttype="rect"/>
         <o:lock v:ext="edit" aspectratio="t"/>
       </v:shapetype>
-      <v:shape id="_x0000_i1113" type="#_x0000_t75" style="width:11.2pt;height:11.2pt" o:bullet="t">
+      <v:shape id="_x0000_i1030" type="#_x0000_t75" style="width:11.3pt;height:11.3pt" o:bullet="t">
         <v:imagedata r:id="rId1" o:title="BD10263_"/>
       </v:shape>
     </w:pict>
@@ -7020,7 +6990,7 @@
 </file>
 
 <file path=word/styles.xml><?xml version="1.0" encoding="utf-8"?>
-<w:styles xmlns:mc="http://schemas.openxmlformats.org/markup-compatibility/2006" xmlns:r="http://schemas.openxmlformats.org/officeDocument/2006/relationships" xmlns:w="http://schemas.openxmlformats.org/wordprocessingml/2006/main" xmlns:w14="http://schemas.microsoft.com/office/word/2010/wordml" xmlns:w15="http://schemas.microsoft.com/office/word/2012/wordml" xmlns:w16cex="http://schemas.microsoft.com/office/word/2018/wordml/cex" xmlns:w16cid="http://schemas.microsoft.com/office/word/2016/wordml/cid" xmlns:w16="http://schemas.microsoft.com/office/word/2018/wordml" xmlns:w16du="http://schemas.microsoft.com/office/word/2023/wordml/word16du" xmlns:w16sdtdh="http://schemas.microsoft.com/office/word/2020/wordml/sdtdatahash" xmlns:w16sdtfl="http://schemas.microsoft.com/office/word/2024/wordml/sdtformatlock" xmlns:w16se="http://schemas.microsoft.com/office/word/2015/wordml/symex" mc:Ignorable="w14 w15 w16se w16cid w16 w16cex w16sdtdh w16sdtfl w16du">
+<w:styles xmlns:mc="http://schemas.openxmlformats.org/markup-compatibility/2006" xmlns:r="http://schemas.openxmlformats.org/officeDocument/2006/relationships" xmlns:w="http://schemas.openxmlformats.org/wordprocessingml/2006/main" xmlns:w14="http://schemas.microsoft.com/office/word/2010/wordml" xmlns:w15="http://schemas.microsoft.com/office/word/2012/wordml" xmlns:w16cex="http://schemas.microsoft.com/office/word/2018/wordml/cex" xmlns:w16cid="http://schemas.microsoft.com/office/word/2016/wordml/cid" xmlns:w16="http://schemas.microsoft.com/office/word/2018/wordml" xmlns:w16sdtdh="http://schemas.microsoft.com/office/word/2020/wordml/sdtdatahash" xmlns:w16se="http://schemas.microsoft.com/office/word/2015/wordml/symex" mc:Ignorable="w14 w15 w16se w16cid w16 w16cex w16sdtdh">
   <w:docDefaults>
     <w:rPrDefault>
       <w:rPr>
@@ -7610,6 +7580,7 @@
   <w:style w:type="character" w:default="1" w:styleId="Policepardfaut">
     <w:name w:val="Default Paragraph Font"/>
     <w:uiPriority w:val="1"/>
+    <w:semiHidden/>
     <w:unhideWhenUsed/>
   </w:style>
   <w:style w:type="table" w:default="1" w:styleId="TableauNormal">
@@ -8563,6 +8534,15 @@
 </file>
 
 <file path=customXml/item1.xml><?xml version="1.0" encoding="utf-8"?>
+<?mso-contentType ?>
+<FormTemplates xmlns="http://schemas.microsoft.com/sharepoint/v3/contenttype/forms">
+  <Display>DocumentLibraryForm</Display>
+  <Edit>DocumentLibraryForm</Edit>
+  <New>DocumentLibraryForm</New>
+</FormTemplates>
+</file>
+
+<file path=customXml/item2.xml><?xml version="1.0" encoding="utf-8"?>
 <ct:contentTypeSchema xmlns:ct="http://schemas.microsoft.com/office/2006/metadata/contentType" xmlns:ma="http://schemas.microsoft.com/office/2006/metadata/properties/metaAttributes" ct:_="" ma:_="" ma:contentTypeName="Document" ma:contentTypeID="0x01010080C9F2488912074FB587B9AD9ADAE5BB" ma:contentTypeVersion="13" ma:contentTypeDescription="Crée un document." ma:contentTypeScope="" ma:versionID="98cb6024266d177b928872b226e6993e">
   <xsd:schema xmlns:xsd="http://www.w3.org/2001/XMLSchema" xmlns:xs="http://www.w3.org/2001/XMLSchema" xmlns:p="http://schemas.microsoft.com/office/2006/metadata/properties" xmlns:ns2="b5cf4370-ac38-4b9e-9836-ef6f5df64f24" xmlns:ns3="eefa3612-053e-497a-ae76-8a76877f5e22" targetNamespace="http://schemas.microsoft.com/office/2006/metadata/properties" ma:root="true" ma:fieldsID="005441ce51d7a2dcada4efd17c7a03e9" ns2:_="" ns3:_="">
     <xsd:import namespace="b5cf4370-ac38-4b9e-9836-ef6f5df64f24"/>
@@ -8769,27 +8749,7 @@
 </ct:contentTypeSchema>
 </file>
 
-<file path=customXml/item2.xml><?xml version="1.0" encoding="utf-8"?>
-<?mso-contentType ?>
-<FormTemplates xmlns="http://schemas.microsoft.com/sharepoint/v3/contenttype/forms">
-  <Display>DocumentLibraryForm</Display>
-  <Edit>DocumentLibraryForm</Edit>
-  <New>DocumentLibraryForm</New>
-</FormTemplates>
-</file>
-
 <file path=customXml/item3.xml><?xml version="1.0" encoding="utf-8"?>
-<p:properties xmlns:p="http://schemas.microsoft.com/office/2006/metadata/properties" xmlns:xsi="http://www.w3.org/2001/XMLSchema-instance" xmlns:pc="http://schemas.microsoft.com/office/infopath/2007/PartnerControls">
-  <documentManagement>
-    <lcf76f155ced4ddcb4097134ff3c332f xmlns="b5cf4370-ac38-4b9e-9836-ef6f5df64f24">
-      <Terms xmlns="http://schemas.microsoft.com/office/infopath/2007/PartnerControls"/>
-    </lcf76f155ced4ddcb4097134ff3c332f>
-    <TaxCatchAll xmlns="eefa3612-053e-497a-ae76-8a76877f5e22" xsi:nil="true"/>
-  </documentManagement>
-</p:properties>
-</file>
-
-<file path=customXml/item4.xml><?xml version="1.0" encoding="utf-8"?>
 <b:Sources xmlns:b="http://schemas.openxmlformats.org/officeDocument/2006/bibliography" xmlns="http://schemas.openxmlformats.org/officeDocument/2006/bibliography" SelectedStyle="\APASixthEditionOfficeOnline.xsl" StyleName="APA" Version="6">
   <b:Source>
     <b:Tag>Espace_réservé1</b:Tag>
@@ -8812,7 +8772,26 @@
 </b:Sources>
 </file>
 
+<file path=customXml/item4.xml><?xml version="1.0" encoding="utf-8"?>
+<p:properties xmlns:p="http://schemas.microsoft.com/office/2006/metadata/properties" xmlns:xsi="http://www.w3.org/2001/XMLSchema-instance" xmlns:pc="http://schemas.microsoft.com/office/infopath/2007/PartnerControls">
+  <documentManagement>
+    <lcf76f155ced4ddcb4097134ff3c332f xmlns="b5cf4370-ac38-4b9e-9836-ef6f5df64f24">
+      <Terms xmlns="http://schemas.microsoft.com/office/infopath/2007/PartnerControls"/>
+    </lcf76f155ced4ddcb4097134ff3c332f>
+    <TaxCatchAll xmlns="eefa3612-053e-497a-ae76-8a76877f5e22" xsi:nil="true"/>
+  </documentManagement>
+</p:properties>
+</file>
+
 <file path=customXml/itemProps1.xml><?xml version="1.0" encoding="utf-8"?>
+<ds:datastoreItem xmlns:ds="http://schemas.openxmlformats.org/officeDocument/2006/customXml" ds:itemID="{DF8E7934-3F3A-4F32-A7D4-1B248DBE707D}">
+  <ds:schemaRefs>
+    <ds:schemaRef ds:uri="http://schemas.microsoft.com/sharepoint/v3/contenttype/forms"/>
+  </ds:schemaRefs>
+</ds:datastoreItem>
+</file>
+
+<file path=customXml/itemProps2.xml><?xml version="1.0" encoding="utf-8"?>
 <ds:datastoreItem xmlns:ds="http://schemas.openxmlformats.org/officeDocument/2006/customXml" ds:itemID="{FDA51230-EF27-4A68-A446-37F9E544E2A2}">
   <ds:schemaRefs>
     <ds:schemaRef ds:uri="http://schemas.microsoft.com/office/2006/metadata/contentType"/>
@@ -8831,15 +8810,15 @@
 </ds:datastoreItem>
 </file>
 
-<file path=customXml/itemProps2.xml><?xml version="1.0" encoding="utf-8"?>
-<ds:datastoreItem xmlns:ds="http://schemas.openxmlformats.org/officeDocument/2006/customXml" ds:itemID="{DF8E7934-3F3A-4F32-A7D4-1B248DBE707D}">
+<file path=customXml/itemProps3.xml><?xml version="1.0" encoding="utf-8"?>
+<ds:datastoreItem xmlns:ds="http://schemas.openxmlformats.org/officeDocument/2006/customXml" ds:itemID="{A507DE50-9571-420A-B97A-D696E6EB7C50}">
   <ds:schemaRefs>
-    <ds:schemaRef ds:uri="http://schemas.microsoft.com/sharepoint/v3/contenttype/forms"/>
+    <ds:schemaRef ds:uri="http://schemas.openxmlformats.org/officeDocument/2006/bibliography"/>
   </ds:schemaRefs>
 </ds:datastoreItem>
 </file>
 
-<file path=customXml/itemProps3.xml><?xml version="1.0" encoding="utf-8"?>
+<file path=customXml/itemProps4.xml><?xml version="1.0" encoding="utf-8"?>
 <ds:datastoreItem xmlns:ds="http://schemas.openxmlformats.org/officeDocument/2006/customXml" ds:itemID="{4181FC95-92B5-446F-AE57-E4A44C8C450C}">
   <ds:schemaRefs>
     <ds:schemaRef ds:uri="http://schemas.microsoft.com/office/2006/metadata/properties"/>
@@ -8848,12 +8827,4 @@
     <ds:schemaRef ds:uri="eefa3612-053e-497a-ae76-8a76877f5e22"/>
   </ds:schemaRefs>
 </ds:datastoreItem>
-</file>
-
-<file path=customXml/itemProps4.xml><?xml version="1.0" encoding="utf-8"?>
-<ds:datastoreItem xmlns:ds="http://schemas.openxmlformats.org/officeDocument/2006/customXml" ds:itemID="{A507DE50-9571-420A-B97A-D696E6EB7C50}">
-  <ds:schemaRefs>
-    <ds:schemaRef ds:uri="http://schemas.openxmlformats.org/officeDocument/2006/bibliography"/>
-  </ds:schemaRefs>
-</ds:datastoreItem>
 </file>
</xml_diff>